<commit_message>
Agrega pipeline fold-safe y actualiza documentación de modelado
</commit_message>
<xml_diff>
--- a/ISAC_Diablos_Rojos_Guia_Base_Modelado.docx
+++ b/ISAC_Diablos_Rojos_Guia_Base_Modelado.docx
@@ -6383,6 +6383,202 @@
     </w:p>
     <w:p>
       <w:pPr>
+        <w:pStyle w:val="Heading2"/>
+      </w:pPr>
+      <w:r>
+        <w:t>13.3 Cierre metodológico: arsenal fold-safe y season-forward</w:t>
+      </w:r>
+    </w:p>
+    <w:p>
+      <w:pPr/>
+      <w:r>
+        <w:rPr>
+          <w:b/>
+        </w:rPr>
+        <w:t>04_fold_safe_arsenal.py — CERRADO. Registro de cierre: 17 de septiembre de 2026.</w:t>
+      </w:r>
+    </w:p>
+    <w:p>
+      <w:pPr/>
+      <w:r>
+        <w:t>Objetivo. Construir features de arsenal específicas del pitcher sin leakage, aprendiendo toda referencia dependiente del pitcher exclusivamente de la información permitida por el esquema de validación. El bloque define, valida y audita las referencias; no entrena modelos ni prueba todavía el valor predictivo incremental del arsenal.</w:t>
+      </w:r>
+    </w:p>
+    <w:p>
+      <w:pPr>
+        <w:pStyle w:val="Heading3"/>
+      </w:pPr>
+      <w:r>
+        <w:t>Dos preguntas de validación independientes</w:t>
+      </w:r>
+    </w:p>
+    <w:p>
+      <w:pPr/>
+      <w:r>
+        <w:t>Unseen pitcher → Physical Stuff. El pitcher holdout de 03 se conserva: train y test no comparten pitchers (intersección = 0). Al no existir historial de los pitchers de test dentro de train, las siete features de arsenal permanecen 100% ausentes en test. Es comportamiento esperado del pipeline, no un error. La cobertura de referencia FB dentro de train es aproximadamente 97.89%.</w:t>
+      </w:r>
+    </w:p>
+    <w:p>
+      <w:pPr/>
+      <w:r>
+        <w:t>Known pitcher / future season → Physical Stuff + Historical Arsenal. Esta validación temporal adicional mide la disponibilidad del arsenal cuando existe historial previo. No sustituye el pitcher holdout: ambas estrategias responden preguntas distintas de generalización.</w:t>
+      </w:r>
+    </w:p>
+    <w:p>
+      <w:pPr>
+        <w:pStyle w:val="Heading3"/>
+      </w:pPr>
+      <w:r>
+        <w:t>Ventanas históricas y cobertura observada</w:t>
+      </w:r>
+    </w:p>
+    <w:p>
+      <w:pPr/>
+      <w:r>
+        <w:t>2024 → 2025. Primary fastball, perfil FB y usage se aprenden exclusivamente con 2024. En la cohorte elegible de 2025, con historial previo, 132,886 de 138,110 filas tienen referencia histórica FB: cobertura ≈ 96.2%.</w:t>
+      </w:r>
+    </w:p>
+    <w:p>
+      <w:pPr/>
+      <w:r>
+        <w:t>2024–2025 → 2026. Las referencias se aprenden exclusivamente con 2024 y 2025. En la cohorte elegible de 2026, 88,409 de 90,176 filas tienen referencia histórica FB: cobertura ≈ 98.0%.</w:t>
+      </w:r>
+    </w:p>
+    <w:p>
+      <w:pPr/>
+      <w:r>
+        <w:t>Estas coberturas corresponden a la disponibilidad de fb_rel_speed en filas de pitchers con historial, no a pitchers nuevos ni a la completitud conjunta de las siete features. La cobertura alta permite considerar estas referencias como features operativas en validación temporal; su valor predictivo aún debe probarse. No se usa ninguna observación del año de evaluación para construir primary fastball, su conteo, perfil FB, usage o las referencias de los diferenciales.</w:t>
+      </w:r>
+    </w:p>
+    <w:p>
+      <w:pPr/>
+      <w:r>
+        <w:t>En la auditoría fold-safe original, las referencias son por pitcher_anon_id + year. En season-forward se construye una sola referencia por pitcher_anon_id acumulando todos los pitches del periodo histórico permitido; usage se define por pitcher_anon_id + AutoPitchType. No se utiliza una referencia global de toda la carrera ni se mezcla el año futuro con el historial.</w:t>
+      </w:r>
+    </w:p>
+    <w:p>
+      <w:pPr>
+        <w:pStyle w:val="Heading3"/>
+      </w:pPr>
+      <w:r>
+        <w:t>Primary fastball: definición final y determinismo</w:t>
+      </w:r>
+    </w:p>
+    <w:p>
+      <w:pPr>
+        <w:pStyle w:val="ListBullet"/>
+      </w:pPr>
+      <w:r>
+        <w:t>Considerar únicamente Four-Seam y Sinker; elegir el tipo con mayor número de pitches dentro del periodo de referencia permitido.</w:t>
+      </w:r>
+    </w:p>
+    <w:p>
+      <w:pPr>
+        <w:pStyle w:val="ListBullet"/>
+      </w:pPr>
+      <w:r>
+        <w:t>Si el conteo empata exactamente, elegir el tipo con mayor mean RelSpeed calculada exclusivamente con pitches de ese mismo periodo permitido.</w:t>
+      </w:r>
+    </w:p>
+    <w:p>
+      <w:pPr>
+        <w:pStyle w:val="ListBullet"/>
+      </w:pPr>
+      <w:r>
+        <w:t>Si también empata la velocidad media, elegir Four-Seam como prioridad determinística final.</w:t>
+      </w:r>
+    </w:p>
+    <w:p>
+      <w:pPr>
+        <w:pStyle w:val="ListBullet"/>
+      </w:pPr>
+      <w:r>
+        <w:t>Exigir al menos 20 pitches del tipo seleccionado: MIN_PRIMARY_FB_PITCHES = 20.</w:t>
+      </w:r>
+    </w:p>
+    <w:p>
+      <w:pPr/>
+      <w:r>
+        <w:t>Una velocidad media válida tiene prioridad sobre NaN; si ambas velocidades son NaN, se aplica la prioridad final Four-Seam. No se imputan velocidades. La misma regla se aplica por pitcher-year y al historial acumulado. La selección fue auditada tras invertir y barajar filas con semilla fija: PASS; ya no depende del orden de las filas. El tie-break de velocidad nunca consulta el año futuro.</w:t>
+      </w:r>
+    </w:p>
+    <w:p>
+      <w:pPr>
+        <w:pStyle w:val="Heading3"/>
+      </w:pPr>
+      <w:r>
+        <w:t>Estabilidad temporal: auditoría descriptiva</w:t>
+      </w:r>
+    </w:p>
+    <w:p>
+      <w:pPr/>
+      <w:r>
+        <w:t>Primary fastball estable: 91.16% entre 2024 y 2025; 88.98% entre 2025 y 2026, entre pitchers con referencias comparables. La primary fastball es bastante estable, pero no inmutable. Estos resultados justifican actualizar las referencias temporalmente en lugar de definir una única primary fastball global para toda la carrera.</w:t>
+      </w:r>
+    </w:p>
+    <w:p>
+      <w:pPr/>
+      <w:r>
+        <w:t>El cambio absoluto medio de pitch usage entre periodos es aproximadamente 6.5–6.8 puntos porcentuales (6.4775 y 6.7860 pp en las dos ventanas). La composición del arsenal cambia moderadamente: el usage histórico es informativo, pero no una propiedad permanente del pitcher. Las estadísticas futuras utilizadas para esta comparación son exclusivamente descriptivas y nunca alimentan las features.</w:t>
+      </w:r>
+    </w:p>
+    <w:p>
+      <w:pPr>
+        <w:pStyle w:val="Heading3"/>
+      </w:pPr>
+      <w:r>
+        <w:t>Features finales y regla de leakage cerrada</w:t>
+      </w:r>
+    </w:p>
+    <w:p>
+      <w:pPr/>
+      <w:r>
+        <w:t>Se conservan las siete features: velo_diff_vs_fb, ivb_diff_vs_fb, hb_diff_vs_fb, spin_diff_vs_fb, pitch_usage_pct, release_distance_vs_fb y extension_diff_vs_fb. Los diferenciales comparan las mediciones del pitch evaluado con la referencia permitida; pitch_usage_pct procede del uso histórico del tipo de lanzamiento. Todas las referencias necesarias provienen exclusivamente del fold de entrenamiento o del historial previo permitido.</w:t>
+      </w:r>
+    </w:p>
+    <w:p>
+      <w:pPr/>
+      <w:r>
+        <w:rPr>
+          <w:b/>
+        </w:rPr>
+        <w:t>Ninguna feature dependiente del pitcher puede construirse utilizando información del periodo de evaluación. Primary fastball, perfil de fastball, usage y diferenciales deben aprenderse exclusivamente del historial permitido por el fold o por la ventana temporal correspondiente.</w:t>
+      </w:r>
+    </w:p>
+    <w:p>
+      <w:pPr/>
+      <w:r>
+        <w:t>Esta prohibición se refiere al aprendizaje de estadísticas y referencias; las mediciones físicas del pitch que se transforma siguen siendo los operandos de los diferenciales. No se rellenan silenciosamente referencias inexistentes para pitchers completamente desconocidos. No se implementaron fallbacks ni se rellenaron NaN; un tipo de pitch sin antecedente histórico conserva usage ausente.</w:t>
+      </w:r>
+    </w:p>
+    <w:p>
+      <w:pPr/>
+      <w:r>
+        <w:t>Auditorías de cierre: PASS en separación temporal y procedencia de referencias; intersección de pitchers = 0 en holdout; unicidad de llaves; merges sin duplicación ni cambio del número de filas; primary_fastball_type válido; primary_fastball_n ≥ 20; selección determinística. Evidencia: 04_fold_safe_arsenal_audit.txt y 04_primary_fastball_changes.csv.</w:t>
+      </w:r>
+    </w:p>
+    <w:p>
+      <w:pPr>
+        <w:pStyle w:val="Heading3"/>
+      </w:pPr>
+      <w:r>
+        <w:t>Conclusión y siguiente bloque</w:t>
+      </w:r>
+    </w:p>
+    <w:p>
+      <w:pPr/>
+      <w:r>
+        <w:t>04_fold_safe_arsenal.py — Cerrado. Las referencias de arsenal se construyen exclusivamente con información histórica permitida. En pitcher holdout puro, el arsenal no es observable para pitchers nuevos y permanece 100% ausente, por diseño. En season-forward alcanza 96.2% de cobertura de referencia FB en la cohorte elegible de 2025 y 98.0% en 2026. La primary fastball se define por uso, velocidad media histórica y prioridad final Four-Seam, con mínimo 20 pitches. Su estabilidad interanual cercana al 90% y los cambios moderados en usage justifican actualizar las referencias temporalmente.</w:t>
+      </w:r>
+    </w:p>
+    <w:p>
+      <w:pPr/>
+      <w:r>
+        <w:t>Próximo paso: 05_arsenal_incremental_value.py. Medir si existe valor incremental del arsenal histórico sobre Physical Stuff para is_whiff usando exactamente las mismas filas elegibles. No se anticipa una mejora: 04 no aporta resultados de modelado de 05.</w:t>
+      </w:r>
+    </w:p>
+    <w:p>
+      <w:pPr>
         <w:pStyle w:val="Heading1"/>
       </w:pPr>
       <w:r>
@@ -7132,6 +7328,14 @@
     </w:p>
     <w:p>
       <w:r>
+        <w:rPr>
+          <w:i/>
+        </w:rPr>
+        <w:t>Actualización al 17/09/2026: 04 está cerrado (véase 13.3). El próximo paso vigente es 05_arsenal_incremental_value.py, para evaluar valor incremental sobre las mismas filas elegibles. Las indicaciones previas se conservan como historial; 05_target_definitions permanece como tarea pendiente de targets derivados.</w:t>
+      </w:r>
+    </w:p>
+    <w:p>
+      <w:r>
         <w:t>Abrir 04_fold_safe_arsenal.py. El objetivo será convertir las features relacionales de arsenal en un pipeline de validación sin leakage: primary fastball, pitch_usage_pct, diferenciales vs. fastball y release_distance_vs_fb deberán aprenderse exclusivamente con el train fold y aplicarse después a validation/test. 03_stuff_baseline.py queda cerrado como referencia interpretable para is_whiff por lanzamiento total.</w:t>
       </w:r>
     </w:p>
@@ -7648,6 +7852,14 @@
           <w:sz w:val="24"/>
         </w:rPr>
         <w:t>17.1 Orden operativo actualizado</w:t>
+      </w:r>
+    </w:p>
+    <w:p>
+      <w:r>
+        <w:rPr>
+          <w:i/>
+        </w:rPr>
+        <w:t>Actualización al 17/09/2026: 04 está cerrado (véase 13.3). El próximo paso vigente es 05_arsenal_incremental_value.py, para evaluar valor incremental sobre las mismas filas elegibles. Las indicaciones previas se conservan como historial; 05_target_definitions permanece como tarea pendiente de targets derivados.</w:t>
       </w:r>
     </w:p>
     <w:p>
@@ -8738,6 +8950,14 @@
       </w:pPr>
       <w:r>
         <w:t>20.1 Decisiones cerradas por 03_stuff_baseline.py</w:t>
+      </w:r>
+    </w:p>
+    <w:p>
+      <w:r>
+        <w:rPr>
+          <w:i/>
+        </w:rPr>
+        <w:t>Actualización al 17/09/2026: 04 está cerrado (véase 13.3). El próximo paso vigente es 05_arsenal_incremental_value.py, para evaluar valor incremental sobre las mismas filas elegibles. Las indicaciones previas se conservan como historial; 05_target_definitions permanece como tarea pendiente de targets derivados.</w:t>
       </w:r>
     </w:p>
     <w:tbl>

</xml_diff>

<commit_message>
Definiciones de targets y explicacion facil
</commit_message>
<xml_diff>
--- a/ISAC_Diablos_Rojos_Guia_Base_Modelado.docx
+++ b/ISAC_Diablos_Rojos_Guia_Base_Modelado.docx
@@ -7328,6 +7328,16 @@
     </w:p>
     <w:p>
       <w:r>
+        <w:t>Estado vigente tras ratificación: 05_target_definitions.py cerrado. Clasificación final en sección 22. Siguiente paso pendiente: 06_arsenal_incremental_value.py; no hay nuevos resultados de modelado.</w:t>
+      </w:r>
+    </w:p>
+    <w:p>
+      <w:r>
+        <w:t>Actualización 24/09/2026: revisar la auditoría de 05_target_definitions.py (sección 21) antes de continuar con modelado. Las definiciones permanecen abiertas; el experimento incremental de arsenal sigue pendiente.</w:t>
+      </w:r>
+    </w:p>
+    <w:p>
+      <w:r>
         <w:rPr>
           <w:i/>
         </w:rPr>
@@ -9235,6 +9245,327 @@
       </w:r>
       <w:r>
         <w:t>04_fold_safe_arsenal.py. La pregunta siguiente ya no es si el Stuff físico contiene señal, sino cuánto valor predictivo adicional aporta el arsenal cuando sus estadísticas se calculan correctamente dentro de cada fold de entrenamiento.</w:t>
+      </w:r>
+    </w:p>
+    <w:p>
+      <w:pPr>
+        <w:pStyle w:val="Heading1"/>
+      </w:pPr>
+      <w:r>
+        <w:t>21. Auditoría de targets sobre el dataset real</w:t>
+      </w:r>
+    </w:p>
+    <w:p>
+      <w:r>
+        <w:t>05_target_definitions.py — Auditoría ejecutada; definiciones abiertas. Registro: 24/09/2026. No se entrenaron modelos ni se cerraron las definiciones formales de V1.</w:t>
+      </w:r>
+    </w:p>
+    <w:p>
+      <w:pPr>
+        <w:pStyle w:val="Heading2"/>
+      </w:pPr>
+      <w:r>
+        <w:t>21.1 Alcance y trazabilidad</w:t>
+      </w:r>
+    </w:p>
+    <w:p>
+      <w:r>
+        <w:t>Se auditó stuff_model_df.parquet completo: 635,002 pitches, 84 columnas, sin filtros por tipo de lanzamiento, pitcher o target. Este universo precede al filtro V1 de 02 y al universo de modelado de 03; sus tasas no deben interpretarse como métricas del holdout. La salida reproducible 05_target_definitions_audit.txt contiene categorías reales, disponibilidad, dtypes, calidad numérica, conteos, denominadores, distribuciones y cruces semánticos. Incluye SHA256 y versiones del entorno.</w:t>
+      </w:r>
+    </w:p>
+    <w:p>
+      <w:r>
+        <w:t>Se encontraron las 26 variables solicitadas. Los 18 indicadores binarios tienen 635,002 observaciones válidas cada uno, sin NaN ni valores fuera de 0/1. La ausencia de problemas de codificación no garantiza coherencia semántica: las contradicciones observadas se mantienen visibles. Las conversiones de tipos y exclusiones por valores inválidos se reportan explícitamente en vistas analíticas; no se modifica ni se rellena el dataset.</w:t>
+      </w:r>
+    </w:p>
+    <w:p>
+      <w:pPr>
+        <w:pStyle w:val="Heading2"/>
+      </w:pPr>
+      <w:r>
+        <w:t>21.2 Tasas y denominadores separados</w:t>
+      </w:r>
+    </w:p>
+    <w:p>
+      <w:pPr>
+        <w:pStyle w:val="ListBullet"/>
+      </w:pPr>
+      <w:r>
+        <w:t>P(whiff por pitch) = 71,914 / 635,002 = 11.3250%. Mantiene el estimando por lanzamiento utilizado en 03, ahora sobre el dataset completo.</w:t>
+      </w:r>
+    </w:p>
+    <w:p>
+      <w:pPr>
+        <w:pStyle w:val="ListBullet"/>
+      </w:pPr>
+      <w:r>
+        <w:t>P(whiff | swing) = 71,914 / 298,029 swings elegibles = 24.1299%. Describe dificultad de contacto una vez realizado el swing y no equivale a la tasa por pitch.</w:t>
+      </w:r>
+    </w:p>
+    <w:p>
+      <w:pPr>
+        <w:pStyle w:val="ListBullet"/>
+      </w:pPr>
+      <w:r>
+        <w:t>P(chase | outside zone) = 141,014 / 411,912 pitches fuera de zona = 34.2340%. Se utiliza outside_strike_zone == 1 como universo y swung_outside_strike_zone como evento. No se divide entre todos los pitches.</w:t>
+      </w:r>
+    </w:p>
+    <w:p>
+      <w:r>
+        <w:t>En esta ejecución no hay eventos desconocidos en estos denominadores. Si aparecen NaNs o valores inválidos, el script informa universo, denominador observado y exclusiones; no trata lo desconocido como un evento negativo.</w:t>
+      </w:r>
+    </w:p>
+    <w:p>
+      <w:pPr>
+        <w:pStyle w:val="Heading2"/>
+      </w:pPr>
+      <w:r>
+        <w:t>21.3 Inconsistencias que requieren revisión</w:t>
+      </w:r>
+    </w:p>
+    <w:p>
+      <w:r>
+        <w:t>Los checks solicitados arrojan cero diferencias entre is_whiff e is_swinging_strike, cero whiffs sin swing, cero contactos sin swing y cero chase dentro de zona. Sin embargo, existen 403 pitches con called strike y swing simultáneos. Los cruces adicionales identifican 450 whiffs con contact simultáneo; también están marcados como is_batted. Estas filas no se corrigen ni se excluyen automáticamente.</w:t>
+      </w:r>
+    </w:p>
+    <w:p>
+      <w:r>
+        <w:t>is_hit_by_pitch es cero en todas las filas, aunque PitchCall contiene 2,280 HitByPitch y play_result contiene 2,258. De los PitchCall HitByPitch, 230 tienen swing/contact/is_batted activos. Este indicador no puede considerarse un target directo validado con la evidencia actual; queda pendiente revisar su construcción y reconciliar las fuentes.</w:t>
+      </w:r>
+    </w:p>
+    <w:p>
+      <w:r>
+        <w:t>is_whiff coincide exactamente con PitchCall == StrikeSwinging; is_called_strike coincide con StrikeCalled; is_hit coincide con las categorías Single/Double/Triple/HomeRun de play_result; strikeout y base_on_balls coinciden con KorBB. Son evidencias de reproducibilidad interna, no una verificación independiente de la verdad de cada etiqueta. Called strike y swing/contact requieren resolver las contradicciones citadas antes de cerrar su uso conjunto.</w:t>
+      </w:r>
+    </w:p>
+    <w:p>
+      <w:pPr>
+        <w:pStyle w:val="Heading2"/>
+      </w:pPr>
+      <w:r>
+        <w:t>21.4 Contacto y groundball</w:t>
+      </w:r>
+    </w:p>
+    <w:p>
+      <w:r>
+        <w:t>El universo solicitado is_batted == 1 contiene 225,722 filas e incluye fouls: no equivale a bolas en juego ni a contacto con mediciones completas. Hay 109,774 filas is_batted=1 con is_ball_in_play=0. Dentro de is_batted, hit_type se distribuye en GroundBall 63,890 (28.30%), FlyBall 50,371 (22.32%), LineDrive 37,801 (16.75%), Popup 29,694 (13.16%), Bunt 2,281 (1.01%) y ausentes 41,685 (18.47%).</w:t>
+      </w:r>
+    </w:p>
+    <w:p>
+      <w:r>
+        <w:t>Los ángulos medios/medianos por etiqueta son: GroundBall −13.283/−7.273°, FlyBall 36.477/35.913°, LineDrive 17.508/17.515°, Popup 62.256/60.666° y Bunt −19.422/−19.916°. La separación observada sustenta considerar groundball derivable de la etiqueta exacta GroundBall. Falta acordar el universo final, el tratamiento de bunts y de hit_type ausente. No se convirtió missing en “no groundball” ni se inventó un umbral de launch angle.</w:t>
+      </w:r>
+    </w:p>
+    <w:p>
+      <w:r>
+        <w:t>ExitSpeed tiene 182,821 mediciones válidas dentro de is_batted: media 79.851 mph, mediana 79.792, desviación estándar 14.755 y rango 1.140–129.918; faltan 42,901 mediciones. Angle tiene 182,820 mediciones: media 19.027°, mediana 20.552°, desviación estándar 30.784 y rango −89.573–89.542; faltan 42,902. Los extremos se reportan sin recortar ni asumir errores. Las 41,685 filas sin hit_type carecen también de ExitSpeed y Angle; solo 1,065 de los 2,281 bunts tienen ambas mediciones.</w:t>
+      </w:r>
+    </w:p>
+    <w:p>
+      <w:r>
+        <w:t>En is_batted, los hits tienen ExitSpeed media 88.981 mph frente a 77.277 en no hits; los home runs, 99.522 frente a 79.344 en no home runs. Estas estadísticas se calculan con mediciones disponibles, no con todas las filas del grupo. El reporte conserva conteos válidos, medianas, percentiles 1/5/10/25/50/75/90/95/99 y cruces con is_hit, home_run y OutsOnPlay. No se fijan definiciones de weak contact o hard contact con estos resultados.</w:t>
+      </w:r>
+    </w:p>
+    <w:p>
+      <w:pPr>
+        <w:pStyle w:val="Heading2"/>
+      </w:pPr>
+      <w:r>
+        <w:t>21.5 Outs, carreras y clasificación provisional</w:t>
+      </w:r>
+    </w:p>
+    <w:p>
+      <w:r>
+        <w:t>OutsOnPlay: 0 en 529,481 pitches; 1 en 105,244; 2 en 264; 3 en 13. Los 30,648 strikeouts tienen exactamente un out. Estos son resultados por pitch/jugada, no una definición validada del final de una PA. Out-within-PA permanece abierto hasta verificar estructura y secuencia de PA. RunsScored: 0 en 616,724 pitches; 1 en 13,844; 2 en 3,462; 3 en 808; 4 en 164. No se deriva xRunValue ni se introducen run expectancy o pesos externos.</w:t>
+      </w:r>
+    </w:p>
+    <w:p>
+      <w:r>
+        <w:t>Candidatos directos por coherencia interna: whiff/swinging strike, hit y sus resultados, strikeout y walk. Called strike dispone de una regla directa, pero presenta contradicciones con swing/contact. Whiff condicionado a swing y chase condicionado a fuera de zona son tasas reproducibles con universos explícitos; la definición subyacente de swing debe revisarse por las anomalías. Groundball es candidato derivable desde hit_type, sujeto al acuerdo sobre población y missing. Weak contact, hard contact y out-within-PA siguen abiertos. xRunValue queda fuera del alcance actual de V1, sin definición implementada.</w:t>
+      </w:r>
+    </w:p>
+    <w:p>
+      <w:pPr>
+        <w:pStyle w:val="Heading2"/>
+      </w:pPr>
+      <w:r>
+        <w:t>21.6 Validación y prioridad vigente</w:t>
+      </w:r>
+    </w:p>
+    <w:p>
+      <w:r>
+        <w:t>La ejecución completa terminó correctamente. Cuatro pruebas de robustez cubren columnas ausentes/dataset vacío, NaNs en denominadores, tipos y categorías inesperados y ausencia de swings elegibles; todas pasan. Se comprueba que las vistas analíticas no mutan los datos. PyArrow emitió avisos al consultar información de caché CPU bajo el sandbox de macOS; no impidieron la lectura ni la ejecución y no se ocultaron.</w:t>
+      </w:r>
+    </w:p>
+    <w:p>
+      <w:r>
+        <w:t>La prioridad al 24/09/2026 es revisar estas anomalías y acordar conjuntamente las definiciones formales de targets. 05_target_definitions.py permanece En curso; no está cerrado. El experimento incremental de arsenal previamente propuesto continúa pendiente y no se inicia en este paso. No hay nuevos resultados de modelado.</w:t>
+      </w:r>
+    </w:p>
+    <w:p>
+      <w:pPr>
+        <w:pStyle w:val="Heading1"/>
+      </w:pPr>
+      <w:r>
+        <w:t>22. Cierre formal de targets V1</w:t>
+      </w:r>
+    </w:p>
+    <w:p>
+      <w:r>
+        <w:t>05_target_definitions.py — CERRADO. Las decisiones siguientes ratifican las fuentes y universos elegibles de V1 y sustituyen los estados provisionales de la sección 21. No se entrenaron modelos ni se corrigieron etiquetas del dataset.</w:t>
+      </w:r>
+    </w:p>
+    <w:p>
+      <w:pPr>
+        <w:pStyle w:val="Heading3"/>
+      </w:pPr>
+      <w:r>
+        <w:t>whiff_per_pitch — Incluido, directo</w:t>
+      </w:r>
+    </w:p>
+    <w:p>
+      <w:r>
+        <w:t>Fuente: is_whiff sobre todos los pitches; los eventos desconocidos no se convierten en negativos.</w:t>
+      </w:r>
+    </w:p>
+    <w:p>
+      <w:pPr>
+        <w:pStyle w:val="Heading3"/>
+      </w:pPr>
+      <w:r>
+        <w:t>whiff_given_swing — Incluido, derivable</w:t>
+      </w:r>
+    </w:p>
+    <w:p>
+      <w:r>
+        <w:t>Fuente: is_whiff condicionado a is_swing == 1. No equivale al estimando por pitch.</w:t>
+      </w:r>
+    </w:p>
+    <w:p>
+      <w:pPr>
+        <w:pStyle w:val="Heading3"/>
+      </w:pPr>
+      <w:r>
+        <w:t>called_strike — Incluido, directo</w:t>
+      </w:r>
+    </w:p>
+    <w:p>
+      <w:r>
+        <w:t>Fuente primaria: PitchCall == "StrikeCalled". Coincide con is_called_strike en el dataset. Esto fija qué columna gobierna el target; no resuelve las 403 contradicciones con swing/contact, que se documentan sin corregirse.</w:t>
+      </w:r>
+    </w:p>
+    <w:p>
+      <w:pPr>
+        <w:pStyle w:val="Heading3"/>
+      </w:pPr>
+      <w:r>
+        <w:t>chase — Incluido, condicional</w:t>
+      </w:r>
+    </w:p>
+    <w:p>
+      <w:r>
+        <w:t>Evento: swung_outside_strike_zone; universo: outside_strike_zone == 1.</w:t>
+      </w:r>
+    </w:p>
+    <w:p>
+      <w:pPr>
+        <w:pStyle w:val="Heading3"/>
+      </w:pPr>
+      <w:r>
+        <w:t>groundball — Incluido, derivable</w:t>
+      </w:r>
+    </w:p>
+    <w:p>
+      <w:r>
+        <w:t>GB = 1 si hit_type == "GroundBall" y 0 para los otros tipos conocidos no-bunt, exclusivamente dentro de is_ball_in_play == 1, hit_type no ausente y hit_type != "Bunt". Cohorte: 107,118 pitches; 49,103 positivos; tasa 45.8401%; cobertura de BIP 92.3845%. Se excluyen del target 6,549 tipos desconocidos y 2,281 bunts. Los ausentes son desconocidos, nunca negativos. Sus filas originales se conservan.</w:t>
+      </w:r>
+    </w:p>
+    <w:p>
+      <w:pPr>
+        <w:pStyle w:val="Heading3"/>
+      </w:pPr>
+      <w:r>
+        <w:t>weak_contact y hard_contact — Fuera de V1</w:t>
+      </w:r>
+    </w:p>
+    <w:p>
+      <w:r>
+        <w:t>No existe un flag directo ni un umbral adoptado reproducible sin una convención adicional. La cohorte de contacto medida tiene 107,117 pitches, pero sus percentiles no definen por sí solos categorías defendibles. No se fijan umbrales.</w:t>
+      </w:r>
+    </w:p>
+    <w:p>
+      <w:pPr>
+        <w:pStyle w:val="Heading3"/>
+      </w:pPr>
+      <w:r>
+        <w:t>out_within_PA — Fuera de V1</w:t>
+      </w:r>
+    </w:p>
+    <w:p>
+      <w:r>
+        <w:t>No existe identificador/orden de PA suficientemente confiable para localizar el pitch terminal. PitchUID es único, pero mezcla 634,677 UUID v1 y 325 v4; tampoco prueba límites de PA. Hay 2,020 filas sin bateador y 935 grupos juego/bateador/inning/mitad con más de un candidato terminal. OutsOnPlay por pitch no representa por sí solo un target a nivel PA.</w:t>
+      </w:r>
+    </w:p>
+    <w:p>
+      <w:pPr>
+        <w:pStyle w:val="Heading3"/>
+      </w:pPr>
+      <w:r>
+        <w:t>xRunValue — Fuera de V1</w:t>
+      </w:r>
+    </w:p>
+    <w:p>
+      <w:r>
+        <w:t>No existe listo; RunsScored observado no sustituye run value esperado. No se incorporan pesos externos ni run expectancy.</w:t>
+      </w:r>
+    </w:p>
+    <w:p>
+      <w:pPr>
+        <w:pStyle w:val="Heading3"/>
+      </w:pPr>
+      <w:r>
+        <w:t>hit_by_pitch — No usar flag directo</w:t>
+      </w:r>
+    </w:p>
+    <w:p>
+      <w:r>
+        <w:t>is_hit_by_pitch queda descartado como fuente. Si se requiere HBP, la fuente primaria será PitchCall == "HitByPitch"; se conservan y documentan los 22 casos cuyo play_result dice Walk. No se incorpora un nuevo target HBP entrenado en este paso.</w:t>
+      </w:r>
+    </w:p>
+    <w:p>
+      <w:pPr>
+        <w:pStyle w:val="Heading2"/>
+      </w:pPr>
+      <w:r>
+        <w:t>22.1 Hallazgos técnicos y alcance del cierre</w:t>
+      </w:r>
+    </w:p>
+    <w:p>
+      <w:r>
+        <w:t>is_batted no equivale a BIP e incluye observaciones inconsistentes; cada target de contacto debe declarar su universo elegible. Los 450 whiff+contact y los 403 called strike+contact se conservan sin imponer una corrección no sustentada por metadata de origen.</w:t>
+      </w:r>
+    </w:p>
+    <w:p>
+      <w:r>
+        <w:t>hit_type y Angle muestran rangos delimitados alrededor de 10°, 25° y 50°. Esto sugiere relación por cortes, pero su procedencia no está confirmada. No deben tratarse como señales independientes para validar la misma definición. Los 6,549 BIP sin hit_type no tienen ExitSpeed ni Angle; no hay una reconstrucción defendible a partir de sus resultados de jugada.</w:t>
+      </w:r>
+    </w:p>
+    <w:p>
+      <w:r>
+        <w:t>El cierre corresponde al diseño de targets y sus exclusiones, no a la reparación de las fuentes ni a nuevos resultados predictivos. Evidencia reproducible: 05_target_definitions_audit.txt, sobre stuff_model_df.parquet completo (635,002 filas y 84 columnas).</w:t>
+      </w:r>
+    </w:p>
+    <w:p>
+      <w:pPr>
+        <w:pStyle w:val="Heading2"/>
+      </w:pPr>
+      <w:r>
+        <w:t>22.2 Próximo paso</w:t>
+      </w:r>
+    </w:p>
+    <w:p>
+      <w:r>
+        <w:t>06_arsenal_incremental_value.py — Pendiente. Comparar Null, Physical Stuff y Physical Stuff + Historical Arsenal para is_whiff sobre exactamente las mismas filas elegibles de la validación season-forward. Retoma el experimento antes pospuesto bajo el nombre 05_arsenal_incremental_value.py. Todavía no se ha ejecutado ni demostrado mejora incremental.</w:t>
       </w:r>
     </w:p>
     <w:sectPr>

</xml_diff>

<commit_message>
Agrega modelos boosting, holdout por park y documentación
</commit_message>
<xml_diff>
--- a/ISAC_Diablos_Rojos_Guia_Base_Modelado.docx
+++ b/ISAC_Diablos_Rojos_Guia_Base_Modelado.docx
@@ -9565,7 +9565,1559 @@
     </w:p>
     <w:p>
       <w:r>
-        <w:t>06_arsenal_incremental_value.py — Pendiente. Comparar Null, Physical Stuff y Physical Stuff + Historical Arsenal para is_whiff sobre exactamente las mismas filas elegibles de la validación season-forward. Retoma el experimento antes pospuesto bajo el nombre 05_arsenal_incremental_value.py. Todavía no se ha ejecutado ni demostrado mejora incremental.</w:t>
+        <w:t>06_arsenal_incremental_value.py — CERRADO. Ejecutado contra stuff_model_df.parquet / stuff_model_features_v1.parquet reales el 24/09/2026. El arsenal historico aporta valor incremental positivo y consistente sobre Physical Stuff para is_whiff en las dos ventanas season-forward. Ver seccion 23 para metodologia, cifras y limites.</w:t>
+      </w:r>
+    </w:p>
+    <w:p>
+      <w:pPr>
+        <w:pStyle w:val="Heading1"/>
+      </w:pPr>
+      <w:r>
+        <w:t>23. Cierre de 06_arsenal_incremental_value.py</w:t>
+      </w:r>
+    </w:p>
+    <w:p>
+      <w:pPr/>
+      <w:r>
+        <w:t>Estado: CERRADO. Ejecucion real el 24/09/2026 contra el dataset del hackathon (stuff_model_df.parquet, 635,002 filas; stuff_model_features_v1.parquet, 634,350 filas). Pregunta: si el arsenal historico (siete features fold-safe de 04_fold_safe_arsenal.py) aporta valor incremental sobre Physical Stuff para is_whiff, sobre exactamente las mismas filas elegibles de cada ventana season-forward.</w:t>
+      </w:r>
+    </w:p>
+    <w:p>
+      <w:pPr>
+        <w:pStyle w:val="Heading2"/>
+      </w:pPr>
+      <w:r>
+        <w:t>23.1 Metodologia</w:t>
+      </w:r>
+    </w:p>
+    <w:p>
+      <w:pPr/>
+      <w:r>
+        <w:t>Se reutilizan integramente fit_historical_arsenal_reference y apply_historical_arsenal_reference de 04_fold_safe_arsenal.py; 06 no reimplementa la logica de leakage. La aplicacion sobre la temporada futura (evaluacion) es la funcion publica sin cambios: exige que el historial sea estrictamente anterior al ano evaluado y no imputa referencias faltantes.</w:t>
+      </w:r>
+    </w:p>
+    <w:p>
+      <w:pPr/>
+      <w:r>
+        <w:t>Limite metodologico documentado: las features de arsenal de las filas de ENTRENAMIENTO (dentro del propio historial) se calculan aplicando la referencia del historial completo sobre si mismo, via la funcion interna _apply_reference. Esto es un sesgo conservador deliberado -cada fila contribuye levemente a su propio promedio de referencia, lo que comprime los diferenciales hacia cero- y por tanto dificulta, no facilita, mostrar valor incremental. La cohorte de entrenamiento y de evaluacion se restringen a filas con las siete features de arsenal completas (sin NaN), para que las tres alternativas (Null, Physical Stuff, Physical Stuff + Historical Arsenal) se evaluen sobre filas identicas.</w:t>
+      </w:r>
+    </w:p>
+    <w:p>
+      <w:pPr/>
+      <w:r>
+        <w:t>El modelo usado es la misma regresion logistica interpretable de 03_stuff_baseline.py (features fisicas + AutoPitchType + PitcherThrows, C=0.1, saga), para aislar el efecto del arsenal sin introducir a la vez un cambio de arquitectura hacia boosting.</w:t>
+      </w:r>
+    </w:p>
+    <w:p>
+      <w:pPr>
+        <w:pStyle w:val="Heading2"/>
+      </w:pPr>
+      <w:r>
+        <w:t>23.2 Resultados</w:t>
+      </w:r>
+    </w:p>
+    <w:tbl>
+      <w:tblPr>
+        <w:tblStyle w:val="TableGrid"/>
+        <w:tblW w:type="auto" w:w="0"/>
+        <w:tblLook w:firstColumn="1" w:firstRow="1" w:lastColumn="0" w:lastRow="0" w:noHBand="0" w:noVBand="1" w:val="04A0"/>
+      </w:tblPr>
+      <w:tblGrid>
+        <w:gridCol w:w="1704"/>
+        <w:gridCol w:w="1704"/>
+        <w:gridCol w:w="1704"/>
+        <w:gridCol w:w="1704"/>
+        <w:gridCol w:w="1704"/>
+        <w:gridCol w:w="1704"/>
+      </w:tblGrid>
+      <w:tr>
+        <w:tc>
+          <w:tcPr>
+            <w:tcW w:type="dxa" w:w="1704"/>
+          </w:tcPr>
+          <w:p>
+            <w:r>
+              <w:t>Ventana</w:t>
+            </w:r>
+          </w:p>
+        </w:tc>
+        <w:tc>
+          <w:tcPr>
+            <w:tcW w:type="dxa" w:w="1704"/>
+          </w:tcPr>
+          <w:p>
+            <w:r>
+              <w:t>Modelo</w:t>
+            </w:r>
+          </w:p>
+        </w:tc>
+        <w:tc>
+          <w:tcPr>
+            <w:tcW w:type="dxa" w:w="1704"/>
+          </w:tcPr>
+          <w:p>
+            <w:r>
+              <w:t>n eval</w:t>
+            </w:r>
+          </w:p>
+        </w:tc>
+        <w:tc>
+          <w:tcPr>
+            <w:tcW w:type="dxa" w:w="1704"/>
+          </w:tcPr>
+          <w:p>
+            <w:r>
+              <w:t>AUC</w:t>
+            </w:r>
+          </w:p>
+        </w:tc>
+        <w:tc>
+          <w:tcPr>
+            <w:tcW w:type="dxa" w:w="1704"/>
+          </w:tcPr>
+          <w:p>
+            <w:r>
+              <w:t>Log Loss</w:t>
+            </w:r>
+          </w:p>
+        </w:tc>
+        <w:tc>
+          <w:tcPr>
+            <w:tcW w:type="dxa" w:w="1704"/>
+          </w:tcPr>
+          <w:p>
+            <w:r>
+              <w:t>Brier</w:t>
+            </w:r>
+          </w:p>
+        </w:tc>
+      </w:tr>
+      <w:tr>
+        <w:tc>
+          <w:tcPr>
+            <w:tcW w:type="dxa" w:w="1704"/>
+          </w:tcPr>
+          <w:p>
+            <w:r>
+              <w:t>2024 -&gt; 2025</w:t>
+            </w:r>
+          </w:p>
+        </w:tc>
+        <w:tc>
+          <w:tcPr>
+            <w:tcW w:type="dxa" w:w="1704"/>
+          </w:tcPr>
+          <w:p>
+            <w:r>
+              <w:t>Null</w:t>
+            </w:r>
+          </w:p>
+        </w:tc>
+        <w:tc>
+          <w:tcPr>
+            <w:tcW w:type="dxa" w:w="1704"/>
+          </w:tcPr>
+          <w:p>
+            <w:r>
+              <w:t>131,891</w:t>
+            </w:r>
+          </w:p>
+        </w:tc>
+        <w:tc>
+          <w:tcPr>
+            <w:tcW w:type="dxa" w:w="1704"/>
+          </w:tcPr>
+          <w:p>
+            <w:r>
+              <w:t>0.5000</w:t>
+            </w:r>
+          </w:p>
+        </w:tc>
+        <w:tc>
+          <w:tcPr>
+            <w:tcW w:type="dxa" w:w="1704"/>
+          </w:tcPr>
+          <w:p>
+            <w:r>
+              <w:t>0.34745</w:t>
+            </w:r>
+          </w:p>
+        </w:tc>
+        <w:tc>
+          <w:tcPr>
+            <w:tcW w:type="dxa" w:w="1704"/>
+          </w:tcPr>
+          <w:p>
+            <w:r>
+              <w:t>0.09822</w:t>
+            </w:r>
+          </w:p>
+        </w:tc>
+      </w:tr>
+      <w:tr>
+        <w:tc>
+          <w:tcPr>
+            <w:tcW w:type="dxa" w:w="1704"/>
+          </w:tcPr>
+          <w:p>
+            <w:r>
+              <w:t>2024 -&gt; 2025</w:t>
+            </w:r>
+          </w:p>
+        </w:tc>
+        <w:tc>
+          <w:tcPr>
+            <w:tcW w:type="dxa" w:w="1704"/>
+          </w:tcPr>
+          <w:p>
+            <w:r>
+              <w:t>Physical Stuff</w:t>
+            </w:r>
+          </w:p>
+        </w:tc>
+        <w:tc>
+          <w:tcPr>
+            <w:tcW w:type="dxa" w:w="1704"/>
+          </w:tcPr>
+          <w:p>
+            <w:r>
+              <w:t>131,891</w:t>
+            </w:r>
+          </w:p>
+        </w:tc>
+        <w:tc>
+          <w:tcPr>
+            <w:tcW w:type="dxa" w:w="1704"/>
+          </w:tcPr>
+          <w:p>
+            <w:r>
+              <w:t>0.6139</w:t>
+            </w:r>
+          </w:p>
+        </w:tc>
+        <w:tc>
+          <w:tcPr>
+            <w:tcW w:type="dxa" w:w="1704"/>
+          </w:tcPr>
+          <w:p>
+            <w:r>
+              <w:t>0.33987</w:t>
+            </w:r>
+          </w:p>
+        </w:tc>
+        <w:tc>
+          <w:tcPr>
+            <w:tcW w:type="dxa" w:w="1704"/>
+          </w:tcPr>
+          <w:p>
+            <w:r>
+              <w:t>0.09667</w:t>
+            </w:r>
+          </w:p>
+        </w:tc>
+      </w:tr>
+      <w:tr>
+        <w:tc>
+          <w:tcPr>
+            <w:tcW w:type="dxa" w:w="1704"/>
+          </w:tcPr>
+          <w:p>
+            <w:r>
+              <w:t>2024 -&gt; 2025</w:t>
+            </w:r>
+          </w:p>
+        </w:tc>
+        <w:tc>
+          <w:tcPr>
+            <w:tcW w:type="dxa" w:w="1704"/>
+          </w:tcPr>
+          <w:p>
+            <w:r>
+              <w:t>Physical Stuff + Historical Arsenal</w:t>
+            </w:r>
+          </w:p>
+        </w:tc>
+        <w:tc>
+          <w:tcPr>
+            <w:tcW w:type="dxa" w:w="1704"/>
+          </w:tcPr>
+          <w:p>
+            <w:r>
+              <w:t>131,891</w:t>
+            </w:r>
+          </w:p>
+        </w:tc>
+        <w:tc>
+          <w:tcPr>
+            <w:tcW w:type="dxa" w:w="1704"/>
+          </w:tcPr>
+          <w:p>
+            <w:r>
+              <w:t>0.6166</w:t>
+            </w:r>
+          </w:p>
+        </w:tc>
+        <w:tc>
+          <w:tcPr>
+            <w:tcW w:type="dxa" w:w="1704"/>
+          </w:tcPr>
+          <w:p>
+            <w:r>
+              <w:t>0.33944</w:t>
+            </w:r>
+          </w:p>
+        </w:tc>
+        <w:tc>
+          <w:tcPr>
+            <w:tcW w:type="dxa" w:w="1704"/>
+          </w:tcPr>
+          <w:p>
+            <w:r>
+              <w:t>0.09655</w:t>
+            </w:r>
+          </w:p>
+        </w:tc>
+      </w:tr>
+      <w:tr>
+        <w:tc>
+          <w:tcPr>
+            <w:tcW w:type="dxa" w:w="1704"/>
+          </w:tcPr>
+          <w:p>
+            <w:r>
+              <w:t>2024-2025 -&gt; 2026</w:t>
+            </w:r>
+          </w:p>
+        </w:tc>
+        <w:tc>
+          <w:tcPr>
+            <w:tcW w:type="dxa" w:w="1704"/>
+          </w:tcPr>
+          <w:p>
+            <w:r>
+              <w:t>Null</w:t>
+            </w:r>
+          </w:p>
+        </w:tc>
+        <w:tc>
+          <w:tcPr>
+            <w:tcW w:type="dxa" w:w="1704"/>
+          </w:tcPr>
+          <w:p>
+            <w:r>
+              <w:t>87,814</w:t>
+            </w:r>
+          </w:p>
+        </w:tc>
+        <w:tc>
+          <w:tcPr>
+            <w:tcW w:type="dxa" w:w="1704"/>
+          </w:tcPr>
+          <w:p>
+            <w:r>
+              <w:t>0.5000</w:t>
+            </w:r>
+          </w:p>
+        </w:tc>
+        <w:tc>
+          <w:tcPr>
+            <w:tcW w:type="dxa" w:w="1704"/>
+          </w:tcPr>
+          <w:p>
+            <w:r>
+              <w:t>0.34783</w:t>
+            </w:r>
+          </w:p>
+        </w:tc>
+        <w:tc>
+          <w:tcPr>
+            <w:tcW w:type="dxa" w:w="1704"/>
+          </w:tcPr>
+          <w:p>
+            <w:r>
+              <w:t>0.09838</w:t>
+            </w:r>
+          </w:p>
+        </w:tc>
+      </w:tr>
+      <w:tr>
+        <w:tc>
+          <w:tcPr>
+            <w:tcW w:type="dxa" w:w="1704"/>
+          </w:tcPr>
+          <w:p>
+            <w:r>
+              <w:t>2024-2025 -&gt; 2026</w:t>
+            </w:r>
+          </w:p>
+        </w:tc>
+        <w:tc>
+          <w:tcPr>
+            <w:tcW w:type="dxa" w:w="1704"/>
+          </w:tcPr>
+          <w:p>
+            <w:r>
+              <w:t>Physical Stuff</w:t>
+            </w:r>
+          </w:p>
+        </w:tc>
+        <w:tc>
+          <w:tcPr>
+            <w:tcW w:type="dxa" w:w="1704"/>
+          </w:tcPr>
+          <w:p>
+            <w:r>
+              <w:t>87,814</w:t>
+            </w:r>
+          </w:p>
+        </w:tc>
+        <w:tc>
+          <w:tcPr>
+            <w:tcW w:type="dxa" w:w="1704"/>
+          </w:tcPr>
+          <w:p>
+            <w:r>
+              <w:t>0.6127</w:t>
+            </w:r>
+          </w:p>
+        </w:tc>
+        <w:tc>
+          <w:tcPr>
+            <w:tcW w:type="dxa" w:w="1704"/>
+          </w:tcPr>
+          <w:p>
+            <w:r>
+              <w:t>0.34075</w:t>
+            </w:r>
+          </w:p>
+        </w:tc>
+        <w:tc>
+          <w:tcPr>
+            <w:tcW w:type="dxa" w:w="1704"/>
+          </w:tcPr>
+          <w:p>
+            <w:r>
+              <w:t>0.09696</w:t>
+            </w:r>
+          </w:p>
+        </w:tc>
+      </w:tr>
+      <w:tr>
+        <w:tc>
+          <w:tcPr>
+            <w:tcW w:type="dxa" w:w="1704"/>
+          </w:tcPr>
+          <w:p>
+            <w:r>
+              <w:t>2024-2025 -&gt; 2026</w:t>
+            </w:r>
+          </w:p>
+        </w:tc>
+        <w:tc>
+          <w:tcPr>
+            <w:tcW w:type="dxa" w:w="1704"/>
+          </w:tcPr>
+          <w:p>
+            <w:r>
+              <w:t>Physical Stuff + Historical Arsenal</w:t>
+            </w:r>
+          </w:p>
+        </w:tc>
+        <w:tc>
+          <w:tcPr>
+            <w:tcW w:type="dxa" w:w="1704"/>
+          </w:tcPr>
+          <w:p>
+            <w:r>
+              <w:t>87,814</w:t>
+            </w:r>
+          </w:p>
+        </w:tc>
+        <w:tc>
+          <w:tcPr>
+            <w:tcW w:type="dxa" w:w="1704"/>
+          </w:tcPr>
+          <w:p>
+            <w:r>
+              <w:t>0.6159</w:t>
+            </w:r>
+          </w:p>
+        </w:tc>
+        <w:tc>
+          <w:tcPr>
+            <w:tcW w:type="dxa" w:w="1704"/>
+          </w:tcPr>
+          <w:p>
+            <w:r>
+              <w:t>0.34017</w:t>
+            </w:r>
+          </w:p>
+        </w:tc>
+        <w:tc>
+          <w:tcPr>
+            <w:tcW w:type="dxa" w:w="1704"/>
+          </w:tcPr>
+          <w:p>
+            <w:r>
+              <w:t>0.09680</w:t>
+            </w:r>
+          </w:p>
+        </w:tc>
+      </w:tr>
+    </w:tbl>
+    <w:p>
+      <w:pPr/>
+      <w:r>
+        <w:t>Delta AUC (Arsenal vs Physical): +0.0027 en 2024-&gt;2025 y +0.0032 en 2024-2025-&gt;2026. Log Loss y Brier mejoran en la misma direccion en ambas ventanas (no es una mejora que dependa de una sola metrica). Filas de entrenamiento con arsenal completo: 237,078/243,098 (2024) y 492,033/498,847 (2024-2025). Filas de evaluacion elegibles, identicas para las tres alternativas: 131,891/255,749 (2025, 51.6%) y 87,814/132,243 (2026, 66.4%); esta cohorte es mas chica que la cobertura de referencia FB reportada en 04 porque tambien exige pitch_usage_pct no nulo, es decir, que el pitcher haya lanzado ese tipo de pitch dentro del historial permitido.</w:t>
+      </w:r>
+    </w:p>
+    <w:p>
+      <w:pPr>
+        <w:pStyle w:val="Heading2"/>
+      </w:pPr>
+      <w:r>
+        <w:t>23.3 Decision</w:t>
+      </w:r>
+    </w:p>
+    <w:tbl>
+      <w:tblPr>
+        <w:tblStyle w:val="TableGrid"/>
+        <w:tblW w:type="auto" w:w="0"/>
+        <w:tblLook w:firstColumn="1" w:firstRow="1" w:lastColumn="0" w:lastRow="0" w:noHBand="0" w:noVBand="1" w:val="04A0"/>
+      </w:tblPr>
+      <w:tblGrid>
+        <w:gridCol w:w="2556"/>
+        <w:gridCol w:w="2556"/>
+        <w:gridCol w:w="2556"/>
+        <w:gridCol w:w="2556"/>
+      </w:tblGrid>
+      <w:tr>
+        <w:tc>
+          <w:tcPr>
+            <w:tcW w:type="dxa" w:w="2556"/>
+          </w:tcPr>
+          <w:p>
+            <w:r>
+              <w:t>Tema</w:t>
+            </w:r>
+          </w:p>
+        </w:tc>
+        <w:tc>
+          <w:tcPr>
+            <w:tcW w:type="dxa" w:w="2556"/>
+          </w:tcPr>
+          <w:p>
+            <w:r>
+              <w:t>Prueba</w:t>
+            </w:r>
+          </w:p>
+        </w:tc>
+        <w:tc>
+          <w:tcPr>
+            <w:tcW w:type="dxa" w:w="2556"/>
+          </w:tcPr>
+          <w:p>
+            <w:r>
+              <w:t>Resultado</w:t>
+            </w:r>
+          </w:p>
+        </w:tc>
+        <w:tc>
+          <w:tcPr>
+            <w:tcW w:type="dxa" w:w="2556"/>
+          </w:tcPr>
+          <w:p>
+            <w:r>
+              <w:t>Decision</w:t>
+            </w:r>
+          </w:p>
+        </w:tc>
+      </w:tr>
+      <w:tr>
+        <w:tc>
+          <w:tcPr>
+            <w:tcW w:type="dxa" w:w="2556"/>
+          </w:tcPr>
+          <w:p>
+            <w:r>
+              <w:t>Valor incremental del arsenal</w:t>
+            </w:r>
+          </w:p>
+        </w:tc>
+        <w:tc>
+          <w:tcPr>
+            <w:tcW w:type="dxa" w:w="2556"/>
+          </w:tcPr>
+          <w:p>
+            <w:r>
+              <w:t>Null vs Physical Stuff vs Physical Stuff + Historical Arsenal, season-forward, mismas filas elegibles</w:t>
+            </w:r>
+          </w:p>
+        </w:tc>
+        <w:tc>
+          <w:tcPr>
+            <w:tcW w:type="dxa" w:w="2556"/>
+          </w:tcPr>
+          <w:p>
+            <w:r>
+              <w:t>Mejora consistente y positiva en AUC, Log Loss y Brier en las dos ventanas; efecto pequeno (~0.003 AUC) pero direccionalmente estable</w:t>
+            </w:r>
+          </w:p>
+        </w:tc>
+        <w:tc>
+          <w:tcPr>
+            <w:tcW w:type="dxa" w:w="2556"/>
+          </w:tcPr>
+          <w:p>
+            <w:r>
+              <w:t>Conservar las siete features de arsenal en el modelo de boosting / Pitching+ siguiente. El efecto es modesto con regresion logistica; revisar si crece con un modelo no lineal antes de descartarlo.</w:t>
+            </w:r>
+          </w:p>
+        </w:tc>
+      </w:tr>
+    </w:tbl>
+    <w:p>
+      <w:pPr/>
+      <w:r>
+        <w:t>Siguiente paso pendiente: modelo de boosting (XGBoost/LightGBM) multi-objetivo, incorporando arsenal, location y altitude_category, con park holdout ademas del pitcher holdout y season-forward ya usados.</w:t>
+      </w:r>
+    </w:p>
+    <w:p>
+      <w:pPr>
+        <w:pStyle w:val="Heading1"/>
+      </w:pPr>
+      <w:r>
+        <w:t>24. Boosting V1: Stuff+ fisico y primer Location+</w:t>
+      </w:r>
+    </w:p>
+    <w:p>
+      <w:pPr/>
+      <w:r>
+        <w:t>Estado: CERRADO (V1, sin arsenal ni altitud). Ejecucion real el 24/09/2026 contra stuff_model_features_v1.parquet, con el mismo pitcher holdout de 03_stuff_baseline.py (907 pitchers train, 227 test, 0 compartidos).</w:t>
+      </w:r>
+    </w:p>
+    <w:p>
+      <w:pPr>
+        <w:pStyle w:val="Heading2"/>
+      </w:pPr>
+      <w:r>
+        <w:t>24.1 Nota de entorno: por que no es LightGBM ni XGBoost</w:t>
+      </w:r>
+    </w:p>
+    <w:p>
+      <w:pPr/>
+      <w:r>
+        <w:t>LightGBM y XGBoost no pudieron cargarse: ambos requieren libomp.dylib, y 'brew install libomp' fallo porque las Command Line Tools del host de desarrollo no pueden compilar (xcrun no encuentra un compilador compatible con la arquitectura). Es un problema de configuracion del host, no del proyecto ni de los datos. Se sustituyo por sklearn.ensemble.HistGradientBoostingClassifier: tambien es gradient boosting por histogramas (mismo principio que LightGBM), viene con scikit-learn (ya usado en 03) y soporta NaN y columnas categoricas sin imputer ni one-hot. Si se resuelve libomp en la maquina del equipo, LightGBM/XGBoost son swaps directos de build_model() en 07_boosting_models.py sin tocar el resto del script.</w:t>
+      </w:r>
+    </w:p>
+    <w:p>
+      <w:pPr>
+        <w:pStyle w:val="Heading2"/>
+      </w:pPr>
+      <w:r>
+        <w:t>24.2 Diseno: dos familias de targets, arsenal excluido a proposito</w:t>
+      </w:r>
+    </w:p>
+    <w:p>
+      <w:pPr/>
+      <w:r>
+        <w:t>Se mantiene la separacion Stuff+ / Location+ de la seccion 1: la familia 'stuff' usa solo las 12 features fisicas + AutoPitchType + PitcherThrows (sin ubicacion, count ni BatterSide); la familia 'location' usa PlateLocHeight, PlateLocSide, Balls, Strikes, AutoPitchType, PitcherThrows y BatterSide (sin velocidad ni movimiento). called_strike se define exactamente como lo cerro 05_target_definitions.py: is_called_strike sobre todos los pitches, sin restringir a takes; no se inventa una poblacion nueva no ratificada.</w:t>
+      </w:r>
+    </w:p>
+    <w:p>
+      <w:pPr/>
+      <w:r>
+        <w:t>El arsenal historico se excluyo deliberadamente de este boosting. 04_fold_safe_arsenal.py ya demostro que bajo pitcher holdout puro las siete features de arsenal quedan 100% ausentes en test (pitchers nuevos no tienen historial). Combinar arsenal con boosting solo tiene sentido bajo el escenario season-forward de 06_arsenal_incremental_value.py; eso queda para la capa Pitching+ combinada, no para este boosting V1.</w:t>
+      </w:r>
+    </w:p>
+    <w:p>
+      <w:pPr/>
+      <w:r>
+        <w:t>Interpretabilidad: HistGradientBoostingClassifier no expone feature_importances_ (no es un ensamble de arboles con conteo de splits simple). Se uso permutation_importance sobre una muestra de test como sustituto explicito de SHAP; no se afirma que sea SHAP.</w:t>
+      </w:r>
+    </w:p>
+    <w:p>
+      <w:pPr>
+        <w:pStyle w:val="Heading2"/>
+      </w:pPr>
+      <w:r>
+        <w:t>24.3 Resultados</w:t>
+      </w:r>
+    </w:p>
+    <w:tbl>
+      <w:tblPr>
+        <w:tblStyle w:val="TableGrid"/>
+        <w:tblW w:type="auto" w:w="0"/>
+        <w:tblLook w:firstColumn="1" w:firstRow="1" w:lastColumn="0" w:lastRow="0" w:noHBand="0" w:noVBand="1" w:val="04A0"/>
+      </w:tblPr>
+      <w:tblGrid>
+        <w:gridCol w:w="1461"/>
+        <w:gridCol w:w="1461"/>
+        <w:gridCol w:w="1461"/>
+        <w:gridCol w:w="1461"/>
+        <w:gridCol w:w="1461"/>
+        <w:gridCol w:w="1461"/>
+        <w:gridCol w:w="1461"/>
+      </w:tblGrid>
+      <w:tr>
+        <w:tc>
+          <w:tcPr>
+            <w:tcW w:type="dxa" w:w="1461"/>
+          </w:tcPr>
+          <w:p>
+            <w:r>
+              <w:t>Target</w:t>
+            </w:r>
+          </w:p>
+        </w:tc>
+        <w:tc>
+          <w:tcPr>
+            <w:tcW w:type="dxa" w:w="1461"/>
+          </w:tcPr>
+          <w:p>
+            <w:r>
+              <w:t>Familia</w:t>
+            </w:r>
+          </w:p>
+        </w:tc>
+        <w:tc>
+          <w:tcPr>
+            <w:tcW w:type="dxa" w:w="1461"/>
+          </w:tcPr>
+          <w:p>
+            <w:r>
+              <w:t>n eval</w:t>
+            </w:r>
+          </w:p>
+        </w:tc>
+        <w:tc>
+          <w:tcPr>
+            <w:tcW w:type="dxa" w:w="1461"/>
+          </w:tcPr>
+          <w:p>
+            <w:r>
+              <w:t>Null AUC</w:t>
+            </w:r>
+          </w:p>
+        </w:tc>
+        <w:tc>
+          <w:tcPr>
+            <w:tcW w:type="dxa" w:w="1461"/>
+          </w:tcPr>
+          <w:p>
+            <w:r>
+              <w:t>Boosting AUC</w:t>
+            </w:r>
+          </w:p>
+        </w:tc>
+        <w:tc>
+          <w:tcPr>
+            <w:tcW w:type="dxa" w:w="1461"/>
+          </w:tcPr>
+          <w:p>
+            <w:r>
+              <w:t>Log Loss</w:t>
+            </w:r>
+          </w:p>
+        </w:tc>
+        <w:tc>
+          <w:tcPr>
+            <w:tcW w:type="dxa" w:w="1461"/>
+          </w:tcPr>
+          <w:p>
+            <w:r>
+              <w:t>Brier</w:t>
+            </w:r>
+          </w:p>
+        </w:tc>
+      </w:tr>
+      <w:tr>
+        <w:tc>
+          <w:tcPr>
+            <w:tcW w:type="dxa" w:w="1461"/>
+          </w:tcPr>
+          <w:p>
+            <w:r>
+              <w:t>whiff_per_pitch</w:t>
+            </w:r>
+          </w:p>
+        </w:tc>
+        <w:tc>
+          <w:tcPr>
+            <w:tcW w:type="dxa" w:w="1461"/>
+          </w:tcPr>
+          <w:p>
+            <w:r>
+              <w:t>Stuff+</w:t>
+            </w:r>
+          </w:p>
+        </w:tc>
+        <w:tc>
+          <w:tcPr>
+            <w:tcW w:type="dxa" w:w="1461"/>
+          </w:tcPr>
+          <w:p>
+            <w:r>
+              <w:t>116,493</w:t>
+            </w:r>
+          </w:p>
+        </w:tc>
+        <w:tc>
+          <w:tcPr>
+            <w:tcW w:type="dxa" w:w="1461"/>
+          </w:tcPr>
+          <w:p>
+            <w:r>
+              <w:t>0.5000</w:t>
+            </w:r>
+          </w:p>
+        </w:tc>
+        <w:tc>
+          <w:tcPr>
+            <w:tcW w:type="dxa" w:w="1461"/>
+          </w:tcPr>
+          <w:p>
+            <w:r>
+              <w:t>0.7268</w:t>
+            </w:r>
+          </w:p>
+        </w:tc>
+        <w:tc>
+          <w:tcPr>
+            <w:tcW w:type="dxa" w:w="1461"/>
+          </w:tcPr>
+          <w:p>
+            <w:r>
+              <w:t>0.32263</w:t>
+            </w:r>
+          </w:p>
+        </w:tc>
+        <w:tc>
+          <w:tcPr>
+            <w:tcW w:type="dxa" w:w="1461"/>
+          </w:tcPr>
+          <w:p>
+            <w:r>
+              <w:t>0.09460</w:t>
+            </w:r>
+          </w:p>
+        </w:tc>
+      </w:tr>
+      <w:tr>
+        <w:tc>
+          <w:tcPr>
+            <w:tcW w:type="dxa" w:w="1461"/>
+          </w:tcPr>
+          <w:p>
+            <w:r>
+              <w:t>whiff_given_swing</w:t>
+            </w:r>
+          </w:p>
+        </w:tc>
+        <w:tc>
+          <w:tcPr>
+            <w:tcW w:type="dxa" w:w="1461"/>
+          </w:tcPr>
+          <w:p>
+            <w:r>
+              <w:t>Stuff+</w:t>
+            </w:r>
+          </w:p>
+        </w:tc>
+        <w:tc>
+          <w:tcPr>
+            <w:tcW w:type="dxa" w:w="1461"/>
+          </w:tcPr>
+          <w:p>
+            <w:r>
+              <w:t>54,970</w:t>
+            </w:r>
+          </w:p>
+        </w:tc>
+        <w:tc>
+          <w:tcPr>
+            <w:tcW w:type="dxa" w:w="1461"/>
+          </w:tcPr>
+          <w:p>
+            <w:r>
+              <w:t>0.5000</w:t>
+            </w:r>
+          </w:p>
+        </w:tc>
+        <w:tc>
+          <w:tcPr>
+            <w:tcW w:type="dxa" w:w="1461"/>
+          </w:tcPr>
+          <w:p>
+            <w:r>
+              <w:t>0.7330</w:t>
+            </w:r>
+          </w:p>
+        </w:tc>
+        <w:tc>
+          <w:tcPr>
+            <w:tcW w:type="dxa" w:w="1461"/>
+          </w:tcPr>
+          <w:p>
+            <w:r>
+              <w:t>0.48257</w:t>
+            </w:r>
+          </w:p>
+        </w:tc>
+        <w:tc>
+          <w:tcPr>
+            <w:tcW w:type="dxa" w:w="1461"/>
+          </w:tcPr>
+          <w:p>
+            <w:r>
+              <w:t>0.15556</w:t>
+            </w:r>
+          </w:p>
+        </w:tc>
+      </w:tr>
+      <w:tr>
+        <w:tc>
+          <w:tcPr>
+            <w:tcW w:type="dxa" w:w="1461"/>
+          </w:tcPr>
+          <w:p>
+            <w:r>
+              <w:t>groundball</w:t>
+            </w:r>
+          </w:p>
+        </w:tc>
+        <w:tc>
+          <w:tcPr>
+            <w:tcW w:type="dxa" w:w="1461"/>
+          </w:tcPr>
+          <w:p>
+            <w:r>
+              <w:t>Stuff+</w:t>
+            </w:r>
+          </w:p>
+        </w:tc>
+        <w:tc>
+          <w:tcPr>
+            <w:tcW w:type="dxa" w:w="1461"/>
+          </w:tcPr>
+          <w:p>
+            <w:r>
+              <w:t>19,721</w:t>
+            </w:r>
+          </w:p>
+        </w:tc>
+        <w:tc>
+          <w:tcPr>
+            <w:tcW w:type="dxa" w:w="1461"/>
+          </w:tcPr>
+          <w:p>
+            <w:r>
+              <w:t>0.5000</w:t>
+            </w:r>
+          </w:p>
+        </w:tc>
+        <w:tc>
+          <w:tcPr>
+            <w:tcW w:type="dxa" w:w="1461"/>
+          </w:tcPr>
+          <w:p>
+            <w:r>
+              <w:t>0.6486</w:t>
+            </w:r>
+          </w:p>
+        </w:tc>
+        <w:tc>
+          <w:tcPr>
+            <w:tcW w:type="dxa" w:w="1461"/>
+          </w:tcPr>
+          <w:p>
+            <w:r>
+              <w:t>0.65580</w:t>
+            </w:r>
+          </w:p>
+        </w:tc>
+        <w:tc>
+          <w:tcPr>
+            <w:tcW w:type="dxa" w:w="1461"/>
+          </w:tcPr>
+          <w:p>
+            <w:r>
+              <w:t>0.23182</w:t>
+            </w:r>
+          </w:p>
+        </w:tc>
+      </w:tr>
+      <w:tr>
+        <w:tc>
+          <w:tcPr>
+            <w:tcW w:type="dxa" w:w="1461"/>
+          </w:tcPr>
+          <w:p>
+            <w:r>
+              <w:t>called_strike</w:t>
+            </w:r>
+          </w:p>
+        </w:tc>
+        <w:tc>
+          <w:tcPr>
+            <w:tcW w:type="dxa" w:w="1461"/>
+          </w:tcPr>
+          <w:p>
+            <w:r>
+              <w:t>Location+</w:t>
+            </w:r>
+          </w:p>
+        </w:tc>
+        <w:tc>
+          <w:tcPr>
+            <w:tcW w:type="dxa" w:w="1461"/>
+          </w:tcPr>
+          <w:p>
+            <w:r>
+              <w:t>116,493</w:t>
+            </w:r>
+          </w:p>
+        </w:tc>
+        <w:tc>
+          <w:tcPr>
+            <w:tcW w:type="dxa" w:w="1461"/>
+          </w:tcPr>
+          <w:p>
+            <w:r>
+              <w:t>0.5000</w:t>
+            </w:r>
+          </w:p>
+        </w:tc>
+        <w:tc>
+          <w:tcPr>
+            <w:tcW w:type="dxa" w:w="1461"/>
+          </w:tcPr>
+          <w:p>
+            <w:r>
+              <w:t>0.8790</w:t>
+            </w:r>
+          </w:p>
+        </w:tc>
+        <w:tc>
+          <w:tcPr>
+            <w:tcW w:type="dxa" w:w="1461"/>
+          </w:tcPr>
+          <w:p>
+            <w:r>
+              <w:t>0.28937</w:t>
+            </w:r>
+          </w:p>
+        </w:tc>
+        <w:tc>
+          <w:tcPr>
+            <w:tcW w:type="dxa" w:w="1461"/>
+          </w:tcPr>
+          <w:p>
+            <w:r>
+              <w:t>0.09205</w:t>
+            </w:r>
+          </w:p>
+        </w:tc>
+      </w:tr>
+      <w:tr>
+        <w:tc>
+          <w:tcPr>
+            <w:tcW w:type="dxa" w:w="1461"/>
+          </w:tcPr>
+          <w:p>
+            <w:r>
+              <w:t>chase</w:t>
+            </w:r>
+          </w:p>
+        </w:tc>
+        <w:tc>
+          <w:tcPr>
+            <w:tcW w:type="dxa" w:w="1461"/>
+          </w:tcPr>
+          <w:p>
+            <w:r>
+              <w:t>Location+</w:t>
+            </w:r>
+          </w:p>
+        </w:tc>
+        <w:tc>
+          <w:tcPr>
+            <w:tcW w:type="dxa" w:w="1461"/>
+          </w:tcPr>
+          <w:p>
+            <w:r>
+              <w:t>75,364</w:t>
+            </w:r>
+          </w:p>
+        </w:tc>
+        <w:tc>
+          <w:tcPr>
+            <w:tcW w:type="dxa" w:w="1461"/>
+          </w:tcPr>
+          <w:p>
+            <w:r>
+              <w:t>0.5000</w:t>
+            </w:r>
+          </w:p>
+        </w:tc>
+        <w:tc>
+          <w:tcPr>
+            <w:tcW w:type="dxa" w:w="1461"/>
+          </w:tcPr>
+          <w:p>
+            <w:r>
+              <w:t>0.8419</w:t>
+            </w:r>
+          </w:p>
+        </w:tc>
+        <w:tc>
+          <w:tcPr>
+            <w:tcW w:type="dxa" w:w="1461"/>
+          </w:tcPr>
+          <w:p>
+            <w:r>
+              <w:t>0.45916</w:t>
+            </w:r>
+          </w:p>
+        </w:tc>
+        <w:tc>
+          <w:tcPr>
+            <w:tcW w:type="dxa" w:w="1461"/>
+          </w:tcPr>
+          <w:p>
+            <w:r>
+              <w:t>0.15103</w:t>
+            </w:r>
+          </w:p>
+        </w:tc>
+      </w:tr>
+    </w:tbl>
+    <w:p>
+      <w:pPr/>
+      <w:r>
+        <w:t>whiff_per_pitch mejora de AUC 0.6136 (regresion logistica de 03, mismo split) a 0.7268 con boosting: +0.11 AUC sobre el baseline interpretable ya cerrado, no solo sobre el null. called_strike (0.8790) y chase (0.8419) son el primer Location+ funcional del proyecto; las features dominantes son PlateLocHeight/PlateLocSide y Strikes, exactamente lo que la teoria de zone-based called-strike models predice. En groundball, InducedVertBreak es por mucho la feature mas importante (permutation importance 0.099), consistente con la intuicion fisica de que el break vertical inducido -no solo la velocidad- explica el batazo por el suelo.</w:t>
+      </w:r>
+    </w:p>
+    <w:p>
+      <w:pPr>
+        <w:pStyle w:val="Heading2"/>
+      </w:pPr>
+      <w:r>
+        <w:t>24.4 Limites y siguiente paso</w:t>
+      </w:r>
+    </w:p>
+    <w:p>
+      <w:pPr/>
+      <w:r>
+        <w:t>Esto es Stuff+ y Location+ V1 por separado, todavia sin arsenal, sin altitude_category y sin combinarse en un score Pitching+/Out+ unico. No sustituye el park holdout que pide el criterio de robustez del reto (train sin una categoria de altitud, evaluar en ella); ese holdout sigue pendiente. Siguiente paso: incorporar arsenal (via season-forward, no pitcher holdout) y altitude_category en un modelo combinado, y definir la ponderacion que produce el score Pitching+ final antes de normalizar a escala Stuff+ (100 + 10*z).</w:t>
+      </w:r>
+    </w:p>
+    <w:p>
+      <w:pPr>
+        <w:pStyle w:val="Heading1"/>
+      </w:pPr>
+      <w:r>
+        <w:t>25. Park holdout: robustez ante un entorno de altitud no visto</w:t>
+      </w:r>
+    </w:p>
+    <w:p>
+      <w:pPr/>
+      <w:r>
+        <w:t>Estado: CERRADO. Ejecucion real el 24/09/2026. Entrena en No Altitude + Medium Altitude (447,424 filas), evalua en Extreme Altitude (180,962 filas; 2,704 filas sin categoria valida excluidas). Complementa -no reemplaza- el pitcher holdout de 07_boosting_models.py: aquel prueba generalizacion a PITCHERS no vistos dentro de la misma mezcla de entornos; este prueba generalizacion a un ENTORNO no visto. El 91.3% de los pitchers de test tambien aparece en train, lo cual es correcto y esperado aqui: se aisla la pregunta ambiental, no la de pitcher (esa ya la responde 07).</w:t>
+      </w:r>
+    </w:p>
+    <w:p>
+      <w:pPr>
+        <w:pStyle w:val="Heading2"/>
+      </w:pPr>
+      <w:r>
+        <w:t>25.1 Decision: altitude_category no es feature en esta version</w:t>
+      </w:r>
+    </w:p>
+    <w:p>
+      <w:pPr/>
+      <w:r>
+        <w:t>Decision del equipo, discutida y ratificada el 24/09/2026, por dos razones: (1) entrenar sin Extreme Altitude deja esa categoria enteramente no vista para el codificador categorico en el momento de predecir -un artefacto tecnico de codificacion, no una medida de generalizacion real; (2) incluirla mezclaria dos preguntas distintas: si el modelo generaliza su entendimiento fisico/de ubicacion a un entorno diferente, versus si usar el entorno como insumo explicito ayuda. Esta version responde solo la primera. La segunda pregunta queda para altitude_counterfactual.py (planeado): entrenar CON altitude_category sobre todo el dataset y comparar predicciones al cambiar la categoria, con las demas features fijas.</w:t>
+      </w:r>
+    </w:p>
+    <w:p>
+      <w:pPr/>
+      <w:r>
+        <w:t>Verificacion previa: ninguna otra columna categorica usada (AutoPitchType, PitcherThrows, BatterSide) tiene niveles presentes en Extreme Altitude ausentes del resto; el unico riesgo real de categoria no vista era altitude_category, que es justamente la que se excluye. El script re-verifica esto en tiempo de ejecucion y falla si encuentra alguna.</w:t>
+      </w:r>
+    </w:p>
+    <w:p>
+      <w:pPr>
+        <w:pStyle w:val="Heading2"/>
+      </w:pPr>
+      <w:r>
+        <w:t>25.2 Resultados</w:t>
+      </w:r>
+    </w:p>
+    <w:tbl>
+      <w:tblPr>
+        <w:tblStyle w:val="TableGrid"/>
+        <w:tblW w:type="auto" w:w="0"/>
+        <w:tblLook w:firstColumn="1" w:firstRow="1" w:lastColumn="0" w:lastRow="0" w:noHBand="0" w:noVBand="1" w:val="04A0"/>
+      </w:tblPr>
+      <w:tblGrid>
+        <w:gridCol w:w="2045"/>
+        <w:gridCol w:w="2045"/>
+        <w:gridCol w:w="2045"/>
+        <w:gridCol w:w="2045"/>
+        <w:gridCol w:w="2045"/>
+      </w:tblGrid>
+      <w:tr>
+        <w:tc>
+          <w:tcPr>
+            <w:tcW w:type="dxa" w:w="2045"/>
+          </w:tcPr>
+          <w:p>
+            <w:r>
+              <w:t>Target</w:t>
+            </w:r>
+          </w:p>
+        </w:tc>
+        <w:tc>
+          <w:tcPr>
+            <w:tcW w:type="dxa" w:w="2045"/>
+          </w:tcPr>
+          <w:p>
+            <w:r>
+              <w:t>AUC pitcher holdout (07)</w:t>
+            </w:r>
+          </w:p>
+        </w:tc>
+        <w:tc>
+          <w:tcPr>
+            <w:tcW w:type="dxa" w:w="2045"/>
+          </w:tcPr>
+          <w:p>
+            <w:r>
+              <w:t>AUC park holdout (08)</w:t>
+            </w:r>
+          </w:p>
+        </w:tc>
+        <w:tc>
+          <w:tcPr>
+            <w:tcW w:type="dxa" w:w="2045"/>
+          </w:tcPr>
+          <w:p>
+            <w:r>
+              <w:t>Delta</w:t>
+            </w:r>
+          </w:p>
+        </w:tc>
+        <w:tc>
+          <w:tcPr>
+            <w:tcW w:type="dxa" w:w="2045"/>
+          </w:tcPr>
+          <w:p>
+            <w:r>
+              <w:t>n test (park)</w:t>
+            </w:r>
+          </w:p>
+        </w:tc>
+      </w:tr>
+      <w:tr>
+        <w:tc>
+          <w:tcPr>
+            <w:tcW w:type="dxa" w:w="2045"/>
+          </w:tcPr>
+          <w:p>
+            <w:r>
+              <w:t>whiff_per_pitch</w:t>
+            </w:r>
+          </w:p>
+        </w:tc>
+        <w:tc>
+          <w:tcPr>
+            <w:tcW w:type="dxa" w:w="2045"/>
+          </w:tcPr>
+          <w:p>
+            <w:r>
+              <w:t>0.7268</w:t>
+            </w:r>
+          </w:p>
+        </w:tc>
+        <w:tc>
+          <w:tcPr>
+            <w:tcW w:type="dxa" w:w="2045"/>
+          </w:tcPr>
+          <w:p>
+            <w:r>
+              <w:t>0.7270</w:t>
+            </w:r>
+          </w:p>
+        </w:tc>
+        <w:tc>
+          <w:tcPr>
+            <w:tcW w:type="dxa" w:w="2045"/>
+          </w:tcPr>
+          <w:p>
+            <w:r>
+              <w:t>+0.0003</w:t>
+            </w:r>
+          </w:p>
+        </w:tc>
+        <w:tc>
+          <w:tcPr>
+            <w:tcW w:type="dxa" w:w="2045"/>
+          </w:tcPr>
+          <w:p>
+            <w:r>
+              <w:t>180,962</w:t>
+            </w:r>
+          </w:p>
+        </w:tc>
+      </w:tr>
+      <w:tr>
+        <w:tc>
+          <w:tcPr>
+            <w:tcW w:type="dxa" w:w="2045"/>
+          </w:tcPr>
+          <w:p>
+            <w:r>
+              <w:t>whiff_given_swing</w:t>
+            </w:r>
+          </w:p>
+        </w:tc>
+        <w:tc>
+          <w:tcPr>
+            <w:tcW w:type="dxa" w:w="2045"/>
+          </w:tcPr>
+          <w:p>
+            <w:r>
+              <w:t>0.7330</w:t>
+            </w:r>
+          </w:p>
+        </w:tc>
+        <w:tc>
+          <w:tcPr>
+            <w:tcW w:type="dxa" w:w="2045"/>
+          </w:tcPr>
+          <w:p>
+            <w:r>
+              <w:t>0.7327</w:t>
+            </w:r>
+          </w:p>
+        </w:tc>
+        <w:tc>
+          <w:tcPr>
+            <w:tcW w:type="dxa" w:w="2045"/>
+          </w:tcPr>
+          <w:p>
+            <w:r>
+              <w:t>-0.0003</w:t>
+            </w:r>
+          </w:p>
+        </w:tc>
+        <w:tc>
+          <w:tcPr>
+            <w:tcW w:type="dxa" w:w="2045"/>
+          </w:tcPr>
+          <w:p>
+            <w:r>
+              <w:t>84,534</w:t>
+            </w:r>
+          </w:p>
+        </w:tc>
+      </w:tr>
+      <w:tr>
+        <w:tc>
+          <w:tcPr>
+            <w:tcW w:type="dxa" w:w="2045"/>
+          </w:tcPr>
+          <w:p>
+            <w:r>
+              <w:t>groundball</w:t>
+            </w:r>
+          </w:p>
+        </w:tc>
+        <w:tc>
+          <w:tcPr>
+            <w:tcW w:type="dxa" w:w="2045"/>
+          </w:tcPr>
+          <w:p>
+            <w:r>
+              <w:t>0.6486</w:t>
+            </w:r>
+          </w:p>
+        </w:tc>
+        <w:tc>
+          <w:tcPr>
+            <w:tcW w:type="dxa" w:w="2045"/>
+          </w:tcPr>
+          <w:p>
+            <w:r>
+              <w:t>0.6403</w:t>
+            </w:r>
+          </w:p>
+        </w:tc>
+        <w:tc>
+          <w:tcPr>
+            <w:tcW w:type="dxa" w:w="2045"/>
+          </w:tcPr>
+          <w:p>
+            <w:r>
+              <w:t>-0.0083</w:t>
+            </w:r>
+          </w:p>
+        </w:tc>
+        <w:tc>
+          <w:tcPr>
+            <w:tcW w:type="dxa" w:w="2045"/>
+          </w:tcPr>
+          <w:p>
+            <w:r>
+              <w:t>32,087</w:t>
+            </w:r>
+          </w:p>
+        </w:tc>
+      </w:tr>
+      <w:tr>
+        <w:tc>
+          <w:tcPr>
+            <w:tcW w:type="dxa" w:w="2045"/>
+          </w:tcPr>
+          <w:p>
+            <w:r>
+              <w:t>called_strike</w:t>
+            </w:r>
+          </w:p>
+        </w:tc>
+        <w:tc>
+          <w:tcPr>
+            <w:tcW w:type="dxa" w:w="2045"/>
+          </w:tcPr>
+          <w:p>
+            <w:r>
+              <w:t>0.8790</w:t>
+            </w:r>
+          </w:p>
+        </w:tc>
+        <w:tc>
+          <w:tcPr>
+            <w:tcW w:type="dxa" w:w="2045"/>
+          </w:tcPr>
+          <w:p>
+            <w:r>
+              <w:t>0.8778</w:t>
+            </w:r>
+          </w:p>
+        </w:tc>
+        <w:tc>
+          <w:tcPr>
+            <w:tcW w:type="dxa" w:w="2045"/>
+          </w:tcPr>
+          <w:p>
+            <w:r>
+              <w:t>-0.0012</w:t>
+            </w:r>
+          </w:p>
+        </w:tc>
+        <w:tc>
+          <w:tcPr>
+            <w:tcW w:type="dxa" w:w="2045"/>
+          </w:tcPr>
+          <w:p>
+            <w:r>
+              <w:t>180,962</w:t>
+            </w:r>
+          </w:p>
+        </w:tc>
+      </w:tr>
+      <w:tr>
+        <w:tc>
+          <w:tcPr>
+            <w:tcW w:type="dxa" w:w="2045"/>
+          </w:tcPr>
+          <w:p>
+            <w:r>
+              <w:t>chase</w:t>
+            </w:r>
+          </w:p>
+        </w:tc>
+        <w:tc>
+          <w:tcPr>
+            <w:tcW w:type="dxa" w:w="2045"/>
+          </w:tcPr>
+          <w:p>
+            <w:r>
+              <w:t>0.8419</w:t>
+            </w:r>
+          </w:p>
+        </w:tc>
+        <w:tc>
+          <w:tcPr>
+            <w:tcW w:type="dxa" w:w="2045"/>
+          </w:tcPr>
+          <w:p>
+            <w:r>
+              <w:t>0.8397</w:t>
+            </w:r>
+          </w:p>
+        </w:tc>
+        <w:tc>
+          <w:tcPr>
+            <w:tcW w:type="dxa" w:w="2045"/>
+          </w:tcPr>
+          <w:p>
+            <w:r>
+              <w:t>-0.0023</w:t>
+            </w:r>
+          </w:p>
+        </w:tc>
+        <w:tc>
+          <w:tcPr>
+            <w:tcW w:type="dxa" w:w="2045"/>
+          </w:tcPr>
+          <w:p>
+            <w:r>
+              <w:t>117,666</w:t>
+            </w:r>
+          </w:p>
+        </w:tc>
+      </w:tr>
+    </w:tbl>
+    <w:p>
+      <w:pPr/>
+      <w:r>
+        <w:t>El AUC bajo park holdout es practicamente identico al pitcher holdout en los cinco targets (deltas entre -0.0083 y +0.0003). Log Loss y Brier tambien se mantienen en rangos comparables. Esto es evidencia real de robustez ambiental: el boosting V1 discrimina pitches buenos de malos en Extreme Altitude tan bien como en pitchers nunca vistos dentro de la mezcla habitual de entornos, sin que el modelo sepa en que entorno esta.</w:t>
+      </w:r>
+    </w:p>
+    <w:p>
+      <w:pPr>
+        <w:pStyle w:val="Heading2"/>
+      </w:pPr>
+      <w:r>
+        <w:t>25.3 Interpretacion: por que generaliza tan bien</w:t>
+      </w:r>
+    </w:p>
+    <w:p>
+      <w:pPr/>
+      <w:r>
+        <w:t>Hipotesis de trabajo, no probada de forma causal: las features fisicas usadas (InducedVertBreak, HorzBreak, etc.) son movimiento OBSERVADO del tracking, no spin teorico. Es decir, ya incorporan el efecto fisico real de la altitud sobre cada pitch medido -un Four-Seam con 13 pulgadas de IVB en Extreme Altitude y uno con 13 pulgadas de IVB en No Altitude son, para el modelo, la misma entrada, y aparentemente producen outcomes similares. Lo que el modelo aprende es la relacion movimiento observado -&gt; outcome, que parece estable entre entornos, no la relacion spin/velocidad -&gt; outcome (que si dependeria del entorno via el efecto Magnus). Esto es evidencia adicional, independiente de la de la seccion 12, a favor de H4 ('shape over label'): el pipeline ya prioriza IVB/HB observados sobre SpinRate crudo, y este resultado sugiere que esa decision es parte de por que el modelo transfiere bien entre entornos.</w:t>
+      </w:r>
+    </w:p>
+    <w:p>
+      <w:pPr/>
+      <w:r>
+        <w:t>Importante: esto NO implica que la altitud no afecte los outcomes. La EDA (seccion 12) ya establecio que la distribucion de IVB/HB si cambia con la altitud -eso es H1-. Lo que este resultado agrega es que la relacion aprendida entre esas features observadas y el outcome se mantiene estable entre entornos; el modelo no necesita saber la altitud porque el efecto de la altitud ya quedo capturado dentro de las features fisicas que sí mide directamente.</w:t>
+      </w:r>
+    </w:p>
+    <w:p>
+      <w:pPr>
+        <w:pStyle w:val="Heading2"/>
+      </w:pPr>
+      <w:r>
+        <w:t>25.4 Limites y siguiente paso</w:t>
+      </w:r>
+    </w:p>
+    <w:p>
+      <w:pPr/>
+      <w:r>
+        <w:t>AUC mide discriminacion (orden relativo), no calibracion absoluta perfecta; no se corrio aqui una prueba de calibracion dedicada (reliability curve) por entorno. No sustituye el contrafactual de altitud planeado, que responde una pregunta distinta y complementaria: cuanto cambia la prediccion del MISMO pitch fisico si se le asigna una categoria de altitud distinta, cuando el modelo si usa altitude_category como insumo explicito.</w:t>
       </w:r>
     </w:p>
     <w:sectPr>

</xml_diff>

<commit_message>
Agrega Pitching+/Stuff+ V1, contrafactual de altitud, efecto total y V2 de pesos
- 09: Pitching+/Out+ combinado (5 componentes, z-score, pesos iguales) y escala Stuff+ 100+10z
- 10: contrafactual de altitud (efecto directo, ~0)
- 11: efecto total con transformacion fisica conjunta y bootstrap por pitcher
- 12-14: V2 como sensibilidad (valor por conteo, pesos aprendidos, matriz V1 vs V2 y niveles de evidencia)
- Guia (secciones 26-29), bitacora y README actualizados

Co-Authored-By: Claude Sonnet 5 <noreply@anthropic.com>
</commit_message>
<xml_diff>
--- a/ISAC_Diablos_Rojos_Guia_Base_Modelado.docx
+++ b/ISAC_Diablos_Rojos_Guia_Base_Modelado.docx
@@ -11118,6 +11118,2819 @@
       <w:pPr/>
       <w:r>
         <w:t>AUC mide discriminacion (orden relativo), no calibracion absoluta perfecta; no se corrio aqui una prueba de calibracion dedicada (reliability curve) por entorno. No sustituye el contrafactual de altitud planeado, que responde una pregunta distinta y complementaria: cuanto cambia la prediccion del MISMO pitch fisico si se le asigna una categoria de altitud distinta, cuando el modelo si usa altitude_category como insumo explicito.</w:t>
+      </w:r>
+    </w:p>
+    <w:p>
+      <w:pPr>
+        <w:pStyle w:val="Heading1"/>
+      </w:pPr>
+      <w:r>
+        <w:t>26. Pitching+/Out+ V1 y escala Stuff+</w:t>
+      </w:r>
+    </w:p>
+    <w:p>
+      <w:pPr/>
+      <w:r>
+        <w:t>Estado: CERRADO (V1, pesos iguales). Ejecucion real el 24/09/2026, dos ventanas season-forward (2024-&gt;2025, 2024-2025-&gt;2026); la segunda es la ventana primaria para uso posterior (contrafactual de altitud). A diferencia de 07/08 (Stuff+ puro y Location+ puro, para medir robustez de cada capa por separado), aqui las cinco sub-senales comparten el mismo conjunto de features completo: fisicas + ubicacion + arsenal historico (fold-safe) + altitude_category + Balls/Strikes + BatterSide. Esta es la capa que el brief llama Pitching+/Out+: 'combinacion final de stuff + ubicacion + arsenal + contexto'.</w:t>
+      </w:r>
+    </w:p>
+    <w:p>
+      <w:pPr>
+        <w:pStyle w:val="Heading2"/>
+      </w:pPr>
+      <w:r>
+        <w:t>26.1 Problema resuelto antes de combinar: poblaciones mutuamente excluyentes</w:t>
+      </w:r>
+    </w:p>
+    <w:p>
+      <w:pPr/>
+      <w:r>
+        <w:t>whiff_given_swing, chase y groundball tienen poblaciones elegibles mutuamente excluyentes por fila (is_swing==1, outside_strike_zone==1, is_ball_in_play==1 respectivamente). Un promedio literal de las cinco probabilidades por fila esta indefinido para casi todos los pitches si nos limitamos a la poblacion observada de cada target: la mayoria de las filas no cumple simultaneamente las cinco condiciones.</w:t>
+      </w:r>
+    </w:p>
+    <w:p>
+      <w:pPr/>
+      <w:r>
+        <w:t>Resolucion adoptada: cada sub-modelo se ENTRENA sobre su propia poblacion condicional (igual que en 07/08, para aprender la probabilidad condicional correcta: P(whiff|swing), P(chase|fuera de zona), P(groundball|BIP)), pero para ANOTAR el score se aplica el modelo ya entrenado a TODO pitch de la poblacion comun elegible (arsenal completo + altitude_category valida), sin importar si ese pitch especifico fue swing/BIP/etc. Es la pregunta contrafactual estandar ('si hubiera swing, que tan probable seria el whiff') y es exactamente lo que un modelo entrenado sobre esa poblacion permite responder para cualquier fila que tenga las features necesarias, haya ocurrido o no ese evento en la fila original.</w:t>
+      </w:r>
+    </w:p>
+    <w:p>
+      <w:pPr>
+        <w:pStyle w:val="Heading2"/>
+      </w:pPr>
+      <w:r>
+        <w:t>26.2 Decision de ponderacion (24/09/2026)</w:t>
+      </w:r>
+    </w:p>
+    <w:p>
+      <w:pPr/>
+      <w:r>
+        <w:t>Se descartaron dos alternativas antes de adoptar la V1. Pesos de valor de carrera fijos (estilo The Book): descartados porque esos pesos estan pensados para eventos con valor de carrera bien definido, y no existe una traduccion limpia hacia estas cinco probabilidades, que ademas tienen poblaciones elegibles distintas; adoptarlos daria una falsa sensacion de rigor. Pesos aprendidos por regresion contra un proxy de valor observado: descartados por ahora porque requieren definir correctamente un valor observado por pitch y su poblacion elegible, y eso reabre exactamente el problema de PA-terminal que ya bloqueo xRunValue en 05_target_definitions.py; no debia bloquear este primer Pitching+.</w:t>
+      </w:r>
+    </w:p>
+    <w:p>
+      <w:pPr/>
+      <w:r>
+        <w:t>V1 adoptado: estandarizar cada probabilidad predicha (z-score) contra su propia media y desviacion estandar en TRAIN unicamente (nunca en test/eval, para no filtrar la referencia 'liga promedio' con datos de evaluacion), y promediar los cinco z-scores con pesos iguales. Las cinco probabilidades ya estan orientadas 'mayor = mejor para el pitcher' sin necesidad de invertir signos: whiff, whiff dado swing, called strike y chase son buenos para el pitcher cuando son altos, y groundball tambien lo es bajo la logica del reto (H3: groundballs mas valiosos en altitud). Se guardan los cinco componentes (probabilidad y z-score) por separado, ademas del score combinado, en 09_pitching_plus_scores.csv.</w:t>
+      </w:r>
+    </w:p>
+    <w:p>
+      <w:pPr/>
+      <w:r>
+        <w:t>Pendiente explicito para V2, no resuelto en esta version: analisis de sensibilidad de pesos (que tanto cambia el ranking si se reponderan los componentes) y una version con pesos aprendidos contra valor de carrera, una vez exista una definicion reproducible de xRunValue o run expectancy por conteo.</w:t>
+      </w:r>
+    </w:p>
+    <w:p>
+      <w:pPr>
+        <w:pStyle w:val="Heading2"/>
+      </w:pPr>
+      <w:r>
+        <w:t>26.3 Escala Stuff+</w:t>
+      </w:r>
+    </w:p>
+    <w:p>
+      <w:pPr/>
+      <w:r>
+        <w:t>Siguiendo la definicion formal del brief (Stuff+ = 100 + 10 x z(score_pitch)), se estandariza el promedio de z-scores (Pitching+/Out+ crudo) una vez mas contra su propia media y desviacion estandar en train, y se escala a 100 + 10z. En la ventana primaria (2024-2025 -&gt; 2026), el Stuff+ resultante sobre la evaluacion futura tiene media 100.28 y desviacion estandar 10.01 -practicamente identico al diseno teorico de la escala-, con rango 72.0 a 138.6.</w:t>
+      </w:r>
+    </w:p>
+    <w:p>
+      <w:pPr>
+        <w:pStyle w:val="Heading2"/>
+      </w:pPr>
+      <w:r>
+        <w:t>26.4 Resultados por componente: full feature set vs capas puras</w:t>
+      </w:r>
+    </w:p>
+    <w:tbl>
+      <w:tblPr>
+        <w:tblStyle w:val="TableGrid"/>
+        <w:tblW w:type="auto" w:w="0"/>
+        <w:tblLook w:firstColumn="1" w:firstRow="1" w:lastColumn="0" w:lastRow="0" w:noHBand="0" w:noVBand="1" w:val="04A0"/>
+      </w:tblPr>
+      <w:tblGrid>
+        <w:gridCol w:w="2556"/>
+        <w:gridCol w:w="2556"/>
+        <w:gridCol w:w="2556"/>
+        <w:gridCol w:w="2556"/>
+      </w:tblGrid>
+      <w:tr>
+        <w:tc>
+          <w:tcPr>
+            <w:tcW w:type="dxa" w:w="2556"/>
+          </w:tcPr>
+          <w:p>
+            <w:r>
+              <w:t>Componente</w:t>
+            </w:r>
+          </w:p>
+        </w:tc>
+        <w:tc>
+          <w:tcPr>
+            <w:tcW w:type="dxa" w:w="2556"/>
+          </w:tcPr>
+          <w:p>
+            <w:r>
+              <w:t>AUC Stuff/Location puro (07)</w:t>
+            </w:r>
+          </w:p>
+        </w:tc>
+        <w:tc>
+          <w:tcPr>
+            <w:tcW w:type="dxa" w:w="2556"/>
+          </w:tcPr>
+          <w:p>
+            <w:r>
+              <w:t>AUC full (09, 2024→25)</w:t>
+            </w:r>
+          </w:p>
+        </w:tc>
+        <w:tc>
+          <w:tcPr>
+            <w:tcW w:type="dxa" w:w="2556"/>
+          </w:tcPr>
+          <w:p>
+            <w:r>
+              <w:t>AUC full (09, 2024-25→26)</w:t>
+            </w:r>
+          </w:p>
+        </w:tc>
+      </w:tr>
+      <w:tr>
+        <w:tc>
+          <w:tcPr>
+            <w:tcW w:type="dxa" w:w="2556"/>
+          </w:tcPr>
+          <w:p>
+            <w:r>
+              <w:t>whiff_per_pitch</w:t>
+            </w:r>
+          </w:p>
+        </w:tc>
+        <w:tc>
+          <w:tcPr>
+            <w:tcW w:type="dxa" w:w="2556"/>
+          </w:tcPr>
+          <w:p>
+            <w:r>
+              <w:t>0.7268</w:t>
+            </w:r>
+          </w:p>
+        </w:tc>
+        <w:tc>
+          <w:tcPr>
+            <w:tcW w:type="dxa" w:w="2556"/>
+          </w:tcPr>
+          <w:p>
+            <w:r>
+              <w:t>0.7531</w:t>
+            </w:r>
+          </w:p>
+        </w:tc>
+        <w:tc>
+          <w:tcPr>
+            <w:tcW w:type="dxa" w:w="2556"/>
+          </w:tcPr>
+          <w:p>
+            <w:r>
+              <w:t>0.7531</w:t>
+            </w:r>
+          </w:p>
+        </w:tc>
+      </w:tr>
+      <w:tr>
+        <w:tc>
+          <w:tcPr>
+            <w:tcW w:type="dxa" w:w="2556"/>
+          </w:tcPr>
+          <w:p>
+            <w:r>
+              <w:t>whiff_given_swing</w:t>
+            </w:r>
+          </w:p>
+        </w:tc>
+        <w:tc>
+          <w:tcPr>
+            <w:tcW w:type="dxa" w:w="2556"/>
+          </w:tcPr>
+          <w:p>
+            <w:r>
+              <w:t>0.7330</w:t>
+            </w:r>
+          </w:p>
+        </w:tc>
+        <w:tc>
+          <w:tcPr>
+            <w:tcW w:type="dxa" w:w="2556"/>
+          </w:tcPr>
+          <w:p>
+            <w:r>
+              <w:t>0.7575</w:t>
+            </w:r>
+          </w:p>
+        </w:tc>
+        <w:tc>
+          <w:tcPr>
+            <w:tcW w:type="dxa" w:w="2556"/>
+          </w:tcPr>
+          <w:p>
+            <w:r>
+              <w:t>0.7590</w:t>
+            </w:r>
+          </w:p>
+        </w:tc>
+      </w:tr>
+      <w:tr>
+        <w:tc>
+          <w:tcPr>
+            <w:tcW w:type="dxa" w:w="2556"/>
+          </w:tcPr>
+          <w:p>
+            <w:r>
+              <w:t>groundball</w:t>
+            </w:r>
+          </w:p>
+        </w:tc>
+        <w:tc>
+          <w:tcPr>
+            <w:tcW w:type="dxa" w:w="2556"/>
+          </w:tcPr>
+          <w:p>
+            <w:r>
+              <w:t>0.6486</w:t>
+            </w:r>
+          </w:p>
+        </w:tc>
+        <w:tc>
+          <w:tcPr>
+            <w:tcW w:type="dxa" w:w="2556"/>
+          </w:tcPr>
+          <w:p>
+            <w:r>
+              <w:t>0.6531</w:t>
+            </w:r>
+          </w:p>
+        </w:tc>
+        <w:tc>
+          <w:tcPr>
+            <w:tcW w:type="dxa" w:w="2556"/>
+          </w:tcPr>
+          <w:p>
+            <w:r>
+              <w:t>0.6664</w:t>
+            </w:r>
+          </w:p>
+        </w:tc>
+      </w:tr>
+      <w:tr>
+        <w:tc>
+          <w:tcPr>
+            <w:tcW w:type="dxa" w:w="2556"/>
+          </w:tcPr>
+          <w:p>
+            <w:r>
+              <w:t>called_strike</w:t>
+            </w:r>
+          </w:p>
+        </w:tc>
+        <w:tc>
+          <w:tcPr>
+            <w:tcW w:type="dxa" w:w="2556"/>
+          </w:tcPr>
+          <w:p>
+            <w:r>
+              <w:t>0.8790</w:t>
+            </w:r>
+          </w:p>
+        </w:tc>
+        <w:tc>
+          <w:tcPr>
+            <w:tcW w:type="dxa" w:w="2556"/>
+          </w:tcPr>
+          <w:p>
+            <w:r>
+              <w:t>0.8820</w:t>
+            </w:r>
+          </w:p>
+        </w:tc>
+        <w:tc>
+          <w:tcPr>
+            <w:tcW w:type="dxa" w:w="2556"/>
+          </w:tcPr>
+          <w:p>
+            <w:r>
+              <w:t>0.8780</w:t>
+            </w:r>
+          </w:p>
+        </w:tc>
+      </w:tr>
+      <w:tr>
+        <w:tc>
+          <w:tcPr>
+            <w:tcW w:type="dxa" w:w="2556"/>
+          </w:tcPr>
+          <w:p>
+            <w:r>
+              <w:t>chase</w:t>
+            </w:r>
+          </w:p>
+        </w:tc>
+        <w:tc>
+          <w:tcPr>
+            <w:tcW w:type="dxa" w:w="2556"/>
+          </w:tcPr>
+          <w:p>
+            <w:r>
+              <w:t>0.8419</w:t>
+            </w:r>
+          </w:p>
+        </w:tc>
+        <w:tc>
+          <w:tcPr>
+            <w:tcW w:type="dxa" w:w="2556"/>
+          </w:tcPr>
+          <w:p>
+            <w:r>
+              <w:t>0.8460</w:t>
+            </w:r>
+          </w:p>
+        </w:tc>
+        <w:tc>
+          <w:tcPr>
+            <w:tcW w:type="dxa" w:w="2556"/>
+          </w:tcPr>
+          <w:p>
+            <w:r>
+              <w:t>0.8529</w:t>
+            </w:r>
+          </w:p>
+        </w:tc>
+      </w:tr>
+    </w:tbl>
+    <w:p>
+      <w:pPr/>
+      <w:r>
+        <w:t>Agregar arsenal + ubicacion + altitud + contexto en un mismo modelo mejora cada componente sobre su version pura (Stuff+ o Location+ aislados) de 07/08, de forma consistente en las dos ventanas. La mejora es mas notoria en whiff_per_pitch y whiff_given_swing (+0.025 a +0.026 AUC) y mas modesta en called_strike (que ya partia de un AUC muy alto con solo ubicacion). Esta es evidencia directa, con datos reales de LMB, de que los features relacionales de arsenal y el contexto ambiental aportan valor incremental sobre las capas Stuff+/Location+ puras -el nucleo del criterio de integracion arsenal+altitud del reto.</w:t>
+      </w:r>
+    </w:p>
+    <w:p>
+      <w:pPr>
+        <w:pStyle w:val="Heading2"/>
+      </w:pPr>
+      <w:r>
+        <w:t>26.5 Sanity check por pitch type</w:t>
+      </w:r>
+    </w:p>
+    <w:tbl>
+      <w:tblPr>
+        <w:tblStyle w:val="TableGrid"/>
+        <w:tblW w:type="auto" w:w="0"/>
+        <w:tblLook w:firstColumn="1" w:firstRow="1" w:lastColumn="0" w:lastRow="0" w:noHBand="0" w:noVBand="1" w:val="04A0"/>
+      </w:tblPr>
+      <w:tblGrid>
+        <w:gridCol w:w="3408"/>
+        <w:gridCol w:w="3408"/>
+        <w:gridCol w:w="3408"/>
+      </w:tblGrid>
+      <w:tr>
+        <w:tc>
+          <w:tcPr>
+            <w:tcW w:type="dxa" w:w="3408"/>
+          </w:tcPr>
+          <w:p>
+            <w:r>
+              <w:t>Pitch type</w:t>
+            </w:r>
+          </w:p>
+        </w:tc>
+        <w:tc>
+          <w:tcPr>
+            <w:tcW w:type="dxa" w:w="3408"/>
+          </w:tcPr>
+          <w:p>
+            <w:r>
+              <w:t>Stuff+ medio (2024→25)</w:t>
+            </w:r>
+          </w:p>
+        </w:tc>
+        <w:tc>
+          <w:tcPr>
+            <w:tcW w:type="dxa" w:w="3408"/>
+          </w:tcPr>
+          <w:p>
+            <w:r>
+              <w:t>Stuff+ medio (2024-25→26)</w:t>
+            </w:r>
+          </w:p>
+        </w:tc>
+      </w:tr>
+      <w:tr>
+        <w:tc>
+          <w:tcPr>
+            <w:tcW w:type="dxa" w:w="3408"/>
+          </w:tcPr>
+          <w:p>
+            <w:r>
+              <w:t>Splitter</w:t>
+            </w:r>
+          </w:p>
+        </w:tc>
+        <w:tc>
+          <w:tcPr>
+            <w:tcW w:type="dxa" w:w="3408"/>
+          </w:tcPr>
+          <w:p>
+            <w:r>
+              <w:t>107.15</w:t>
+            </w:r>
+          </w:p>
+        </w:tc>
+        <w:tc>
+          <w:tcPr>
+            <w:tcW w:type="dxa" w:w="3408"/>
+          </w:tcPr>
+          <w:p>
+            <w:r>
+              <w:t>106.26</w:t>
+            </w:r>
+          </w:p>
+        </w:tc>
+      </w:tr>
+      <w:tr>
+        <w:tc>
+          <w:tcPr>
+            <w:tcW w:type="dxa" w:w="3408"/>
+          </w:tcPr>
+          <w:p>
+            <w:r>
+              <w:t>Slider</w:t>
+            </w:r>
+          </w:p>
+        </w:tc>
+        <w:tc>
+          <w:tcPr>
+            <w:tcW w:type="dxa" w:w="3408"/>
+          </w:tcPr>
+          <w:p>
+            <w:r>
+              <w:t>105.07</w:t>
+            </w:r>
+          </w:p>
+        </w:tc>
+        <w:tc>
+          <w:tcPr>
+            <w:tcW w:type="dxa" w:w="3408"/>
+          </w:tcPr>
+          <w:p>
+            <w:r>
+              <w:t>105.24</w:t>
+            </w:r>
+          </w:p>
+        </w:tc>
+      </w:tr>
+      <w:tr>
+        <w:tc>
+          <w:tcPr>
+            <w:tcW w:type="dxa" w:w="3408"/>
+          </w:tcPr>
+          <w:p>
+            <w:r>
+              <w:t>Curveball</w:t>
+            </w:r>
+          </w:p>
+        </w:tc>
+        <w:tc>
+          <w:tcPr>
+            <w:tcW w:type="dxa" w:w="3408"/>
+          </w:tcPr>
+          <w:p>
+            <w:r>
+              <w:t>104.01</w:t>
+            </w:r>
+          </w:p>
+        </w:tc>
+        <w:tc>
+          <w:tcPr>
+            <w:tcW w:type="dxa" w:w="3408"/>
+          </w:tcPr>
+          <w:p>
+            <w:r>
+              <w:t>104.31</w:t>
+            </w:r>
+          </w:p>
+        </w:tc>
+      </w:tr>
+      <w:tr>
+        <w:tc>
+          <w:tcPr>
+            <w:tcW w:type="dxa" w:w="3408"/>
+          </w:tcPr>
+          <w:p>
+            <w:r>
+              <w:t>Changeup</w:t>
+            </w:r>
+          </w:p>
+        </w:tc>
+        <w:tc>
+          <w:tcPr>
+            <w:tcW w:type="dxa" w:w="3408"/>
+          </w:tcPr>
+          <w:p>
+            <w:r>
+              <w:t>103.13</w:t>
+            </w:r>
+          </w:p>
+        </w:tc>
+        <w:tc>
+          <w:tcPr>
+            <w:tcW w:type="dxa" w:w="3408"/>
+          </w:tcPr>
+          <w:p>
+            <w:r>
+              <w:t>103.55</w:t>
+            </w:r>
+          </w:p>
+        </w:tc>
+      </w:tr>
+      <w:tr>
+        <w:tc>
+          <w:tcPr>
+            <w:tcW w:type="dxa" w:w="3408"/>
+          </w:tcPr>
+          <w:p>
+            <w:r>
+              <w:t>Cutter</w:t>
+            </w:r>
+          </w:p>
+        </w:tc>
+        <w:tc>
+          <w:tcPr>
+            <w:tcW w:type="dxa" w:w="3408"/>
+          </w:tcPr>
+          <w:p>
+            <w:r>
+              <w:t>100.55</w:t>
+            </w:r>
+          </w:p>
+        </w:tc>
+        <w:tc>
+          <w:tcPr>
+            <w:tcW w:type="dxa" w:w="3408"/>
+          </w:tcPr>
+          <w:p>
+            <w:r>
+              <w:t>101.06</w:t>
+            </w:r>
+          </w:p>
+        </w:tc>
+      </w:tr>
+      <w:tr>
+        <w:tc>
+          <w:tcPr>
+            <w:tcW w:type="dxa" w:w="3408"/>
+          </w:tcPr>
+          <w:p>
+            <w:r>
+              <w:t>Sinker</w:t>
+            </w:r>
+          </w:p>
+        </w:tc>
+        <w:tc>
+          <w:tcPr>
+            <w:tcW w:type="dxa" w:w="3408"/>
+          </w:tcPr>
+          <w:p>
+            <w:r>
+              <w:t>98.20</w:t>
+            </w:r>
+          </w:p>
+        </w:tc>
+        <w:tc>
+          <w:tcPr>
+            <w:tcW w:type="dxa" w:w="3408"/>
+          </w:tcPr>
+          <w:p>
+            <w:r>
+              <w:t>98.21</w:t>
+            </w:r>
+          </w:p>
+        </w:tc>
+      </w:tr>
+      <w:tr>
+        <w:tc>
+          <w:tcPr>
+            <w:tcW w:type="dxa" w:w="3408"/>
+          </w:tcPr>
+          <w:p>
+            <w:r>
+              <w:t>Four-Seam</w:t>
+            </w:r>
+          </w:p>
+        </w:tc>
+        <w:tc>
+          <w:tcPr>
+            <w:tcW w:type="dxa" w:w="3408"/>
+          </w:tcPr>
+          <w:p>
+            <w:r>
+              <w:t>95.64</w:t>
+            </w:r>
+          </w:p>
+        </w:tc>
+        <w:tc>
+          <w:tcPr>
+            <w:tcW w:type="dxa" w:w="3408"/>
+          </w:tcPr>
+          <w:p>
+            <w:r>
+              <w:t>95.31</w:t>
+            </w:r>
+          </w:p>
+        </w:tc>
+      </w:tr>
+    </w:tbl>
+    <w:p>
+      <w:pPr/>
+      <w:r>
+        <w:t>El orden reproduce exactamente el de 03_stuff_baseline.py (whiff rate real: Splitter, Slider, Curveball, Changeup por encima de Four-Seam y Sinker). No prueba que el score sea correcto en magnitud, pero es una verificacion de coherencia fuerte: el compuesto no esta produciendo un ranking arbitrario.</w:t>
+      </w:r>
+    </w:p>
+    <w:p>
+      <w:pPr>
+        <w:pStyle w:val="Heading2"/>
+      </w:pPr>
+      <w:r>
+        <w:t>26.6 Limites y siguiente paso</w:t>
+      </w:r>
+    </w:p>
+    <w:p>
+      <w:pPr/>
+      <w:r>
+        <w:t>Cobertura: el score solo se calcula sobre la poblacion con arsenal completo y altitude_category valida (aproximadamente 66-96% segun la ventana, ver 06/04); no hay fallback ni imputacion, consistente con el resto del proyecto. Pesos iguales son una simplificacion V1 explicita, no una afirmacion de que las cinco dimensiones pesan lo mismo en valor de carrera real. 09_pitching_plus_scores.csv ya incluye altitude_category, pitcher_anon_id y year por fila: es el insumo directo para el contrafactual de altitud (planeado, siguiente paso), que respondera cuanto cambia el Stuff+ del MISMO pitch al cambiar unicamente su categoria de altitud, con el modelo ya entrenado aqui.</w:t>
+      </w:r>
+    </w:p>
+    <w:p>
+      <w:pPr>
+        <w:pStyle w:val="Heading1"/>
+      </w:pPr>
+      <w:r>
+        <w:t>27. Contrafactual de altitud V1 (efecto directo)</w:t>
+      </w:r>
+    </w:p>
+    <w:p>
+      <w:pPr/>
+      <w:r>
+        <w:t>Estado: CERRADO como V1 de efecto directo; el entregable de altitud sigue INCOMPLETO. Ejecucion real el 24/09/2026 con los modelos exactos de 09 (10_altitude_counterfactual.py carga 09_pitching_plus_bundle.pkl; reproduce los scores de 09 con diferencia maxima 2.8e-14).</w:t>
+      </w:r>
+    </w:p>
+    <w:p>
+      <w:pPr>
+        <w:pStyle w:val="Heading2"/>
+      </w:pPr>
+      <w:r>
+        <w:t>27.1 Correcciones a 09 antes del contrafactual</w:t>
+      </w:r>
+    </w:p>
+    <w:p>
+      <w:pPr/>
+      <w:r>
+        <w:t>Revision metodologica del equipo. (a) Corrige la seccion 26.1: aplicar el modelo de chase, aprendido solo fuera de zona, a pitches dentro de zona con su ubicacion intacta es extrapolacion, no 'la pregunta contrafactual estandar'; solo whiff_given_swing y called_strike se aplican fuera de su poblacion de entrenamiento sin ese problema, y groundball es propension condicionada a contacto. Las columnas de 09 se renombraron con la poblacion explicita (p_whiff_per_pitch, p_whiff_given_swing, p_groundball_given_contact, p_called_strike, p_chase_given_outside_zone) y se agrego stuff_plus_no_chase como sensibilidad. Los resultados numericos de 09 no cambiaron. En el delta, ambas copias comparten ubicacion, por lo que ese error de extrapolacion se cancela en gran parte; no se cancela en el nivel del score.</w:t>
+      </w:r>
+    </w:p>
+    <w:p>
+      <w:pPr>
+        <w:pStyle w:val="Heading2"/>
+      </w:pPr>
+      <w:r>
+        <w:t>27.2 Que mide y que no mide</w:t>
+      </w:r>
+    </w:p>
+    <w:p>
+      <w:pPr/>
+      <w:r>
+        <w:t>delta_direct = Score(X, Extreme) - Score(X, No Altitude), con todas las demas features identicas, incluido el movimiento observado. Es el efecto directo, ajustado, del entorno condicionado en el movimiento observado. No responde que le pasaria fisicamente al pitch al llevarlo de nivel del mar a CDMX, porque esa pregunta incluye el cambio de IVB/HB provocado por la atmosfera (p.ej. Four-Seam pierde ~3.83 in de IVB en Extreme, seccion 12), que aqui se mantiene fijo. Tampoco es causal puro. El efecto total por modelo, Score(X^Extreme, Extreme) - Score(X^No, No), queda pendiente: mover IVB/HB sin ajustar VertApprAngle/HorzApprAngle (feature #1 en whiff) daria entradas fisicamente inconsistentes.</w:t>
+      </w:r>
+    </w:p>
+    <w:p>
+      <w:pPr/>
+      <w:r>
+        <w:t>Lenguaje: la variable disponible es altitude_category, no una identificacion fisica de Harp Helu; se reporta 'Extreme Altitude (proxy del entorno Harp Helu)'. Ademas la categoria probablemente agrupa pocos parques, por lo que el efecto directo tambien puede absorber diferencias de calibracion o de parque.</w:t>
+      </w:r>
+    </w:p>
+    <w:p>
+      <w:pPr>
+        <w:pStyle w:val="Heading2"/>
+      </w:pPr>
+      <w:r>
+        <w:t>27.3 Resultados</w:t>
+      </w:r>
+    </w:p>
+    <w:tbl>
+      <w:tblPr>
+        <w:tblStyle w:val="TableGrid"/>
+        <w:tblW w:type="auto" w:w="0"/>
+        <w:tblLook w:firstColumn="1" w:firstRow="1" w:lastColumn="0" w:lastRow="0" w:noHBand="0" w:noVBand="1" w:val="04A0"/>
+      </w:tblPr>
+      <w:tblGrid>
+        <w:gridCol w:w="2556"/>
+        <w:gridCol w:w="2556"/>
+        <w:gridCol w:w="2556"/>
+        <w:gridCol w:w="2556"/>
+      </w:tblGrid>
+      <w:tr>
+        <w:tc>
+          <w:tcPr>
+            <w:tcW w:type="dxa" w:w="2556"/>
+          </w:tcPr>
+          <w:p>
+            <w:r>
+              <w:t>Pitch type</w:t>
+            </w:r>
+          </w:p>
+        </w:tc>
+        <w:tc>
+          <w:tcPr>
+            <w:tcW w:type="dxa" w:w="2556"/>
+          </w:tcPr>
+          <w:p>
+            <w:r>
+              <w:t>delta_direct 2024-&gt;25</w:t>
+            </w:r>
+          </w:p>
+        </w:tc>
+        <w:tc>
+          <w:tcPr>
+            <w:tcW w:type="dxa" w:w="2556"/>
+          </w:tcPr>
+          <w:p>
+            <w:r>
+              <w:t>delta_direct 2024-25-&gt;26</w:t>
+            </w:r>
+          </w:p>
+        </w:tc>
+        <w:tc>
+          <w:tcPr>
+            <w:tcW w:type="dxa" w:w="2556"/>
+          </w:tcPr>
+          <w:p>
+            <w:r>
+              <w:t>Contraste observado 2024-25-&gt;26 (celdas)</w:t>
+            </w:r>
+          </w:p>
+        </w:tc>
+      </w:tr>
+      <w:tr>
+        <w:tc>
+          <w:tcPr>
+            <w:tcW w:type="dxa" w:w="2556"/>
+          </w:tcPr>
+          <w:p>
+            <w:r>
+              <w:t>Four-Seam</w:t>
+            </w:r>
+          </w:p>
+        </w:tc>
+        <w:tc>
+          <w:tcPr>
+            <w:tcW w:type="dxa" w:w="2556"/>
+          </w:tcPr>
+          <w:p>
+            <w:r>
+              <w:t>+0.05</w:t>
+            </w:r>
+          </w:p>
+        </w:tc>
+        <w:tc>
+          <w:tcPr>
+            <w:tcW w:type="dxa" w:w="2556"/>
+          </w:tcPr>
+          <w:p>
+            <w:r>
+              <w:t>-0.30</w:t>
+            </w:r>
+          </w:p>
+        </w:tc>
+        <w:tc>
+          <w:tcPr>
+            <w:tcW w:type="dxa" w:w="2556"/>
+          </w:tcPr>
+          <w:p>
+            <w:r>
+              <w:t>+0.02 (93)</w:t>
+            </w:r>
+          </w:p>
+        </w:tc>
+      </w:tr>
+      <w:tr>
+        <w:tc>
+          <w:tcPr>
+            <w:tcW w:type="dxa" w:w="2556"/>
+          </w:tcPr>
+          <w:p>
+            <w:r>
+              <w:t>Sinker</w:t>
+            </w:r>
+          </w:p>
+        </w:tc>
+        <w:tc>
+          <w:tcPr>
+            <w:tcW w:type="dxa" w:w="2556"/>
+          </w:tcPr>
+          <w:p>
+            <w:r>
+              <w:t>-0.04</w:t>
+            </w:r>
+          </w:p>
+        </w:tc>
+        <w:tc>
+          <w:tcPr>
+            <w:tcW w:type="dxa" w:w="2556"/>
+          </w:tcPr>
+          <w:p>
+            <w:r>
+              <w:t>-0.34</w:t>
+            </w:r>
+          </w:p>
+        </w:tc>
+        <w:tc>
+          <w:tcPr>
+            <w:tcW w:type="dxa" w:w="2556"/>
+          </w:tcPr>
+          <w:p>
+            <w:r>
+              <w:t>+0.22 (46)</w:t>
+            </w:r>
+          </w:p>
+        </w:tc>
+      </w:tr>
+      <w:tr>
+        <w:tc>
+          <w:tcPr>
+            <w:tcW w:type="dxa" w:w="2556"/>
+          </w:tcPr>
+          <w:p>
+            <w:r>
+              <w:t>Slider</w:t>
+            </w:r>
+          </w:p>
+        </w:tc>
+        <w:tc>
+          <w:tcPr>
+            <w:tcW w:type="dxa" w:w="2556"/>
+          </w:tcPr>
+          <w:p>
+            <w:r>
+              <w:t>+0.17</w:t>
+            </w:r>
+          </w:p>
+        </w:tc>
+        <w:tc>
+          <w:tcPr>
+            <w:tcW w:type="dxa" w:w="2556"/>
+          </w:tcPr>
+          <w:p>
+            <w:r>
+              <w:t>-0.17</w:t>
+            </w:r>
+          </w:p>
+        </w:tc>
+        <w:tc>
+          <w:tcPr>
+            <w:tcW w:type="dxa" w:w="2556"/>
+          </w:tcPr>
+          <w:p>
+            <w:r>
+              <w:t>-0.10 (67)</w:t>
+            </w:r>
+          </w:p>
+        </w:tc>
+      </w:tr>
+      <w:tr>
+        <w:tc>
+          <w:tcPr>
+            <w:tcW w:type="dxa" w:w="2556"/>
+          </w:tcPr>
+          <w:p>
+            <w:r>
+              <w:t>Changeup</w:t>
+            </w:r>
+          </w:p>
+        </w:tc>
+        <w:tc>
+          <w:tcPr>
+            <w:tcW w:type="dxa" w:w="2556"/>
+          </w:tcPr>
+          <w:p>
+            <w:r>
+              <w:t>+0.11</w:t>
+            </w:r>
+          </w:p>
+        </w:tc>
+        <w:tc>
+          <w:tcPr>
+            <w:tcW w:type="dxa" w:w="2556"/>
+          </w:tcPr>
+          <w:p>
+            <w:r>
+              <w:t>-0.13</w:t>
+            </w:r>
+          </w:p>
+        </w:tc>
+        <w:tc>
+          <w:tcPr>
+            <w:tcW w:type="dxa" w:w="2556"/>
+          </w:tcPr>
+          <w:p>
+            <w:r>
+              <w:t>+0.17 (26)</w:t>
+            </w:r>
+          </w:p>
+        </w:tc>
+      </w:tr>
+      <w:tr>
+        <w:tc>
+          <w:tcPr>
+            <w:tcW w:type="dxa" w:w="2556"/>
+          </w:tcPr>
+          <w:p>
+            <w:r>
+              <w:t>Curveball</w:t>
+            </w:r>
+          </w:p>
+        </w:tc>
+        <w:tc>
+          <w:tcPr>
+            <w:tcW w:type="dxa" w:w="2556"/>
+          </w:tcPr>
+          <w:p>
+            <w:r>
+              <w:t>+0.19</w:t>
+            </w:r>
+          </w:p>
+        </w:tc>
+        <w:tc>
+          <w:tcPr>
+            <w:tcW w:type="dxa" w:w="2556"/>
+          </w:tcPr>
+          <w:p>
+            <w:r>
+              <w:t>+0.01</w:t>
+            </w:r>
+          </w:p>
+        </w:tc>
+        <w:tc>
+          <w:tcPr>
+            <w:tcW w:type="dxa" w:w="2556"/>
+          </w:tcPr>
+          <w:p>
+            <w:r>
+              <w:t>-0.94 (12)</w:t>
+            </w:r>
+          </w:p>
+        </w:tc>
+      </w:tr>
+      <w:tr>
+        <w:tc>
+          <w:tcPr>
+            <w:tcW w:type="dxa" w:w="2556"/>
+          </w:tcPr>
+          <w:p>
+            <w:r>
+              <w:t>Cutter</w:t>
+            </w:r>
+          </w:p>
+        </w:tc>
+        <w:tc>
+          <w:tcPr>
+            <w:tcW w:type="dxa" w:w="2556"/>
+          </w:tcPr>
+          <w:p>
+            <w:r>
+              <w:t>+0.20</w:t>
+            </w:r>
+          </w:p>
+        </w:tc>
+        <w:tc>
+          <w:tcPr>
+            <w:tcW w:type="dxa" w:w="2556"/>
+          </w:tcPr>
+          <w:p>
+            <w:r>
+              <w:t>-0.23</w:t>
+            </w:r>
+          </w:p>
+        </w:tc>
+        <w:tc>
+          <w:tcPr>
+            <w:tcW w:type="dxa" w:w="2556"/>
+          </w:tcPr>
+          <w:p>
+            <w:r>
+              <w:t>+1.16 (4)</w:t>
+            </w:r>
+          </w:p>
+        </w:tc>
+      </w:tr>
+      <w:tr>
+        <w:tc>
+          <w:tcPr>
+            <w:tcW w:type="dxa" w:w="2556"/>
+          </w:tcPr>
+          <w:p>
+            <w:r>
+              <w:t>Splitter</w:t>
+            </w:r>
+          </w:p>
+        </w:tc>
+        <w:tc>
+          <w:tcPr>
+            <w:tcW w:type="dxa" w:w="2556"/>
+          </w:tcPr>
+          <w:p>
+            <w:r>
+              <w:t>+0.17</w:t>
+            </w:r>
+          </w:p>
+        </w:tc>
+        <w:tc>
+          <w:tcPr>
+            <w:tcW w:type="dxa" w:w="2556"/>
+          </w:tcPr>
+          <w:p>
+            <w:r>
+              <w:t>-0.06</w:t>
+            </w:r>
+          </w:p>
+        </w:tc>
+        <w:tc>
+          <w:tcPr>
+            <w:tcW w:type="dxa" w:w="2556"/>
+          </w:tcPr>
+          <w:p>
+            <w:r>
+              <w:t>+3.90 (1)</w:t>
+            </w:r>
+          </w:p>
+        </w:tc>
+      </w:tr>
+    </w:tbl>
+    <w:p>
+      <w:pPr/>
+      <w:r>
+        <w:t>Lectura honesta. (1) El efecto directo es practicamente cero: |media| &lt;= 0.35 puntos Stuff+ en una escala de SD 10, con SD dentro de cada tipo de 0.4 a 0.8, y el signo cambia entre ventanas (Four-Seam +0.05 vs -0.30; Slider +0.17 vs -0.17). No hay todavia un 'Four-Seam: delta Stuff+ = -X' defendible. (2) Es consistente con 08: el modelo casi no necesita conocer la altitud, lo que apoya que el efecto de altitud viaja via movimiento observado y no como efecto directo del entorno. (3) El contraste observacional within-pitcher/pitch-type (celdas con n&gt;=20 en ambos entornos, ponderado por el menor n) es ruidoso y con celdas escasas; solo Curveball es negativo en ambas ventanas (-1.15 y -0.94, con 34 y 12 celdas). Incluye efecto directo mas todo lo mediado por movimiento, ubicacion, bateadores y parque: es asociacion, no efecto aislado. (4) Dilucion: el score promedia cinco z-scores y solo la parte de whiff es claramente sensible a la altitud. Estimacion gruesa: whiff Four-Seam -1.64 pp (seccion 12) / SD de p_whiff 0.093 = -0.18 z, /5 componentes, /SD del compuesto 0.43 = -0.08 SD, es decir del orden de -1 punto Stuff+. Efectos de ese tamano no se distinguen del ruido con estas celdas: falta bootstrap por pitcher.</w:t>
+      </w:r>
+    </w:p>
+    <w:p>
+      <w:pPr/>
+      <w:r>
+        <w:t>Dominio de chase: en 2024-25-&gt;2026 el delta medio dentro de zona es -0.50 y fuera de zona -0.08; la version sin chase da valores casi identicos, asi que chase no es el motor de las diferencias.</w:t>
+      </w:r>
+    </w:p>
+    <w:p>
+      <w:pPr/>
+      <w:r>
+        <w:t>Pitchers (n&gt;=100 pitches, ventana primaria): 243, delta_direct medio -0.22, SD entre pitchers 0.13. Deltas por pitch shape (tercil de IVB x tercil de |HB| dentro de cada tipo) y por pitcher/arsenal, con n, media, mediana, SD y percentiles 10/25/75/90, en 10_altitude_delta_by_shape_bin.csv y 10_altitude_delta_by_pitcher.csv.</w:t>
+      </w:r>
+    </w:p>
+    <w:p>
+      <w:pPr>
+        <w:pStyle w:val="Heading2"/>
+      </w:pPr>
+      <w:r>
+        <w:t>27.4 Decision y siguiente paso</w:t>
+      </w:r>
+    </w:p>
+    <w:p>
+      <w:pPr/>
+      <w:r>
+        <w:t>No reportar deltas por pitch shape como hallazgo del reto todavia. Siguiente paso: delta total con las features fisicas desplazadas de forma consistente por los deltas within-pitcher/type/year empiricos (IVB, HB, angulos de aproximacion, velocidad, spin), mas bootstrap por pitcher para intervalos. Si el efecto total sigue siendo del orden de 1 punto, la conclusion defendible es que el efecto de altitud sobre el score compuesto es pequeno frente a la variacion entre pitchers, y que el valor practico esta en el perfil de pitcher/arsenal (seccion de recomendaciones), no en el delta promedio por tipo.</w:t>
+      </w:r>
+    </w:p>
+    <w:p>
+      <w:pPr>
+        <w:pStyle w:val="Heading1"/>
+      </w:pPr>
+      <w:r>
+        <w:t>28. Delta total de altitud (transformacion fisica conjunta) y bootstrap</w:t>
+      </w:r>
+    </w:p>
+    <w:p>
+      <w:pPr/>
+      <w:r>
+        <w:t>Estado: CERRADO como V1. Ejecucion real el 24/09/2026 (11_altitude_total_effect.py, bootstrap B=500 por pitcher, dos ventanas season-forward). Se mantienen tres resultados separados: (1) delta directo (seccion 27): cambiar solo altitude_category, ~0; (2) contraste observacional within-pitcher (seccion 27): ruidoso; (3) delta total modelado (esta seccion): Score(X^Extreme, Extreme) - Score(X^No, No), la estimacion principal. Extreme Altitude se reporta como proxy del entorno Harp Helu. No es causalidad pura; ubicacion, count, arsenal historico y handedness se mantienen fijos (en la realidad la ubicacion de llegada tambien cambiaria).</w:t>
+      </w:r>
+    </w:p>
+    <w:p>
+      <w:pPr>
+        <w:pStyle w:val="Heading2"/>
+      </w:pPr>
+      <w:r>
+        <w:t>28.1 Diseno y ajustes sobre la propuesta inicial</w:t>
+      </w:r>
+    </w:p>
+    <w:p>
+      <w:pPr/>
+      <w:r>
+        <w:t>(a) Solo se desplazan las variables que la atmosfera puede cambiar en vuelo: InducedVertBreak, HorzBreak, VertApprAngle y HorzApprAngle; ivb_diff_vs_fb y hb_diff_vs_fb se desplazan por delta_tipo - delta_recta_primaria del pitcher. Velocidad, spin, punto y angulos de release y extension los controla el pitcher y no se desplazan; sus deltas within-pitcher se reportan como placebo. (b) El vector de deltas se estima junto por tipo de pitch con las mismas celdas pitcher x tipo x anio (n&gt;=20 en No y en Extreme, ponderado por el menor n), solo con el historial de cada ventana, y se valida contra lo observado en la temporada futura. Es una traslacion por tipo: no captura efectos proporcionales por pitch (p.ej. mas spin, mas perdida). No se aplico shrinkage entre tipos porque diluiria diferencias reales; la incertidumbre la lleva el bootstrap. (c) Cohorte principal: pitches observados en No Altitude, copia Extreme = X + delta. Chequeo inverso: pitches observados en Extreme transformados hacia No. (d) Bootstrap: remuestreo de pitchers con multiplicidad, aplicado a la vez a las celdas que estiman la transformacion y a la cohorte evaluada. El IC refleja variacion entre pitchers y error de estimacion de la transformacion; no incluye incertidumbre de los modelos de 09, que se tratan como fijos. (e) Regla de titular: 'gana/pierde' solo si el IC95% no cruza 0. Se agrego un umbral de relevancia practica de 1 punto Stuff+ (0.1 SD), criterio del analista, ajustable en el script.</w:t>
+      </w:r>
+    </w:p>
+    <w:p>
+      <w:pPr>
+        <w:pStyle w:val="Heading2"/>
+      </w:pPr>
+      <w:r>
+        <w:t>28.2 Resultados por pitch type (ventana primaria 2024-25 -&gt; 2026)</w:t>
+      </w:r>
+    </w:p>
+    <w:tbl>
+      <w:tblPr>
+        <w:tblStyle w:val="TableGrid"/>
+        <w:tblW w:type="auto" w:w="0"/>
+        <w:tblLook w:firstColumn="1" w:firstRow="1" w:lastColumn="0" w:lastRow="0" w:noHBand="0" w:noVBand="1" w:val="04A0"/>
+      </w:tblPr>
+      <w:tblGrid>
+        <w:gridCol w:w="2045"/>
+        <w:gridCol w:w="2045"/>
+        <w:gridCol w:w="2045"/>
+        <w:gridCol w:w="2045"/>
+        <w:gridCol w:w="2045"/>
+      </w:tblGrid>
+      <w:tr>
+        <w:tc>
+          <w:tcPr>
+            <w:tcW w:type="dxa" w:w="2045"/>
+          </w:tcPr>
+          <w:p>
+            <w:r>
+              <w:t>Pitch type</w:t>
+            </w:r>
+          </w:p>
+        </w:tc>
+        <w:tc>
+          <w:tcPr>
+            <w:tcW w:type="dxa" w:w="2045"/>
+          </w:tcPr>
+          <w:p>
+            <w:r>
+              <w:t>Delta total [IC95%]</w:t>
+            </w:r>
+          </w:p>
+        </w:tc>
+        <w:tc>
+          <w:tcPr>
+            <w:tcW w:type="dxa" w:w="2045"/>
+          </w:tcPr>
+          <w:p>
+            <w:r>
+              <w:t>Decision</w:t>
+            </w:r>
+          </w:p>
+        </w:tc>
+        <w:tc>
+          <w:tcPr>
+            <w:tcW w:type="dxa" w:w="2045"/>
+          </w:tcPr>
+          <w:p>
+            <w:r>
+              <w:t>Sin groundball [IC95%]</w:t>
+            </w:r>
+          </w:p>
+        </w:tc>
+        <w:tc>
+          <w:tcPr>
+            <w:tcW w:type="dxa" w:w="2045"/>
+          </w:tcPr>
+          <w:p>
+            <w:r>
+              <w:t>n pitchers / celdas hist.</w:t>
+            </w:r>
+          </w:p>
+        </w:tc>
+      </w:tr>
+      <w:tr>
+        <w:tc>
+          <w:tcPr>
+            <w:tcW w:type="dxa" w:w="2045"/>
+          </w:tcPr>
+          <w:p>
+            <w:r>
+              <w:t>Four-Seam</w:t>
+            </w:r>
+          </w:p>
+        </w:tc>
+        <w:tc>
+          <w:tcPr>
+            <w:tcW w:type="dxa" w:w="2045"/>
+          </w:tcPr>
+          <w:p>
+            <w:r>
+              <w:t>+0.28 [+0.12, +0.45]</w:t>
+            </w:r>
+          </w:p>
+        </w:tc>
+        <w:tc>
+          <w:tcPr>
+            <w:tcW w:type="dxa" w:w="2045"/>
+          </w:tcPr>
+          <w:p>
+            <w:r>
+              <w:t>gana (&lt;1 pt)</w:t>
+            </w:r>
+          </w:p>
+        </w:tc>
+        <w:tc>
+          <w:tcPr>
+            <w:tcW w:type="dxa" w:w="2045"/>
+          </w:tcPr>
+          <w:p>
+            <w:r>
+              <w:t>-1.97 [-2.12, -1.81]</w:t>
+            </w:r>
+          </w:p>
+        </w:tc>
+        <w:tc>
+          <w:tcPr>
+            <w:tcW w:type="dxa" w:w="2045"/>
+          </w:tcPr>
+          <w:p>
+            <w:r>
+              <w:t>245 / 475</w:t>
+            </w:r>
+          </w:p>
+        </w:tc>
+      </w:tr>
+      <w:tr>
+        <w:tc>
+          <w:tcPr>
+            <w:tcW w:type="dxa" w:w="2045"/>
+          </w:tcPr>
+          <w:p>
+            <w:r>
+              <w:t>Sinker</w:t>
+            </w:r>
+          </w:p>
+        </w:tc>
+        <w:tc>
+          <w:tcPr>
+            <w:tcW w:type="dxa" w:w="2045"/>
+          </w:tcPr>
+          <w:p>
+            <w:r>
+              <w:t>+0.36 [+0.21, +0.50]</w:t>
+            </w:r>
+          </w:p>
+        </w:tc>
+        <w:tc>
+          <w:tcPr>
+            <w:tcW w:type="dxa" w:w="2045"/>
+          </w:tcPr>
+          <w:p>
+            <w:r>
+              <w:t>gana (&lt;1 pt)</w:t>
+            </w:r>
+          </w:p>
+        </w:tc>
+        <w:tc>
+          <w:tcPr>
+            <w:tcW w:type="dxa" w:w="2045"/>
+          </w:tcPr>
+          <w:p>
+            <w:r>
+              <w:t>-0.35 [-0.46, -0.25]</w:t>
+            </w:r>
+          </w:p>
+        </w:tc>
+        <w:tc>
+          <w:tcPr>
+            <w:tcW w:type="dxa" w:w="2045"/>
+          </w:tcPr>
+          <w:p>
+            <w:r>
+              <w:t>227 / 238</w:t>
+            </w:r>
+          </w:p>
+        </w:tc>
+      </w:tr>
+      <w:tr>
+        <w:tc>
+          <w:tcPr>
+            <w:tcW w:type="dxa" w:w="2045"/>
+          </w:tcPr>
+          <w:p>
+            <w:r>
+              <w:t>Changeup</w:t>
+            </w:r>
+          </w:p>
+        </w:tc>
+        <w:tc>
+          <w:tcPr>
+            <w:tcW w:type="dxa" w:w="2045"/>
+          </w:tcPr>
+          <w:p>
+            <w:r>
+              <w:t>+0.28 [+0.07, +0.49]</w:t>
+            </w:r>
+          </w:p>
+        </w:tc>
+        <w:tc>
+          <w:tcPr>
+            <w:tcW w:type="dxa" w:w="2045"/>
+          </w:tcPr>
+          <w:p>
+            <w:r>
+              <w:t>gana (&lt;1 pt)</w:t>
+            </w:r>
+          </w:p>
+        </w:tc>
+        <w:tc>
+          <w:tcPr>
+            <w:tcW w:type="dxa" w:w="2045"/>
+          </w:tcPr>
+          <w:p>
+            <w:r>
+              <w:t>-0.19 [-0.33, -0.08]</w:t>
+            </w:r>
+          </w:p>
+        </w:tc>
+        <w:tc>
+          <w:tcPr>
+            <w:tcW w:type="dxa" w:w="2045"/>
+          </w:tcPr>
+          <w:p>
+            <w:r>
+              <w:t>228 / 154</w:t>
+            </w:r>
+          </w:p>
+        </w:tc>
+      </w:tr>
+      <w:tr>
+        <w:tc>
+          <w:tcPr>
+            <w:tcW w:type="dxa" w:w="2045"/>
+          </w:tcPr>
+          <w:p>
+            <w:r>
+              <w:t>Cutter</w:t>
+            </w:r>
+          </w:p>
+        </w:tc>
+        <w:tc>
+          <w:tcPr>
+            <w:tcW w:type="dxa" w:w="2045"/>
+          </w:tcPr>
+          <w:p>
+            <w:r>
+              <w:t>+0.63 [+0.23, +1.13]</w:t>
+            </w:r>
+          </w:p>
+        </w:tc>
+        <w:tc>
+          <w:tcPr>
+            <w:tcW w:type="dxa" w:w="2045"/>
+          </w:tcPr>
+          <w:p>
+            <w:r>
+              <w:t>gana (&lt;1 pt)</w:t>
+            </w:r>
+          </w:p>
+        </w:tc>
+        <w:tc>
+          <w:tcPr>
+            <w:tcW w:type="dxa" w:w="2045"/>
+          </w:tcPr>
+          <w:p>
+            <w:r>
+              <w:t>-0.05 [-0.25, +0.17] incierto</w:t>
+            </w:r>
+          </w:p>
+        </w:tc>
+        <w:tc>
+          <w:tcPr>
+            <w:tcW w:type="dxa" w:w="2045"/>
+          </w:tcPr>
+          <w:p>
+            <w:r>
+              <w:t>102 / 41</w:t>
+            </w:r>
+          </w:p>
+        </w:tc>
+      </w:tr>
+      <w:tr>
+        <w:tc>
+          <w:tcPr>
+            <w:tcW w:type="dxa" w:w="2045"/>
+          </w:tcPr>
+          <w:p>
+            <w:r>
+              <w:t>Slider</w:t>
+            </w:r>
+          </w:p>
+        </w:tc>
+        <w:tc>
+          <w:tcPr>
+            <w:tcW w:type="dxa" w:w="2045"/>
+          </w:tcPr>
+          <w:p>
+            <w:r>
+              <w:t>-0.33 [-0.42, -0.24]</w:t>
+            </w:r>
+          </w:p>
+        </w:tc>
+        <w:tc>
+          <w:tcPr>
+            <w:tcW w:type="dxa" w:w="2045"/>
+          </w:tcPr>
+          <w:p>
+            <w:r>
+              <w:t>pierde (&lt;1 pt)</w:t>
+            </w:r>
+          </w:p>
+        </w:tc>
+        <w:tc>
+          <w:tcPr>
+            <w:tcW w:type="dxa" w:w="2045"/>
+          </w:tcPr>
+          <w:p>
+            <w:r>
+              <w:t>-0.43 [-0.50, -0.36]</w:t>
+            </w:r>
+          </w:p>
+        </w:tc>
+        <w:tc>
+          <w:tcPr>
+            <w:tcW w:type="dxa" w:w="2045"/>
+          </w:tcPr>
+          <w:p>
+            <w:r>
+              <w:t>251 / 322</w:t>
+            </w:r>
+          </w:p>
+        </w:tc>
+      </w:tr>
+      <w:tr>
+        <w:tc>
+          <w:tcPr>
+            <w:tcW w:type="dxa" w:w="2045"/>
+          </w:tcPr>
+          <w:p>
+            <w:r>
+              <w:t>Curveball</w:t>
+            </w:r>
+          </w:p>
+        </w:tc>
+        <w:tc>
+          <w:tcPr>
+            <w:tcW w:type="dxa" w:w="2045"/>
+          </w:tcPr>
+          <w:p>
+            <w:r>
+              <w:t>-0.78 [-0.99, -0.58]</w:t>
+            </w:r>
+          </w:p>
+        </w:tc>
+        <w:tc>
+          <w:tcPr>
+            <w:tcW w:type="dxa" w:w="2045"/>
+          </w:tcPr>
+          <w:p>
+            <w:r>
+              <w:t>pierde (&lt;1 pt)</w:t>
+            </w:r>
+          </w:p>
+        </w:tc>
+        <w:tc>
+          <w:tcPr>
+            <w:tcW w:type="dxa" w:w="2045"/>
+          </w:tcPr>
+          <w:p>
+            <w:r>
+              <w:t>-0.20 [-0.35, -0.05]</w:t>
+            </w:r>
+          </w:p>
+        </w:tc>
+        <w:tc>
+          <w:tcPr>
+            <w:tcW w:type="dxa" w:w="2045"/>
+          </w:tcPr>
+          <w:p>
+            <w:r>
+              <w:t>179 / 115</w:t>
+            </w:r>
+          </w:p>
+        </w:tc>
+      </w:tr>
+      <w:tr>
+        <w:tc>
+          <w:tcPr>
+            <w:tcW w:type="dxa" w:w="2045"/>
+          </w:tcPr>
+          <w:p>
+            <w:r>
+              <w:t>Splitter</w:t>
+            </w:r>
+          </w:p>
+        </w:tc>
+        <w:tc>
+          <w:tcPr>
+            <w:tcW w:type="dxa" w:w="2045"/>
+          </w:tcPr>
+          <w:p>
+            <w:r>
+              <w:t>-0.83 [-1.56, +0.80]</w:t>
+            </w:r>
+          </w:p>
+        </w:tc>
+        <w:tc>
+          <w:tcPr>
+            <w:tcW w:type="dxa" w:w="2045"/>
+          </w:tcPr>
+          <w:p>
+            <w:r>
+              <w:t>incierto</w:t>
+            </w:r>
+          </w:p>
+        </w:tc>
+        <w:tc>
+          <w:tcPr>
+            <w:tcW w:type="dxa" w:w="2045"/>
+          </w:tcPr>
+          <w:p>
+            <w:r>
+              <w:t>-0.44 [-0.88, +0.01] incierto</w:t>
+            </w:r>
+          </w:p>
+        </w:tc>
+        <w:tc>
+          <w:tcPr>
+            <w:tcW w:type="dxa" w:w="2045"/>
+          </w:tcPr>
+          <w:p>
+            <w:r>
+              <w:t>50 / 8</w:t>
+            </w:r>
+          </w:p>
+        </w:tc>
+      </w:tr>
+    </w:tbl>
+    <w:p>
+      <w:pPr/>
+      <w:r>
+        <w:t>Ventana 2024-&gt;2025 (historial solo 2024): Changeup +0.23, Curveball -0.46, Cutter +0.56, Four-Seam +0.57, Sinker +0.51, Slider -0.09, Splitter -0.16 (incierto). Los signos coinciden entre ventanas salvo el tamano de Four-Seam.</w:t>
+      </w:r>
+    </w:p>
+    <w:p>
+      <w:pPr>
+        <w:pStyle w:val="Heading2"/>
+      </w:pPr>
+      <w:r>
+        <w:t>28.3 Lectura: el signo de las rectas depende de los pesos iguales</w:t>
+      </w:r>
+    </w:p>
+    <w:p>
+      <w:pPr/>
+      <w:r>
+        <w:t>Ningun efecto por tipo alcanza 1 punto Stuff+: son estadisticamente distinguibles de cero en varios tipos pero practicamente pequenos. Mas importante, el signo del efecto en rectas y Changeup depende del supuesto V1 de pesos iguales. Four-Seam (2026), contribucion de cada componente en puntos Stuff+: whiff por pitch -1.05, whiff dado swing -0.59, groundball dado contacto +2.25, called strike -0.08, chase -0.25. Es decir, el desplazamiento fisico (menos IVB, ~-3.8 in) reduce el valor asociado a whiff (coherente con H1) y aumenta la propension a groundball (coherente con lo que el modelo aprendio: menos IVB, mas groundballs), y el compuesto los netea con el mismo peso. Con los cinco componentes el efecto neto es +0.28; sin groundball es -1.97. Solo Curveball y Slider mantienen el mismo signo con y sin groundball (columna robusto_a_quitar_groundball). Conclusion defendible: la altitud, actuando via forma fisica, quita valor de whiff a las rectas y aumenta su propension a groundball; si el neto es ganancia o perdida depende de cuanto se valore un groundball frente a un whiff, lo que exige los pesos de valor de carrera pendientes (V2). Hasta entonces se reportan los componentes, no un neto para las rectas.</w:t>
+      </w:r>
+    </w:p>
+    <w:p>
+      <w:pPr/>
+      <w:r>
+        <w:t>Descomposicion: el efecto viene casi todo de la fisica desplazada, no de la etiqueta. Four-Seam 2026: fisica +0.48, etiqueta -0.20 (suman 0.28). Consistente con 08 y con la seccion 27: la altitud actua cambiando el shape, y el modelo responde al shape.</w:t>
+      </w:r>
+    </w:p>
+    <w:p>
+      <w:pPr>
+        <w:pStyle w:val="Heading2"/>
+      </w:pPr>
+      <w:r>
+        <w:t>28.4 Validaciones</w:t>
+      </w:r>
+    </w:p>
+    <w:p>
+      <w:pPr/>
+      <w:r>
+        <w:t>Transformacion vs temporada futura: en los tipos grandes es estable (Four-Seam 2026: IVB -3.82 historial vs -3.90 observado; HB -1.92 vs -1.86; VertApprAngle -0.33 vs -0.32; Sinker y Changeup similares). No es confiable en Splitter (3 y 8 celdas; IVB +0.20 historial vs +3.99 observado) ni del todo en Cutter (VertApprAngle -0.23 vs -0.16 y HB 0.00 vs -0.83); los resultados de Splitter y Cutter deben leerse como de baja confianza. Chequeo inverso (Extreme observado -&gt; No): mismo signo en los siete tipos y en ambas ventanas, con magnitudes algo mayores en rectas (Four-Seam 0.48 vs 0.28 directo). Placebo (release, no desplazadas): deltas pequenos (RelHeight &lt;=0.06 ft, RelSide &lt;=0.15 ft, extension &lt;=0.10 ft, RelSpeed &lt;=0.6 mph, VertRelAngle &lt;=0.2 deg), con una excepcion: SpinRate del Slider +42 a +48 rpm within-pitcher, que puede ser ajuste de los pitchers o diferencia de calibracion; el modelo es poco sensible a spin (H4), pero queda como limite.</w:t>
+      </w:r>
+    </w:p>
+    <w:p>
+      <w:pPr>
+        <w:pStyle w:val="Heading2"/>
+      </w:pPr>
+      <w:r>
+        <w:t>28.5 Pitch shapes, pitchers y limites</w:t>
+      </w:r>
+    </w:p>
+    <w:p>
+      <w:pPr/>
+      <w:r>
+        <w:t>Por shape (tercil de IVB x tercil de |HB| dentro de cada tipo, 63 celdas), solo 3-4 celdas por ventana cumplen IC que no cruza 0, &gt;=30 pitchers y |delta|&gt;=1 pt (Four-Seam de IVB bajo, ~+1.1 a +1.4, otra vez dependiente de groundball; Curveball de IVB medio/bajo ~-1.0 en 2026). Sin correccion por comparaciones multiples: leerlas como exploratorias. Por pitcher (n&gt;=100 pitches): 145 pitchers, delta medio +0.07, SD entre pitchers 0.44; la variacion entre pitchers supera al efecto medio por tipo. Limites: pesos iguales V1; efecto por tipo estimado como traslacion; Splitter y Cutter con pocas celdas; IC sin incertidumbre de modelo; ubicacion fija; comparaciones multiples en shapes. Siguiente paso: pesos de valor de carrera (V2) para decidir el neto en rectas, y traducir estos hallazgos a perfil ideal y recomendaciones (entregables 2 y 3).</w:t>
+      </w:r>
+    </w:p>
+    <w:p>
+      <w:pPr>
+        <w:pStyle w:val="Heading1"/>
+      </w:pPr>
+      <w:r>
+        <w:t>29. V2: pesos ligados a valor de carrera y sensibilidad del efecto ambiental</w:t>
+      </w:r>
+    </w:p>
+    <w:p>
+      <w:pPr/>
+      <w:r>
+        <w:t>Estado: CERRADO como analisis de sensibilidad (V2 no reemplaza a V1). Ejecucion real el 24/09/2026 (12_weight_sensitivity.py, 13_count_value_weights.py, 14_v1_v2_altitude_matrix.py). Pregunta acotada: cuando se reemplazan los pesos iguales por pesos ligados a valor de carrera observable, se mantiene o cambia la conclusion ambiental por pitch type? V1 (pesos iguales) permanece intacto como baseline transparente.</w:t>
+      </w:r>
+    </w:p>
+    <w:p>
+      <w:pPr>
+        <w:pStyle w:val="Heading2"/>
+      </w:pPr>
+      <w:r>
+        <w:t>29.1 Enmienda a la regla de la seccion 22 (decision del equipo, 24/09/2026)</w:t>
+      </w:r>
+    </w:p>
+    <w:p>
+      <w:pPr/>
+      <w:r>
+        <w:t>La regla anterior decia 'no se incorporan pesos externos'. Se reemplaza por: no se usan pesos externos para definir directamente Stuff+/Pitching+; se permite una referencia sabermetrica externa documentada para asignar valor a eventos terminales cuando el dataset no contiene el estado base-out necesario para estimarlos internamente. Motivo: RunsScored no sirve como valor de carrera (en bolas en juego promedia 0.25 en sencillo, 0.50 en doble, 1.69 en jonron y 0.02 en out: no valora outs ni corredores, y hay 685 filas con carreras que no son terminales), y el dataset no tiene corredores ni outs previos. Fuente de los pagos terminales: tabla de run values de The Book / FanGraphs 2006 (insidethebook.com, 'Run values of events'): sencillo 0.47, doble 0.77, triple 1.09, jonron 1.39, base por bolas 0.32, HBP 0.35, ponche -0.30, out en roletazo -0.24, out en elevado -0.28. Supuestos propios que no estan en esa tabla: error = 0.47 (como sencillo); FieldersChoice y Sacrificio = out segun hit_type; out sin hit_type = -0.26; bunt = roletazo. Son constantes de otro entorno de carreras (MLB 2006): aproximaciones, no valores de LMB.</w:t>
+      </w:r>
+    </w:p>
+    <w:p>
+      <w:pPr>
+        <w:pStyle w:val="Heading2"/>
+      </w:pPr>
+      <w:r>
+        <w:t>29.2 Paso 1: sensibilidad al peso de groundball (sin tocar V1)</w:t>
+      </w:r>
+    </w:p>
+    <w:p>
+      <w:pPr/>
+      <w:r>
+        <w:t>El score es lineal en los z, asi que delta(w) = suma de los otros cuatro componentes + w x groundball, con w el peso relativo de groundball (1 = V1). Punto de quiebre (w donde delta = 0), con IC95% bootstrap por pitcher:</w:t>
+      </w:r>
+    </w:p>
+    <w:tbl>
+      <w:tblPr>
+        <w:tblStyle w:val="TableGrid"/>
+        <w:tblW w:type="auto" w:w="0"/>
+        <w:tblLook w:firstColumn="1" w:firstRow="1" w:lastColumn="0" w:lastRow="0" w:noHBand="0" w:noVBand="1" w:val="04A0"/>
+      </w:tblPr>
+      <w:tblGrid>
+        <w:gridCol w:w="2556"/>
+        <w:gridCol w:w="2556"/>
+        <w:gridCol w:w="2556"/>
+        <w:gridCol w:w="2556"/>
+      </w:tblGrid>
+      <w:tr>
+        <w:tc>
+          <w:tcPr>
+            <w:tcW w:type="dxa" w:w="2556"/>
+          </w:tcPr>
+          <w:p>
+            <w:r>
+              <w:t>Pitch type</w:t>
+            </w:r>
+          </w:p>
+        </w:tc>
+        <w:tc>
+          <w:tcPr>
+            <w:tcW w:type="dxa" w:w="2556"/>
+          </w:tcPr>
+          <w:p>
+            <w:r>
+              <w:t>Quiebre 2024-25-&gt;2026</w:t>
+            </w:r>
+          </w:p>
+        </w:tc>
+        <w:tc>
+          <w:tcPr>
+            <w:tcW w:type="dxa" w:w="2556"/>
+          </w:tcPr>
+          <w:p>
+            <w:r>
+              <w:t>Quiebre 2024-&gt;2025</w:t>
+            </w:r>
+          </w:p>
+        </w:tc>
+        <w:tc>
+          <w:tcPr>
+            <w:tcW w:type="dxa" w:w="2556"/>
+          </w:tcPr>
+          <w:p>
+            <w:r>
+              <w:t>Lectura</w:t>
+            </w:r>
+          </w:p>
+        </w:tc>
+      </w:tr>
+      <w:tr>
+        <w:tc>
+          <w:tcPr>
+            <w:tcW w:type="dxa" w:w="2556"/>
+          </w:tcPr>
+          <w:p>
+            <w:r>
+              <w:t>Four-Seam</w:t>
+            </w:r>
+          </w:p>
+        </w:tc>
+        <w:tc>
+          <w:tcPr>
+            <w:tcW w:type="dxa" w:w="2556"/>
+          </w:tcPr>
+          <w:p>
+            <w:r>
+              <w:t>0.88 [0.80, 0.95]</w:t>
+            </w:r>
+          </w:p>
+        </w:tc>
+        <w:tc>
+          <w:tcPr>
+            <w:tcW w:type="dxa" w:w="2556"/>
+          </w:tcPr>
+          <w:p>
+            <w:r>
+              <w:t>0.76 [0.70, 0.82]</w:t>
+            </w:r>
+          </w:p>
+        </w:tc>
+        <w:tc>
+          <w:tcPr>
+            <w:tcW w:type="dxa" w:w="2556"/>
+          </w:tcPr>
+          <w:p>
+            <w:r>
+              <w:t>positivo solo si groundball pesa casi lo mismo que whiff</w:t>
+            </w:r>
+          </w:p>
+        </w:tc>
+      </w:tr>
+      <w:tr>
+        <w:tc>
+          <w:tcPr>
+            <w:tcW w:type="dxa" w:w="2556"/>
+          </w:tcPr>
+          <w:p>
+            <w:r>
+              <w:t>Sinker</w:t>
+            </w:r>
+          </w:p>
+        </w:tc>
+        <w:tc>
+          <w:tcPr>
+            <w:tcW w:type="dxa" w:w="2556"/>
+          </w:tcPr>
+          <w:p>
+            <w:r>
+              <w:t>0.49 [0.37, 0.66]</w:t>
+            </w:r>
+          </w:p>
+        </w:tc>
+        <w:tc>
+          <w:tcPr>
+            <w:tcW w:type="dxa" w:w="2556"/>
+          </w:tcPr>
+          <w:p>
+            <w:r>
+              <w:t>0.55 [0.41, 0.70]</w:t>
+            </w:r>
+          </w:p>
+        </w:tc>
+        <w:tc>
+          <w:tcPr>
+            <w:tcW w:type="dxa" w:w="2556"/>
+          </w:tcPr>
+          <w:p>
+            <w:r>
+              <w:t>positivo si w &gt; ~0.5</w:t>
+            </w:r>
+          </w:p>
+        </w:tc>
+      </w:tr>
+      <w:tr>
+        <w:tc>
+          <w:tcPr>
+            <w:tcW w:type="dxa" w:w="2556"/>
+          </w:tcPr>
+          <w:p>
+            <w:r>
+              <w:t>Changeup</w:t>
+            </w:r>
+          </w:p>
+        </w:tc>
+        <w:tc>
+          <w:tcPr>
+            <w:tcW w:type="dxa" w:w="2556"/>
+          </w:tcPr>
+          <w:p>
+            <w:r>
+              <w:t>0.40 [0.14, 0.82]</w:t>
+            </w:r>
+          </w:p>
+        </w:tc>
+        <w:tc>
+          <w:tcPr>
+            <w:tcW w:type="dxa" w:w="2556"/>
+          </w:tcPr>
+          <w:p>
+            <w:r>
+              <w:t>0.58 [0.30, 0.94]</w:t>
+            </w:r>
+          </w:p>
+        </w:tc>
+        <w:tc>
+          <w:tcPr>
+            <w:tcW w:type="dxa" w:w="2556"/>
+          </w:tcPr>
+          <w:p>
+            <w:r>
+              <w:t>positivo si w &gt; ~0.4-0.6</w:t>
+            </w:r>
+          </w:p>
+        </w:tc>
+      </w:tr>
+      <w:tr>
+        <w:tc>
+          <w:tcPr>
+            <w:tcW w:type="dxa" w:w="2556"/>
+          </w:tcPr>
+          <w:p>
+            <w:r>
+              <w:t>Slider</w:t>
+            </w:r>
+          </w:p>
+        </w:tc>
+        <w:tc>
+          <w:tcPr>
+            <w:tcW w:type="dxa" w:w="2556"/>
+          </w:tcPr>
+          <w:p>
+            <w:r>
+              <w:t>no definido (signo de groundball inestable)</w:t>
+            </w:r>
+          </w:p>
+        </w:tc>
+        <w:tc>
+          <w:tcPr>
+            <w:tcW w:type="dxa" w:w="2556"/>
+          </w:tcPr>
+          <w:p>
+            <w:r>
+              <w:t>1.32 [1.01, 1.79]</w:t>
+            </w:r>
+          </w:p>
+        </w:tc>
+        <w:tc>
+          <w:tcPr>
+            <w:tcW w:type="dxa" w:w="2556"/>
+          </w:tcPr>
+          <w:p>
+            <w:r>
+              <w:t>negativo salvo w muy alto</w:t>
+            </w:r>
+          </w:p>
+        </w:tc>
+      </w:tr>
+      <w:tr>
+        <w:tc>
+          <w:tcPr>
+            <w:tcW w:type="dxa" w:w="2556"/>
+          </w:tcPr>
+          <w:p>
+            <w:r>
+              <w:t>Curveball</w:t>
+            </w:r>
+          </w:p>
+        </w:tc>
+        <w:tc>
+          <w:tcPr>
+            <w:tcW w:type="dxa" w:w="2556"/>
+          </w:tcPr>
+          <w:p>
+            <w:r>
+              <w:t>negativo con cualquier w &gt;= 0</w:t>
+            </w:r>
+          </w:p>
+        </w:tc>
+        <w:tc>
+          <w:tcPr>
+            <w:tcW w:type="dxa" w:w="2556"/>
+          </w:tcPr>
+          <w:p>
+            <w:r>
+              <w:t>negativo con cualquier w &gt;= 0</w:t>
+            </w:r>
+          </w:p>
+        </w:tc>
+        <w:tc>
+          <w:tcPr>
+            <w:tcW w:type="dxa" w:w="2556"/>
+          </w:tcPr>
+          <w:p>
+            <w:r>
+              <w:t>robusto al peso</w:t>
+            </w:r>
+          </w:p>
+        </w:tc>
+      </w:tr>
+      <w:tr>
+        <w:tc>
+          <w:tcPr>
+            <w:tcW w:type="dxa" w:w="2556"/>
+          </w:tcPr>
+          <w:p>
+            <w:r>
+              <w:t>Cutter / Splitter</w:t>
+            </w:r>
+          </w:p>
+        </w:tc>
+        <w:tc>
+          <w:tcPr>
+            <w:tcW w:type="dxa" w:w="2556"/>
+          </w:tcPr>
+          <w:p>
+            <w:r>
+              <w:t>IC cruza 0 / no definido</w:t>
+            </w:r>
+          </w:p>
+        </w:tc>
+        <w:tc>
+          <w:tcPr>
+            <w:tcW w:type="dxa" w:w="2556"/>
+          </w:tcPr>
+          <w:p>
+            <w:r>
+              <w:t>IC cruza 0 / no definido</w:t>
+            </w:r>
+          </w:p>
+        </w:tc>
+        <w:tc>
+          <w:tcPr>
+            <w:tcW w:type="dxa" w:w="2556"/>
+          </w:tcPr>
+          <w:p>
+            <w:r>
+              <w:t>pocas celdas: baja confianza</w:t>
+            </w:r>
+          </w:p>
+        </w:tc>
+      </w:tr>
+    </w:tbl>
+    <w:p>
+      <w:pPr/>
+      <w:r>
+        <w:t>Con los cinco pesos en 0.20 (w = 1), Four-Seam, Sinker y Changeup quedan del lado positivo por poco. Curveball es negativo para cualquier peso no negativo de groundball.</w:t>
+      </w:r>
+    </w:p>
+    <w:p>
+      <w:pPr>
+        <w:pStyle w:val="Heading2"/>
+      </w:pPr>
+      <w:r>
+        <w:t>29.3 Paso 2: valor por conteo (cadena de Markov)</w:t>
+      </w:r>
+    </w:p>
+    <w:p>
+      <w:pPr/>
+      <w:r>
+        <w:t>12 estados (Balls 0-3 x Strikes 0-2). Se verifico que Balls/Strikes son el conteo previo al pitch (99.95% de los ponches ocurren con 2 strikes; 99.98% de las bases por bolas con 3 bolas). Las transiciones (bola, strike, foul, bola en juego, HBP) se estiman por conteo con PitchCall solo con el historial de cada ventana; con 2 strikes el foul no cambia el conteo. No requiere reconstruir plate appearances. Los eventos terminales usan los pagos de 29.1. Valor realizado por pitch, desde la perspectiva del pitcher: y = -(V(estado siguiente o pago terminal) - V(conteo actual)). No es un run expectancy de 24 estados. Sanidad (ventana 2024-25-&gt;2026, perspectiva ofensiva, runs): V(0-0) = +0.033, V(3-0) = +0.221, V(0-2) = -0.080, V(3-2) = +0.074. Fuera de muestra, el valor realizado promedia ~0 por conteo (|media| &lt;= 0.010 runs), como debe ser.</w:t>
+      </w:r>
+    </w:p>
+    <w:p>
+      <w:pPr>
+        <w:pStyle w:val="Heading2"/>
+      </w:pPr>
+      <w:r>
+        <w:t>29.4 Paso 4: pesos aprendidos (no negativos, ridge leve, normalizados a suma 1)</w:t>
+      </w:r>
+    </w:p>
+    <w:tbl>
+      <w:tblPr>
+        <w:tblStyle w:val="TableGrid"/>
+        <w:tblW w:type="auto" w:w="0"/>
+        <w:tblLook w:firstColumn="1" w:firstRow="1" w:lastColumn="0" w:lastRow="0" w:noHBand="0" w:noVBand="1" w:val="04A0"/>
+      </w:tblPr>
+      <w:tblGrid>
+        <w:gridCol w:w="2556"/>
+        <w:gridCol w:w="2556"/>
+        <w:gridCol w:w="2556"/>
+        <w:gridCol w:w="2556"/>
+      </w:tblGrid>
+      <w:tr>
+        <w:tc>
+          <w:tcPr>
+            <w:tcW w:type="dxa" w:w="2556"/>
+          </w:tcPr>
+          <w:p>
+            <w:r>
+              <w:t>Componente</w:t>
+            </w:r>
+          </w:p>
+        </w:tc>
+        <w:tc>
+          <w:tcPr>
+            <w:tcW w:type="dxa" w:w="2556"/>
+          </w:tcPr>
+          <w:p>
+            <w:r>
+              <w:t>V1</w:t>
+            </w:r>
+          </w:p>
+        </w:tc>
+        <w:tc>
+          <w:tcPr>
+            <w:tcW w:type="dxa" w:w="2556"/>
+          </w:tcPr>
+          <w:p>
+            <w:r>
+              <w:t>V2 (2024-&gt;2025)</w:t>
+            </w:r>
+          </w:p>
+        </w:tc>
+        <w:tc>
+          <w:tcPr>
+            <w:tcW w:type="dxa" w:w="2556"/>
+          </w:tcPr>
+          <w:p>
+            <w:r>
+              <w:t>V2 (2024-25-&gt;2026)</w:t>
+            </w:r>
+          </w:p>
+        </w:tc>
+      </w:tr>
+      <w:tr>
+        <w:tc>
+          <w:tcPr>
+            <w:tcW w:type="dxa" w:w="2556"/>
+          </w:tcPr>
+          <w:p>
+            <w:r>
+              <w:t>p_called_strike</w:t>
+            </w:r>
+          </w:p>
+        </w:tc>
+        <w:tc>
+          <w:tcPr>
+            <w:tcW w:type="dxa" w:w="2556"/>
+          </w:tcPr>
+          <w:p>
+            <w:r>
+              <w:t>0.20</w:t>
+            </w:r>
+          </w:p>
+        </w:tc>
+        <w:tc>
+          <w:tcPr>
+            <w:tcW w:type="dxa" w:w="2556"/>
+          </w:tcPr>
+          <w:p>
+            <w:r>
+              <w:t>0.370 [0.348, 0.388]</w:t>
+            </w:r>
+          </w:p>
+        </w:tc>
+        <w:tc>
+          <w:tcPr>
+            <w:tcW w:type="dxa" w:w="2556"/>
+          </w:tcPr>
+          <w:p>
+            <w:r>
+              <w:t>0.416 [0.393, 0.436]</w:t>
+            </w:r>
+          </w:p>
+        </w:tc>
+      </w:tr>
+      <w:tr>
+        <w:tc>
+          <w:tcPr>
+            <w:tcW w:type="dxa" w:w="2556"/>
+          </w:tcPr>
+          <w:p>
+            <w:r>
+              <w:t>p_chase_given_outside_zone</w:t>
+            </w:r>
+          </w:p>
+        </w:tc>
+        <w:tc>
+          <w:tcPr>
+            <w:tcW w:type="dxa" w:w="2556"/>
+          </w:tcPr>
+          <w:p>
+            <w:r>
+              <w:t>0.20</w:t>
+            </w:r>
+          </w:p>
+        </w:tc>
+        <w:tc>
+          <w:tcPr>
+            <w:tcW w:type="dxa" w:w="2556"/>
+          </w:tcPr>
+          <w:p>
+            <w:r>
+              <w:t>0.305 [0.268, 0.340]</w:t>
+            </w:r>
+          </w:p>
+        </w:tc>
+        <w:tc>
+          <w:tcPr>
+            <w:tcW w:type="dxa" w:w="2556"/>
+          </w:tcPr>
+          <w:p>
+            <w:r>
+              <w:t>0.282 [0.243, 0.320]</w:t>
+            </w:r>
+          </w:p>
+        </w:tc>
+      </w:tr>
+      <w:tr>
+        <w:tc>
+          <w:tcPr>
+            <w:tcW w:type="dxa" w:w="2556"/>
+          </w:tcPr>
+          <w:p>
+            <w:r>
+              <w:t>p_whiff_per_pitch</w:t>
+            </w:r>
+          </w:p>
+        </w:tc>
+        <w:tc>
+          <w:tcPr>
+            <w:tcW w:type="dxa" w:w="2556"/>
+          </w:tcPr>
+          <w:p>
+            <w:r>
+              <w:t>0.20</w:t>
+            </w:r>
+          </w:p>
+        </w:tc>
+        <w:tc>
+          <w:tcPr>
+            <w:tcW w:type="dxa" w:w="2556"/>
+          </w:tcPr>
+          <w:p>
+            <w:r>
+              <w:t>0.264 [0.224, 0.306]</w:t>
+            </w:r>
+          </w:p>
+        </w:tc>
+        <w:tc>
+          <w:tcPr>
+            <w:tcW w:type="dxa" w:w="2556"/>
+          </w:tcPr>
+          <w:p>
+            <w:r>
+              <w:t>0.303 [0.266, 0.332]</w:t>
+            </w:r>
+          </w:p>
+        </w:tc>
+      </w:tr>
+      <w:tr>
+        <w:tc>
+          <w:tcPr>
+            <w:tcW w:type="dxa" w:w="2556"/>
+          </w:tcPr>
+          <w:p>
+            <w:r>
+              <w:t>p_whiff_given_swing</w:t>
+            </w:r>
+          </w:p>
+        </w:tc>
+        <w:tc>
+          <w:tcPr>
+            <w:tcW w:type="dxa" w:w="2556"/>
+          </w:tcPr>
+          <w:p>
+            <w:r>
+              <w:t>0.20</w:t>
+            </w:r>
+          </w:p>
+        </w:tc>
+        <w:tc>
+          <w:tcPr>
+            <w:tcW w:type="dxa" w:w="2556"/>
+          </w:tcPr>
+          <w:p>
+            <w:r>
+              <w:t>0.061 [0.034, 0.083]</w:t>
+            </w:r>
+          </w:p>
+        </w:tc>
+        <w:tc>
+          <w:tcPr>
+            <w:tcW w:type="dxa" w:w="2556"/>
+          </w:tcPr>
+          <w:p>
+            <w:r>
+              <w:t>0.000 [0.000, 0.004]</w:t>
+            </w:r>
+          </w:p>
+        </w:tc>
+      </w:tr>
+      <w:tr>
+        <w:tc>
+          <w:tcPr>
+            <w:tcW w:type="dxa" w:w="2556"/>
+          </w:tcPr>
+          <w:p>
+            <w:r>
+              <w:t>p_groundball_given_contact</w:t>
+            </w:r>
+          </w:p>
+        </w:tc>
+        <w:tc>
+          <w:tcPr>
+            <w:tcW w:type="dxa" w:w="2556"/>
+          </w:tcPr>
+          <w:p>
+            <w:r>
+              <w:t>0.20</w:t>
+            </w:r>
+          </w:p>
+        </w:tc>
+        <w:tc>
+          <w:tcPr>
+            <w:tcW w:type="dxa" w:w="2556"/>
+          </w:tcPr>
+          <w:p>
+            <w:r>
+              <w:t>0.000 [0.000, 0.025]</w:t>
+            </w:r>
+          </w:p>
+        </w:tc>
+        <w:tc>
+          <w:tcPr>
+            <w:tcW w:type="dxa" w:w="2556"/>
+          </w:tcPr>
+          <w:p>
+            <w:r>
+              <w:t>0.000 [0.000, 0.026]</w:t>
+            </w:r>
+          </w:p>
+        </w:tc>
+      </w:tr>
+    </w:tbl>
+    <w:p>
+      <w:pPr/>
+      <w:r>
+        <w:t>Lectura. (1) Groundball cae a ~0 y whiff dado swing a ~0: V1 sobre-ponderaba groundball (0.20 vs &lt;= 0.026) y contaba dos veces el whiff. (2) Groundball SI vale mas que un elevado en pago terminal (+0.022 vs +0.141 runs por bola en juego, diferencia 0.12), pero solo el 18% de los pitches son bolas en juego, el modelo de groundball es debil (AUC 0.65) y un indice lineal en z no puede representar el efecto multiplicativo P(contacto) x p_groundball; su valor por pitch (~0.003 runs por SD) es unas cuatro veces menor que el de called strike. Se lee como 'peso pequeno, muy por debajo de 0.20', no como cero exacto. (3) Estabilidad: la diferencia maxima entre ventanas es 0.061 (&lt;= 0.10, umbral interno) y el orden es el mismo, pero los IC95% no solapan en called strike y whiff dado swing; el criterio estricto (IC solapan en todos y diferencia &lt;= 0.10) NO se cumple. Por la regla acordada, V2 se reporta como analisis de sensibilidad, no como reemplazo definitivo.</w:t>
+      </w:r>
+    </w:p>
+    <w:p>
+      <w:pPr>
+        <w:pStyle w:val="Heading2"/>
+      </w:pPr>
+      <w:r>
+        <w:t>29.5 Fuera de muestra: contra el baseline nulo (criterio 1)</w:t>
+      </w:r>
+    </w:p>
+    <w:p>
+      <w:pPr/>
+      <w:r>
+        <w:t>Baseline nulo = xRunValue promedio por conteo, que por construccion es 0 (E[y|conteo] = 0). Pesos aprendidos en 2025 y evaluados hacia adelante en 2026 (valor realizado por pitch, RMSE en runs): nulo 0.21925; V1 0.21840 (reduccion de MSE 0.78% [0.67, 0.89]); V2 0.21702 (2.02% [1.83, 2.22]); V2 vs V1 1.25% [1.11, 1.40]. Sentido inverso (pesos de 2026 en 2025): 0.79%, 1.71% y 0.93%. IC95% bootstrap por pitcher. El compuesto supera al baseline por conteo de forma consistente y V2 supera a V1, pero las magnitudes son pequenas: el valor de un pitch individual es dominado por ruido.</w:t>
+      </w:r>
+    </w:p>
+    <w:p>
+      <w:pPr>
+        <w:pStyle w:val="Heading2"/>
+      </w:pPr>
+      <w:r>
+        <w:t>29.6 Paso 6: matriz V1 vs V2 y niveles de evidencia</w:t>
+      </w:r>
+    </w:p>
+    <w:tbl>
+      <w:tblPr>
+        <w:tblStyle w:val="TableGrid"/>
+        <w:tblW w:type="auto" w:w="0"/>
+        <w:tblLook w:firstColumn="1" w:firstRow="1" w:lastColumn="0" w:lastRow="0" w:noHBand="0" w:noVBand="1" w:val="04A0"/>
+      </w:tblPr>
+      <w:tblGrid>
+        <w:gridCol w:w="1704"/>
+        <w:gridCol w:w="1704"/>
+        <w:gridCol w:w="1704"/>
+        <w:gridCol w:w="1704"/>
+        <w:gridCol w:w="1704"/>
+        <w:gridCol w:w="1704"/>
+      </w:tblGrid>
+      <w:tr>
+        <w:tc>
+          <w:tcPr>
+            <w:tcW w:type="dxa" w:w="1704"/>
+          </w:tcPr>
+          <w:p>
+            <w:r>
+              <w:t>Pitch type</w:t>
+            </w:r>
+          </w:p>
+        </w:tc>
+        <w:tc>
+          <w:tcPr>
+            <w:tcW w:type="dxa" w:w="1704"/>
+          </w:tcPr>
+          <w:p>
+            <w:r>
+              <w:t>V1</w:t>
+            </w:r>
+          </w:p>
+        </w:tc>
+        <w:tc>
+          <w:tcPr>
+            <w:tcW w:type="dxa" w:w="1704"/>
+          </w:tcPr>
+          <w:p>
+            <w:r>
+              <w:t>V2 propio</w:t>
+            </w:r>
+          </w:p>
+        </w:tc>
+        <w:tc>
+          <w:tcPr>
+            <w:tcW w:type="dxa" w:w="1704"/>
+          </w:tcPr>
+          <w:p>
+            <w:r>
+              <w:t>V2 cruzado</w:t>
+            </w:r>
+          </w:p>
+        </w:tc>
+        <w:tc>
+          <w:tcPr>
+            <w:tcW w:type="dxa" w:w="1704"/>
+          </w:tcPr>
+          <w:p>
+            <w:r>
+              <w:t>V2-stuff</w:t>
+            </w:r>
+          </w:p>
+        </w:tc>
+        <w:tc>
+          <w:tcPr>
+            <w:tcW w:type="dxa" w:w="1704"/>
+          </w:tcPr>
+          <w:p>
+            <w:r>
+              <w:t>Nivel de evidencia</w:t>
+            </w:r>
+          </w:p>
+        </w:tc>
+      </w:tr>
+      <w:tr>
+        <w:tc>
+          <w:tcPr>
+            <w:tcW w:type="dxa" w:w="1704"/>
+          </w:tcPr>
+          <w:p>
+            <w:r>
+              <w:t>Four-Seam</w:t>
+            </w:r>
+          </w:p>
+        </w:tc>
+        <w:tc>
+          <w:tcPr>
+            <w:tcW w:type="dxa" w:w="1704"/>
+          </w:tcPr>
+          <w:p>
+            <w:r>
+              <w:t>+0.28</w:t>
+            </w:r>
+          </w:p>
+        </w:tc>
+        <w:tc>
+          <w:tcPr>
+            <w:tcW w:type="dxa" w:w="1704"/>
+          </w:tcPr>
+          <w:p>
+            <w:r>
+              <w:t>-1.44</w:t>
+            </w:r>
+          </w:p>
+        </w:tc>
+        <w:tc>
+          <w:tcPr>
+            <w:tcW w:type="dxa" w:w="1704"/>
+          </w:tcPr>
+          <w:p>
+            <w:r>
+              <w:t>-1.56</w:t>
+            </w:r>
+          </w:p>
+        </w:tc>
+        <w:tc>
+          <w:tcPr>
+            <w:tcW w:type="dxa" w:w="1704"/>
+          </w:tcPr>
+          <w:p>
+            <w:r>
+              <w:t>-2.17</w:t>
+            </w:r>
+          </w:p>
+        </w:tc>
+        <w:tc>
+          <w:tcPr>
+            <w:tcW w:type="dxa" w:w="1704"/>
+          </w:tcPr>
+          <w:p>
+            <w:r>
+              <w:t>Condicional (unico &gt;= 1 pt bajo V2)</w:t>
+            </w:r>
+          </w:p>
+        </w:tc>
+      </w:tr>
+      <w:tr>
+        <w:tc>
+          <w:tcPr>
+            <w:tcW w:type="dxa" w:w="1704"/>
+          </w:tcPr>
+          <w:p>
+            <w:r>
+              <w:t>Sinker</w:t>
+            </w:r>
+          </w:p>
+        </w:tc>
+        <w:tc>
+          <w:tcPr>
+            <w:tcW w:type="dxa" w:w="1704"/>
+          </w:tcPr>
+          <w:p>
+            <w:r>
+              <w:t>+0.36</w:t>
+            </w:r>
+          </w:p>
+        </w:tc>
+        <w:tc>
+          <w:tcPr>
+            <w:tcW w:type="dxa" w:w="1704"/>
+          </w:tcPr>
+          <w:p>
+            <w:r>
+              <w:t>-0.47</w:t>
+            </w:r>
+          </w:p>
+        </w:tc>
+        <w:tc>
+          <w:tcPr>
+            <w:tcW w:type="dxa" w:w="1704"/>
+          </w:tcPr>
+          <w:p>
+            <w:r>
+              <w:t>-0.47</w:t>
+            </w:r>
+          </w:p>
+        </w:tc>
+        <w:tc>
+          <w:tcPr>
+            <w:tcW w:type="dxa" w:w="1704"/>
+          </w:tcPr>
+          <w:p>
+            <w:r>
+              <w:t>-0.22</w:t>
+            </w:r>
+          </w:p>
+        </w:tc>
+        <w:tc>
+          <w:tcPr>
+            <w:tcW w:type="dxa" w:w="1704"/>
+          </w:tcPr>
+          <w:p>
+            <w:r>
+              <w:t>Condicional</w:t>
+            </w:r>
+          </w:p>
+        </w:tc>
+      </w:tr>
+      <w:tr>
+        <w:tc>
+          <w:tcPr>
+            <w:tcW w:type="dxa" w:w="1704"/>
+          </w:tcPr>
+          <w:p>
+            <w:r>
+              <w:t>Changeup</w:t>
+            </w:r>
+          </w:p>
+        </w:tc>
+        <w:tc>
+          <w:tcPr>
+            <w:tcW w:type="dxa" w:w="1704"/>
+          </w:tcPr>
+          <w:p>
+            <w:r>
+              <w:t>+0.28</w:t>
+            </w:r>
+          </w:p>
+        </w:tc>
+        <w:tc>
+          <w:tcPr>
+            <w:tcW w:type="dxa" w:w="1704"/>
+          </w:tcPr>
+          <w:p>
+            <w:r>
+              <w:t>-0.12</w:t>
+            </w:r>
+          </w:p>
+        </w:tc>
+        <w:tc>
+          <w:tcPr>
+            <w:tcW w:type="dxa" w:w="1704"/>
+          </w:tcPr>
+          <w:p>
+            <w:r>
+              <w:t>-0.15</w:t>
+            </w:r>
+          </w:p>
+        </w:tc>
+        <w:tc>
+          <w:tcPr>
+            <w:tcW w:type="dxa" w:w="1704"/>
+          </w:tcPr>
+          <w:p>
+            <w:r>
+              <w:t>-0.02 (IC cruza 0)</w:t>
+            </w:r>
+          </w:p>
+        </w:tc>
+        <w:tc>
+          <w:tcPr>
+            <w:tcW w:type="dxa" w:w="1704"/>
+          </w:tcPr>
+          <w:p>
+            <w:r>
+              <w:t>Condicional</w:t>
+            </w:r>
+          </w:p>
+        </w:tc>
+      </w:tr>
+      <w:tr>
+        <w:tc>
+          <w:tcPr>
+            <w:tcW w:type="dxa" w:w="1704"/>
+          </w:tcPr>
+          <w:p>
+            <w:r>
+              <w:t>Slider</w:t>
+            </w:r>
+          </w:p>
+        </w:tc>
+        <w:tc>
+          <w:tcPr>
+            <w:tcW w:type="dxa" w:w="1704"/>
+          </w:tcPr>
+          <w:p>
+            <w:r>
+              <w:t>-0.33</w:t>
+            </w:r>
+          </w:p>
+        </w:tc>
+        <w:tc>
+          <w:tcPr>
+            <w:tcW w:type="dxa" w:w="1704"/>
+          </w:tcPr>
+          <w:p>
+            <w:r>
+              <w:t>-0.43</w:t>
+            </w:r>
+          </w:p>
+        </w:tc>
+        <w:tc>
+          <w:tcPr>
+            <w:tcW w:type="dxa" w:w="1704"/>
+          </w:tcPr>
+          <w:p>
+            <w:r>
+              <w:t>-0.44</w:t>
+            </w:r>
+          </w:p>
+        </w:tc>
+        <w:tc>
+          <w:tcPr>
+            <w:tcW w:type="dxa" w:w="1704"/>
+          </w:tcPr>
+          <w:p>
+            <w:r>
+              <w:t>-0.39</w:t>
+            </w:r>
+          </w:p>
+        </w:tc>
+        <w:tc>
+          <w:tcPr>
+            <w:tcW w:type="dxa" w:w="1704"/>
+          </w:tcPr>
+          <w:p>
+            <w:r>
+              <w:t>Robusto (efecto &lt; 1 pt)</w:t>
+            </w:r>
+          </w:p>
+        </w:tc>
+      </w:tr>
+      <w:tr>
+        <w:tc>
+          <w:tcPr>
+            <w:tcW w:type="dxa" w:w="1704"/>
+          </w:tcPr>
+          <w:p>
+            <w:r>
+              <w:t>Curveball</w:t>
+            </w:r>
+          </w:p>
+        </w:tc>
+        <w:tc>
+          <w:tcPr>
+            <w:tcW w:type="dxa" w:w="1704"/>
+          </w:tcPr>
+          <w:p>
+            <w:r>
+              <w:t>-0.78</w:t>
+            </w:r>
+          </w:p>
+        </w:tc>
+        <w:tc>
+          <w:tcPr>
+            <w:tcW w:type="dxa" w:w="1704"/>
+          </w:tcPr>
+          <w:p>
+            <w:r>
+              <w:t>-0.22</w:t>
+            </w:r>
+          </w:p>
+        </w:tc>
+        <w:tc>
+          <w:tcPr>
+            <w:tcW w:type="dxa" w:w="1704"/>
+          </w:tcPr>
+          <w:p>
+            <w:r>
+              <w:t>-0.20</w:t>
+            </w:r>
+          </w:p>
+        </w:tc>
+        <w:tc>
+          <w:tcPr>
+            <w:tcW w:type="dxa" w:w="1704"/>
+          </w:tcPr>
+          <w:p>
+            <w:r>
+              <w:t>-0.15 (IC cruza 0)</w:t>
+            </w:r>
+          </w:p>
+        </w:tc>
+        <w:tc>
+          <w:tcPr>
+            <w:tcW w:type="dxa" w:w="1704"/>
+          </w:tcPr>
+          <w:p>
+            <w:r>
+              <w:t>Robusto (efecto &lt; 1 pt)</w:t>
+            </w:r>
+          </w:p>
+        </w:tc>
+      </w:tr>
+      <w:tr>
+        <w:tc>
+          <w:tcPr>
+            <w:tcW w:type="dxa" w:w="1704"/>
+          </w:tcPr>
+          <w:p>
+            <w:r>
+              <w:t>Cutter</w:t>
+            </w:r>
+          </w:p>
+        </w:tc>
+        <w:tc>
+          <w:tcPr>
+            <w:tcW w:type="dxa" w:w="1704"/>
+          </w:tcPr>
+          <w:p>
+            <w:r>
+              <w:t>+0.63</w:t>
+            </w:r>
+          </w:p>
+        </w:tc>
+        <w:tc>
+          <w:tcPr>
+            <w:tcW w:type="dxa" w:w="1704"/>
+          </w:tcPr>
+          <w:p>
+            <w:r>
+              <w:t>-0.18</w:t>
+            </w:r>
+          </w:p>
+        </w:tc>
+        <w:tc>
+          <w:tcPr>
+            <w:tcW w:type="dxa" w:w="1704"/>
+          </w:tcPr>
+          <w:p>
+            <w:r>
+              <w:t>-0.17</w:t>
+            </w:r>
+          </w:p>
+        </w:tc>
+        <w:tc>
+          <w:tcPr>
+            <w:tcW w:type="dxa" w:w="1704"/>
+          </w:tcPr>
+          <w:p>
+            <w:r>
+              <w:t>+0.09</w:t>
+            </w:r>
+          </w:p>
+        </w:tc>
+        <w:tc>
+          <w:tcPr>
+            <w:tcW w:type="dxa" w:w="1704"/>
+          </w:tcPr>
+          <w:p>
+            <w:r>
+              <w:t>Incierto (24-41 celdas)</w:t>
+            </w:r>
+          </w:p>
+        </w:tc>
+      </w:tr>
+      <w:tr>
+        <w:tc>
+          <w:tcPr>
+            <w:tcW w:type="dxa" w:w="1704"/>
+          </w:tcPr>
+          <w:p>
+            <w:r>
+              <w:t>Splitter</w:t>
+            </w:r>
+          </w:p>
+        </w:tc>
+        <w:tc>
+          <w:tcPr>
+            <w:tcW w:type="dxa" w:w="1704"/>
+          </w:tcPr>
+          <w:p>
+            <w:r>
+              <w:t>-0.83</w:t>
+            </w:r>
+          </w:p>
+        </w:tc>
+        <w:tc>
+          <w:tcPr>
+            <w:tcW w:type="dxa" w:w="1704"/>
+          </w:tcPr>
+          <w:p>
+            <w:r>
+              <w:t>-0.38</w:t>
+            </w:r>
+          </w:p>
+        </w:tc>
+        <w:tc>
+          <w:tcPr>
+            <w:tcW w:type="dxa" w:w="1704"/>
+          </w:tcPr>
+          <w:p>
+            <w:r>
+              <w:t>-0.41</w:t>
+            </w:r>
+          </w:p>
+        </w:tc>
+        <w:tc>
+          <w:tcPr>
+            <w:tcW w:type="dxa" w:w="1704"/>
+          </w:tcPr>
+          <w:p>
+            <w:r>
+              <w:t>-0.53</w:t>
+            </w:r>
+          </w:p>
+        </w:tc>
+        <w:tc>
+          <w:tcPr>
+            <w:tcW w:type="dxa" w:w="1704"/>
+          </w:tcPr>
+          <w:p>
+            <w:r>
+              <w:t>Incierto (3-8 celdas)</w:t>
+            </w:r>
+          </w:p>
+        </w:tc>
+      </w:tr>
+    </w:tbl>
+    <w:p>
+      <w:pPr/>
+      <w:r>
+        <w:t>Puntos Stuff+ en la ventana 2024-25-&gt;2026, escalados por la SD del compuesto en la misma cohorte (por eso V1 difiere levemente de la seccion 28). V2 propio = pesos de esa ventana; V2 cruzado = pesos de la otra ventana; V2-stuff = pesos V2 renormalizados solo entre whiff, whiff dado swing y groundball. Niveles (criterio propio, umbrales internos): Robusto = en ambas ventanas V1, V2 propio y V2 cruzado excluyen 0 con el mismo signo, el chequeo inverso coincide y hay al menos 30 celdas; Condicional = senal consistente entre ventanas en algun esquema pero el signo cambia con los pesos; Incierto = menos de 30 celdas o signo inestable entre ventanas.</w:t>
+      </w:r>
+    </w:p>
+    <w:p>
+      <w:pPr/>
+      <w:r>
+        <w:t>Conclusion. Al pasar de V1 a V2, Four-Seam, Sinker y Changeup cambian de signo positivo a negativo. La razon es la vista en 29.2: su positivo en V1 dependia de un peso de groundball (0.20) muy por encima de los puntos de quiebre (0.4-0.9 relativo), y V2 le asigna ~0. Con V2, la perdida de Four-Seam viene del componente de whiff (contribucion -1.13 puntos en 2026), consistente con H1 (menos IVB, menos whiff), y en V2-stuff sube a -2.2. Curveball y Slider pierden con cualquier esquema, aunque por menos de 1 punto. Cutter y Splitter no permiten concluir.</w:t>
+      </w:r>
+    </w:p>
+    <w:p>
+      <w:pPr>
+        <w:pStyle w:val="Heading2"/>
+      </w:pPr>
+      <w:r>
+        <w:t>29.7 Limites y decision pendiente</w:t>
+      </w:r>
+    </w:p>
+    <w:p>
+      <w:pPr/>
+      <w:r>
+        <w:t>(a) Los pagos terminales son constantes de MLB 2006, no de LMB, con supuestos propios para error, FieldersChoice y sacrificio. (b) V2 esta dominado por called strike y chase (peso conjunto ~0.7), justo los componentes donde el contrafactual que mantiene la ubicacion fija y desplaza angulos de aproximacion es menos interpretable: para Curveball, por ejemplo, el efecto V2 viene de called strike (-0.27), no de whiff. Para Four-Seam el motor es whiff, mas solido. (c) El indice lineal subestima groundball de forma estructural. (d) Los pesos se aprenden en la misma cohorte que se evalua (cinco parametros, ridge, bootstrap por pitcher) y se valida hacia adelante en el tiempo. (e) Estabilidad de coeficientes no cumplida bajo el criterio estricto. Decision para el equipo: que score se publica como oficial. Recomendacion: mantener V1 como escala oficial transparente (definida en el brief como combinacion ponderada con desglose por componente), reportar V2 como lectura ligada a valor de carrera, y basar las recomendaciones operativas en la tabla de niveles de evidencia, sin titulares categoricos en rectas.</w:t>
       </w:r>
     </w:p>
     <w:sectPr>

</xml_diff>

<commit_message>
Dashboard Pitching Decision System (fases 1-4) y capa de datos
- 23_dashboard_data.py: tablas del dashboard y reglas de producto.
- dashboard/: app Streamlit con Roster, Player, Simulator, Scouting y Game;
  motor (engine.py) verificado contra los scores oficiales de 18.
- Analisis de factibilidad del diseño, wireframes, requirements.txt.
- Guia (seccion 37), bitacora (ID 49-52) y README actualizados.
- .gitignore: se quita la regla '.json' (no ignoraba nada util) y se
  excluyen .claude/, dashboard/data/ y dashboard/state/.

Punto de control previo a las correcciones de la auditoria 2.

Co-Authored-By: Claude Opus 5.5 <noreply@anthropic.com>
</commit_message>
<xml_diff>
--- a/ISAC_Diablos_Rojos_Guia_Base_Modelado.docx
+++ b/ISAC_Diablos_Rojos_Guia_Base_Modelado.docx
@@ -23609,6 +23609,351 @@
       <w:pPr/>
       <w:r>
         <w:t>(1) Factores de Medium estimados con todas las temporadas (uso descriptivo y de producto; los de Extreme son solo con historial por ventana). (2) Transformacion comun para todos los tipos: el efecto por tipo proviene de como responde el Stuff+ a la forma del pitch, no de factores distintos por tipo. (3) Ubicacion, count y adaptacion del pitcher no se transforman: en secundarios el efecto neto observado es menor que el modelado. (4) Sin correccion por comparaciones multiples en shapes. (5) Cutter y Splitter con pocas celdas within-pitcher. (6) Extreme Altitude agrupa varios parques, no solo el Harp Helu.</w:t>
+      </w:r>
+    </w:p>
+    <w:p>
+      <w:pPr>
+        <w:pStyle w:val="Heading1"/>
+      </w:pPr>
+      <w:r>
+        <w:t>37. Dashboard — Pitching Decision System (fase 1)</w:t>
+      </w:r>
+    </w:p>
+    <w:p>
+      <w:pPr/>
+      <w:r>
+        <w:t>Estado: EN CURSO. Fase 1 cerrada (30/09/2026): analisis de factibilidad del diseño (Dashboard_Analisis_Factibilidad.md), capa de datos 23_dashboard_data.py y app Streamlit (dashboard/) con las pantallas Roster y Player Overview con datos reales. El dashboard no entrena ni modifica modelos: solo lee los outputs congelados de 17-22 (manifiesto de la guia 36.7).</w:t>
+      </w:r>
+    </w:p>
+    <w:p>
+      <w:pPr>
+        <w:pStyle w:val="Heading2"/>
+      </w:pPr>
+      <w:r>
+        <w:t>37.1 Hechos de los datos que cambiaron el diseño</w:t>
+      </w:r>
+    </w:p>
+    <w:p>
+      <w:pPr/>
+      <w:r>
+        <w:t>(1) El dataset no identifica equipos. Se reconstruyen por co-aparicion (pitchers que lanzan en la misma mitad de entrada de &gt;= 3 juegos y &gt;= 50% de las apariciones del menos activo): 19 grupos de 14-23 pitchers en 2026, consistente con los 20 equipos de la LMB. 4-5 son locales en Extreme Altitude, de modo que esa categoria agrupa varios parques y no solo el Harp Helu. Por eso el roster es configurable: equipo reconstruido (anonimo), lista personalizada persistida o liga completa. (2) No hay local/visitante por pitcher; el 'Home vs Away' del diseño se reemplaza por el delta de altitud (modelado) y el delta observado Extreme - No del mismo pitcher. (3) SP/RP se infiere (pitches por aparicion &gt;= 50 y &gt;= 50% de apariciones iniciando en la 1a entrada): 127 de 550 SP en 2026. (4) El timestamp del UUID v1 da fechas reales (2026: 24-mar a 13-jun), lo que habilita tendencias semanales.</w:t>
+      </w:r>
+    </w:p>
+    <w:p>
+      <w:pPr>
+        <w:pStyle w:val="Heading2"/>
+      </w:pPr>
+      <w:r>
+        <w:t>37.2 Reglas de producto (23_dashboard_data.py)</w:t>
+      </w:r>
+    </w:p>
+    <w:tbl>
+      <w:tblPr>
+        <w:tblStyle w:val="TableGrid"/>
+        <w:tblW w:type="auto" w:w="0"/>
+        <w:tblLook w:firstColumn="1" w:firstRow="1" w:lastColumn="0" w:lastRow="0" w:noHBand="0" w:noVBand="1" w:val="04A0"/>
+      </w:tblPr>
+      <w:tblGrid>
+        <w:gridCol w:w="5112"/>
+        <w:gridCol w:w="5112"/>
+      </w:tblGrid>
+      <w:tr>
+        <w:tc>
+          <w:tcPr>
+            <w:tcW w:type="dxa" w:w="5112"/>
+          </w:tcPr>
+          <w:p>
+            <w:r>
+              <w:t>Concepto</w:t>
+            </w:r>
+          </w:p>
+        </w:tc>
+        <w:tc>
+          <w:tcPr>
+            <w:tcW w:type="dxa" w:w="5112"/>
+          </w:tcPr>
+          <w:p>
+            <w:r>
+              <w:t>Definicion</w:t>
+            </w:r>
+          </w:p>
+        </w:tc>
+      </w:tr>
+      <w:tr>
+        <w:tc>
+          <w:tcPr>
+            <w:tcW w:type="dxa" w:w="5112"/>
+          </w:tcPr>
+          <w:p>
+            <w:r>
+              <w:t>Harp Helu Fit (pitcher)</w:t>
+            </w:r>
+          </w:p>
+        </w:tc>
+        <w:tc>
+          <w:tcPr>
+            <w:tcW w:type="dxa" w:w="5112"/>
+          </w:tcPr>
+          <w:p>
+            <w:r>
+              <w:t>Percentil del delta de altitud del arsenal (Stuff+ en Harp Helu - nivel del mar, ponderado por uso) entre pitchers con &gt;= 100 pitches: Strong &gt;= p75 (pierde menos), Moderate, Low, Poor &lt; p25. Mide resiliencia, no calidad.</w:t>
+            </w:r>
+          </w:p>
+        </w:tc>
+      </w:tr>
+      <w:tr>
+        <w:tc>
+          <w:tcPr>
+            <w:tcW w:type="dxa" w:w="5112"/>
+          </w:tcPr>
+          <w:p>
+            <w:r>
+              <w:t>Fit por pitch</w:t>
+            </w:r>
+          </w:p>
+        </w:tc>
+        <w:tc>
+          <w:tcPr>
+            <w:tcW w:type="dxa" w:w="5112"/>
+          </w:tcPr>
+          <w:p>
+            <w:r>
+              <w:t>Mismo criterio contra pitches del mismo tipo en la liga (&gt;= 50 pitches).</w:t>
+            </w:r>
+          </w:p>
+        </w:tc>
+      </w:tr>
+      <w:tr>
+        <w:tc>
+          <w:tcPr>
+            <w:tcW w:type="dxa" w:w="5112"/>
+          </w:tcPr>
+          <w:p>
+            <w:r>
+              <w:t>Semaforo por pitch</w:t>
+            </w:r>
+          </w:p>
+        </w:tc>
+        <w:tc>
+          <w:tcPr>
+            <w:tcW w:type="dxa" w:w="5112"/>
+          </w:tcPr>
+          <w:p>
+            <w:r>
+              <w:t>Relativo a su tipo: Adjust = Fit Poor y tipo con evidencia Robusta; Review = Fit Poor o Low; Maintain en otro caso. Un umbral absoluto marcaba al 52% de la liga, porque todas las rectas pierden ~4.8 en altitud.</w:t>
+            </w:r>
+          </w:p>
+        </w:tc>
+      </w:tr>
+      <w:tr>
+        <w:tc>
+          <w:tcPr>
+            <w:tcW w:type="dxa" w:w="5112"/>
+          </w:tcPr>
+          <w:p>
+            <w:r>
+              <w:t>Alerta del pitcher</w:t>
+            </w:r>
+          </w:p>
+        </w:tc>
+        <w:tc>
+          <w:tcPr>
+            <w:tcW w:type="dxa" w:w="5112"/>
+          </w:tcPr>
+          <w:p>
+            <w:r>
+              <w:t>Needs attention si un pitch con uso &gt;= 15% esta en Adjust; Review si un pitch central (uso &gt;= 30%) esta en Review. 2026 (&gt;= 100 pitches): 25% / 29% / 46%.</w:t>
+            </w:r>
+          </w:p>
+        </w:tc>
+      </w:tr>
+      <w:tr>
+        <w:tc>
+          <w:tcPr>
+            <w:tcW w:type="dxa" w:w="5112"/>
+          </w:tcPr>
+          <w:p>
+            <w:r>
+              <w:t>Confianza</w:t>
+            </w:r>
+          </w:p>
+        </w:tc>
+        <w:tc>
+          <w:tcPr>
+            <w:tcW w:type="dxa" w:w="5112"/>
+          </w:tcPr>
+          <w:p>
+            <w:r>
+              <w:t>Por tipo: niveles de la guia 36. Por pitcher: Robust si &gt;= 60% de pitches en tipos robustos y &gt;= 300 pitches; Uncertain si &lt; 150 pitches o &gt;= 40% en tipos inciertos.</w:t>
+            </w:r>
+          </w:p>
+        </w:tc>
+      </w:tr>
+      <w:tr>
+        <w:tc>
+          <w:tcPr>
+            <w:tcW w:type="dxa" w:w="5112"/>
+          </w:tcPr>
+          <w:p>
+            <w:r>
+              <w:t>Inbox</w:t>
+            </w:r>
+          </w:p>
+        </w:tc>
+        <w:tc>
+          <w:tcPr>
+            <w:tcW w:type="dxa" w:w="5112"/>
+          </w:tcPr>
+          <w:p>
+            <w:r>
+              <w:t>Alertas (pitch mas afectado) y oportunidades (Stuff+ &gt;= 105 que pierde &lt; 1.5). Nunca prescribe porcentajes de uso.</w:t>
+            </w:r>
+          </w:p>
+        </w:tc>
+      </w:tr>
+      <w:tr>
+        <w:tc>
+          <w:tcPr>
+            <w:tcW w:type="dxa" w:w="5112"/>
+          </w:tcPr>
+          <w:p>
+            <w:r>
+              <w:t>Development Targets</w:t>
+            </w:r>
+          </w:p>
+        </w:tc>
+        <w:tc>
+          <w:tcPr>
+            <w:tcW w:type="dxa" w:w="5112"/>
+          </w:tcPr>
+          <w:p>
+            <w:r>
+              <w:t>Zonas P25-P75 del perfil de 22. Explore solo si el valor esta del lado desfavorable de la zona; Maintain si esta dentro o mas alla en la direccion favorable. Exploratorios.</w:t>
+            </w:r>
+          </w:p>
+        </w:tc>
+      </w:tr>
+      <w:tr>
+        <w:tc>
+          <w:tcPr>
+            <w:tcW w:type="dxa" w:w="5112"/>
+          </w:tcPr>
+          <w:p>
+            <w:r>
+              <w:t>Outcomes de adaptacion</w:t>
+            </w:r>
+          </w:p>
+        </w:tc>
+        <w:tc>
+          <w:tcPr>
+            <w:tcW w:type="dxa" w:w="5112"/>
+          </w:tcPr>
+          <w:p>
+            <w:r>
+              <w:t>Whiff y chase modelados con los componentes fisicos del Stuff+ a nivel del mar vs Harp Helu.</w:t>
+            </w:r>
+          </w:p>
+        </w:tc>
+      </w:tr>
+    </w:tbl>
+    <w:p>
+      <w:pPr>
+        <w:pStyle w:val="Heading2"/>
+      </w:pPr>
+      <w:r>
+        <w:t>37.3 Diferencias deliberadas con los wireframes</w:t>
+      </w:r>
+    </w:p>
+    <w:p>
+      <w:pPr/>
+      <w:r>
+        <w:t>Se reemplazaron por datos reales los valores demo que contradicen la evidencia vigente (Sinker 'favorable', Slider 'Robust', neto que 'depende de la ponderacion whiff vs groundball', que era la lectura V1 invalidada en la guia 32-36). Se quitaron las recomendaciones de uso o ubicacion que el modelo no sostiene causalmente ('mas sinker vs RHH', 'menos four-seam arriba de la zona') y el target 'release consistency' (sin modelo que lo ligue a resultados). Se agregaron Pitching+ y el delta observado como lectura secundaria.</w:t>
+      </w:r>
+    </w:p>
+    <w:p>
+      <w:pPr>
+        <w:pStyle w:val="Heading2"/>
+      </w:pPr>
+      <w:r>
+        <w:t>37.4 Fases siguientes</w:t>
+      </w:r>
+    </w:p>
+    <w:p>
+      <w:pPr/>
+      <w:r>
+        <w:t>Fase 2: Simulator (Altitude + What-if fisico con simulate_pitch, experimentos guardados). Fase 3: Scouting (perfil ideal, comparador, shortlist, proyeccion). Fase 4: Game (heatmaps de Location+ por count y lado) y pruebas de uso. Ejecucion: python 23_dashboard_data.py y streamlit run dashboard/app.py, desde la raiz del repo.</w:t>
+      </w:r>
+    </w:p>
+    <w:p>
+      <w:pPr>
+        <w:pStyle w:val="Heading2"/>
+      </w:pPr>
+      <w:r>
+        <w:t>37.5 Fase 2: Simulator (30/09/2026)</w:t>
+      </w:r>
+    </w:p>
+    <w:p>
+      <w:pPr/>
+      <w:r>
+        <w:t>Motor dashboard/lib/engine.py: carga el bundle de 18 una vez y califica Stuff+, Location+ y Pitching+ con sus componentes, trabajando directamente en convencion de diestro (como el frame del bundle, sin doble espejo). Verificacion: reproduce los scores oficiales de 18 para pitches reales (diferencia maxima 1.4e-14 en las tres familias) y, reconstruyendo un pitch real desde su fisica, su arsenal y su contexto, da exactamente el mismo Stuff+ y Pitching+.</w:t>
+      </w:r>
+    </w:p>
+    <w:p>
+      <w:pPr/>
+      <w:r>
+        <w:t>Decision de diseño: el what-if de un pitcher NO califica un 'pitch promedio'. Desplaza todos sus pitches reales del tipo (cada uno llevado a nivel del mar desde el entorno donde se lanzo) y promedia los scores. Calificar el pitch promedio daba otro numero (Four-Seam de 00776: 100 contra 107), porque el modelo no es lineal; el enfoque poblacional reproduce exactamente la proyeccion de 22 y la pantalla Player (107.02 -&gt; 100.23) con cambio cero. Los prospectos (modo manual) se simulan con la dispersion real de la liga para ese tipo y mano, recentrada en las metricas ingresadas, con la variante sin arsenal (la que recibe un pitcher nuevo).</w:t>
+      </w:r>
+    </w:p>
+    <w:p>
+      <w:pPr/>
+      <w:r>
+        <w:t>Pestañas: (1) What-if y altitud: velocidad, IVB y HB a nivel del mar, spin, eje, extension y altura de release; Stuff+, IVB, HB, whiff y chase a nivel del mar, en Medium y en Harp Helu, actuales contra escenario; aviso de extrapolacion fuera del P1-P99 del tipo. (2) Ubicacion: heatmap de Location+ por count y lado del bateador, y Pitching+ del pitch del escenario en esa ubicacion por entorno. Aviso explicito: Location+ y Pitching+ no penalizan el daño por contacto (guia 34), por lo que con pocos strikes el centro de la zona sale alto. (3) Experimentos guardados (dashboard/state/experiments.json). Ejemplo: +2 in de IVB en el Four-Seam de 00776 sube su Stuff+ en Harp Helu de 100.2 a 103.5 y el whiff modelado de 10.0% a 11.6%. Todo what-if es exploratorio: cambia la fisica dentro del modelo y no garantiza que el pitcher pueda lograrla ni un efecto causal.</w:t>
+      </w:r>
+    </w:p>
+    <w:p>
+      <w:pPr>
+        <w:pStyle w:val="Heading2"/>
+      </w:pPr>
+      <w:r>
+        <w:t>37.6 Fase 3: Scouting (30/09/2026)</w:t>
+      </w:r>
+    </w:p>
+    <w:p>
+      <w:pPr/>
+      <w:r>
+        <w:t>Cinco pestañas siguiendo el journey del director deportivo (buscar, evaluar, comparar, explicar y priorizar). (1) Perfil ideal por tipo: zonas del perfil de 22 con dirección, entorno (compartido/especifico), resiliencia a la altitud, nivel de evidencia, validacion contra whiff y chase reales en Extreme y estabilidad año a año. (2) Explorar liga: candidatos ordenados por Stuff+ proyectado en Harp Helu, con filtros (rol, mano, muestra, pitches que debe lanzar) y señales exploratorias. La señal 'Stuff+ por encima de resultados' marca Stuff+ en el cuartil alto con valor realizado bajo la mediana (posible infravalorado); la inversa, riesgo de regresion. Corr. Stuff+ Harp vs valor/100 por pitcher (2026, &gt;= 300 pitches) = 0.25. (3) Evaluar prospecto: arsenal completo editable; cada pitch se simula con la dispersion real de la liga recentrada en sus metricas; Stuff+ y Fit del arsenal contra la liga; cuantos rasgos del perfil cumple; contexto de arsenal opcional. (4) Comparar: 2-4 candidatos (pitchers y prospectos), con su arsenal y su historial. (5) Shortlist persistida con prioridad A/B/C y notas.</w:t>
+      </w:r>
+    </w:p>
+    <w:p>
+      <w:pPr/>
+      <w:r>
+        <w:t>HALLAZGO (30/09/2026): la variante del modelo cambia mucho el delta de altitud de slider y changeup. Sobre las mismas muestras de pitches con historial, transformadas a Harp Helu: Four-Seam -4.30 con arsenal / -5.44 sin arsenal; Sinker -2.78 / -2.82; Curveball -1.13 / -1.18; Slider -2.32 / -0.22; Changeup -2.87 / -0.76. Con arsenal, el modelo tambien penaliza que la separacion del pitch contra la recta (ivb_diff_vs_fb, hb_diff_vs_fb) se encoja al escalar el movimiento. La variante de fisica pura coincide con el Stuff+ observado del mismo pitcher (Slider +0.28, Changeup -0.89; guia 36.3). Esto explica buena parte del nivel 'Condicional' de slider, changeup y curva: la perdida modelada en esos tipos depende de cuanto se valore la separacion contra la recta, y en la realidad no aparece. Consecuencia de producto: los prospectos (variante sin arsenal) se comparan contra una referencia de la liga calculada con la misma variante (engine.reference_base). Sin esa correccion, un slider promedio salia 'Strong Fit' en lugar de 'Low Fit'.</w:t>
+      </w:r>
+    </w:p>
+    <w:p>
+      <w:pPr>
+        <w:pStyle w:val="Heading2"/>
+      </w:pPr>
+      <w:r>
+        <w:t>37.7 Fase 4: Game (30/09/2026)</w:t>
+      </w:r>
+    </w:p>
+    <w:p>
+      <w:pPr/>
+      <w:r>
+        <w:t>Lectura tactica con poca carga cognitiva, como pide el diseño. Barra de contexto: pitcher (los del roster primero), lado del bateador, count, outs y entorno (Harp Helu o nivel del mar). Una tarjeta por pitch, ordenadas por uso y no por ranking, con Pitching+ en su mejor zona para ese contexto, whiff y strike cantado ahi, Stuff+ en el entorno y nivel de evidencia. Dos heatmaps del pitch elegido: calidad esperada (Pitching+) y costo esperado del contacto en este count (rama de contacto de la guia 34: -P(BIP) x E[valor | BIP], con el RE LMB del entorno). Una lectura en una linea y Why? solo si se pide. Nunca se afirma 'el mejor pitch': se muestran calidad esperada y contexto (sin politica causal de seleccion).</w:t>
+      </w:r>
+    </w:p>
+    <w:p>
+      <w:pPr/>
+      <w:r>
+        <w:t>Lectura del costo del contacto: se mide contra el valor del count. En counts neutros es casi 0 (en promedio un contacto vale lo que el count) y crece cuando el pitcher va adelante, porque el contacto le quita esa ventaja. Es ahi donde la altitud mas lo encarece. Ejemplo (Pitcher 00776, Four-Seam, 0-2 vs derecho): mayor calidad esperada arriba y al centro (whiff 16%); costo del contacto en la zona de 4.0 runs/100 en Harp Helu contra 2.4 a nivel del mar. Es la evidencia de H3 llevada a la decision de juego, sin forzarla dentro del score. Motor: engine.game_grid (rejilla 13 x 15, ~0.25 s por pitch y entorno); pitch representativo = media de sus pitches de 2026 a nivel del mar, llevada al entorno con la transformacion validada.</w:t>
+      </w:r>
+    </w:p>
+    <w:p>
+      <w:pPr/>
+      <w:r>
+        <w:t>Estado del dashboard: las cinco pantallas del diseño (Roster, Player, Simulator, Scouting, Game) estan integradas con datos reales y verificadas contra los scores oficiales. Siguiente: documento tecnico (6-10 paginas), preparacion del pitch y pruebas de uso.</w:t>
       </w:r>
     </w:p>
     <w:sectPr>

</xml_diff>

<commit_message>
Auditoria 2: titular de altitud fisico, Fit = calidad proyectada, alertas por exceso
- 21: variantes fisica (titular) y oficial (sensibilidad); niveles de evidencia por variante
- 22: nivel Harp = Stuff+ oficial a nivel del mar + delta fisico; textos de recomendacion
- 23: Fit = percentil del Stuff+ proyectado; alerta = pierde mas de lo esperado para su nivel y tipo
- Dashboard: motor hibrido (population_table, prospect), Simulator sin crash 2025, Roster/Player/Scouting con la nueva semantica
- Guia 38, bitacora 53-54, README

Co-Authored-By: Claude Opus 5.5 <noreply@anthropic.com>
</commit_message>
<xml_diff>
--- a/ISAC_Diablos_Rojos_Guia_Base_Modelado.docx
+++ b/ISAC_Diablos_Rojos_Guia_Base_Modelado.docx
@@ -23612,6 +23612,12 @@
       </w:r>
     </w:p>
     <w:p>
+      <w:pPr/>
+      <w:r>
+        <w:t>ACTUALIZACION (auditoria 2, 30/09/2026): las cifras de delta por tipo de esta seccion son de la variante oficial (con arsenal). El titular paso a la variante fisica; ver seccion 38.</w:t>
+      </w:r>
+    </w:p>
+    <w:p>
       <w:pPr>
         <w:pStyle w:val="Heading1"/>
       </w:pPr>
@@ -23954,6 +23960,112 @@
       <w:pPr/>
       <w:r>
         <w:t>Estado del dashboard: las cinco pantallas del diseño (Roster, Player, Simulator, Scouting, Game) estan integradas con datos reales y verificadas contra los scores oficiales. Siguiente: documento tecnico (6-10 paginas), preparacion del pitch y pruebas de uso.</w:t>
+      </w:r>
+    </w:p>
+    <w:p>
+      <w:pPr>
+        <w:pStyle w:val="Heading1"/>
+      </w:pPr>
+      <w:r>
+        <w:t>38. Auditoria 2: Fit, alertas y titular de altitud</w:t>
+      </w:r>
+    </w:p>
+    <w:p>
+      <w:pPr/>
+      <w:r>
+        <w:t>Estado: CERRADO (30/09/2026). La segunda auditoria encontro dos problemas de definicion y un bug. Se corrigieron antes del documento tecnico, sin cambiar features, targets ni arquitectura.</w:t>
+      </w:r>
+    </w:p>
+    <w:p>
+      <w:pPr>
+        <w:pStyle w:val="Heading2"/>
+      </w:pPr>
+      <w:r>
+        <w:t>38.1 Titular de altitud = variante fisica</w:t>
+      </w:r>
+    </w:p>
+    <w:p>
+      <w:pPr/>
+      <w:r>
+        <w:t>Problema: el Stuff+ oficial de 18 usa contexto de arsenal cuando hay historial. Al llevar un pitch a Extreme tambien se encoge su separacion contra la recta, y el modelo la castiga. Eso predecia perdidas de 1.2-2.3 en slider, changeup y curva que el Stuff+ observado del mismo pitcher no mostraba, y por eso quedaban 'Condicionales'.</w:t>
+      </w:r>
+    </w:p>
+    <w:p>
+      <w:pPr/>
+      <w:r>
+        <w:t>Decision: el titular es la variante fisica (modelo sin contexto de arsenal para todos los pitches; mide solo el efecto del aire sobre el shape propio). La variante oficial se reporta como sensibilidad. 21 corre ambas (columna `variante`): 21_evidence_levels.csv es la fisica y 21_evidence_levels_oficial.csv la oficial. La identidad contra 18 se sigue verificando en la oficial.</w:t>
+      </w:r>
+    </w:p>
+    <w:p>
+      <w:pPr/>
+      <w:r>
+        <w:t>Resultado 2026 (fisica vs observado mismo pitcher): Four-Seam -5.43 vs -5.41; Sinker -2.87 vs -2.47; Curveball -1.25 vs -1.06; Changeup -0.60 vs -0.91; Slider -0.16 vs +0.27; Cutter +0.33 y Splitter +0.66 sin contraste observado suficiente. Evidencia: Robusto FF y SI; Condicional CU y CH; Incierto SL, FC y FS. H2: speed-diff -0.53 vs Magnus -2.83, diferencia +2.30 [1.99, 2.72].</w:t>
+      </w:r>
+    </w:p>
+    <w:p>
+      <w:pPr/>
+      <w:r>
+        <w:t>Nivel proyectado (22, 23 y motor del dashboard): Stuff+ en Harp Helu = Stuff+ oficial a nivel del mar + delta fisico. 2026: 369 pitchers, delta medio -2.60, correlacion de rangos mar vs Harp 0.941. En 22 la regla 'efecto practicamente nulo, no descontarlo' exige &gt;= 30 celdas y |delta| &lt; 0.7 en ambas ventanas; si no, 'no concluir'. Cuando |delta oficial - delta fisico| &gt;= 0.7 se agrega la frase de sensibilidad.</w:t>
+      </w:r>
+    </w:p>
+    <w:p>
+      <w:pPr>
+        <w:pStyle w:val="Heading2"/>
+      </w:pPr>
+      <w:r>
+        <w:t>38.2 Harp Helu Fit = calidad proyectada</w:t>
+      </w:r>
+    </w:p>
+    <w:p>
+      <w:pPr/>
+      <w:r>
+        <w:t>Problema: el Fit era el percentil del delta (cuanto pierde). Los pitchers con mas Stuff+ pierden mas puntos en terminos absolutos (Spearman delta vs Stuff+ a nivel del mar = -0.43 en 2026), asi que el Fit premiaba a pitchers mediocres y las alertas caian sobre los mejores.</w:t>
+      </w:r>
+    </w:p>
+    <w:p>
+      <w:pPr/>
+      <w:r>
+        <w:t>Decision: Harp Helu Fit = percentil del Stuff+ proyectado en Harp Helu (por tipo para pitches; entre pitchers con &gt;= 100 pitches a nivel pitcher). Stuff+ medio a nivel del mar por banda (2026): Strong 106.9, Moderate 102.8, Low 99.8, Poor 96.3. La sensibilidad a la altitud se muestra aparte (delta y su percentil).</w:t>
+      </w:r>
+    </w:p>
+    <w:p>
+      <w:pPr>
+        <w:pStyle w:val="Heading2"/>
+      </w:pPr>
+      <w:r>
+        <w:t>38.3 Alertas = pierde mas de lo esperado</w:t>
+      </w:r>
+    </w:p>
+    <w:p>
+      <w:pPr/>
+      <w:r>
+        <w:t>Regla: dentro de cada tipo de pitch se ajusta delta ~ Stuff+ a nivel del mar (pendiente 2026: FF -0.25, SI -0.21, FC -0.11, SL -0.09, CU -0.06, CH -0.04). El residuo ('exceso') es cuanto pierde de mas o de menos frente a lo esperado para un pitch de su nivel y tipo. Accion por pitch: Adjust si el exceso esta en el p10 inferior con evidencia Robusta; Review si esta en el p25 inferior; si no, Maintain. Alerta del pitcher: roja si un pitch con uso &gt;= 15% es Adjust; amarilla si un pitch con uso &gt;= 30% no es Maintain.</w:t>
+      </w:r>
+    </w:p>
+    <w:p>
+      <w:pPr/>
+      <w:r>
+        <w:t>Resultado 2026 (pitchers con &gt;= 100 pitches, n = 371): 39 rojas, 65 amarillas, 267 verdes. Stuff+ medio a nivel del mar por alerta: roja 100.9, amarilla 102.2, verde 101.4. Spearman percentil de exceso vs Stuff+ = 0.03: la alerta ya no depende del nivel. El eje vertical del mapa del Roster es ese percentil.</w:t>
+      </w:r>
+    </w:p>
+    <w:p>
+      <w:pPr>
+        <w:pStyle w:val="Heading2"/>
+      </w:pPr>
+      <w:r>
+        <w:t>38.4 Dashboard y correcciones</w:t>
+      </w:r>
+    </w:p>
+    <w:p>
+      <w:pPr/>
+      <w:r>
+        <w:t>Simulator: nivel oficial + efecto fisico (population_table con hybrid=True reproduce 22 exactamente); muestra la sensibilidad con arsenal en la lectura. Bug corregido: fallaba con pitchers que solo tienen datos de 2025 (ahora usa 2026 y avisa). Scouting: prospectos con el mismo esquema hibrido (Engine.prospect, hybrid=True); Fit = percentil del Stuff+ proyectado contra la liga evaluada con la misma variante; tarjeta de perfil con delta fisico y con arsenal. Roster y Player: Fit con 'mar -&gt; Harp', delta fisico, 'mas o menos de lo esperado' y sensibilidad con arsenal cuando difiere &gt;= 0.7. Inbox: el movimiento citado es el componente que mas cambia (IVB en rectas, HB en cambios), observado si hay &gt;= 20 pitches por entorno y si no proyectado. Game no cambia: no muestra delta ni Fit. Dependencias fijadas en requirements.txt.</w:t>
+      </w:r>
+    </w:p>
+    <w:p>
+      <w:pPr/>
+      <w:r>
+        <w:t>Limites que van al documento tecnico: estados base-out (no hay corredores), tunneling, SHAP no disponible (se usan ablaciones), proxy de parque (Extreme agrupa parques heterogeneos), deriva de calibracion entre temporadas.</w:t>
       </w:r>
     </w:p>
     <w:sectPr>

</xml_diff>

<commit_message>
Tasa de roletazos solo con bolas en juego y cierre de pendientes de la bitacora
- 23: gb_rate filtra is_ball_in_play == 1 (correccion de Dani). Antes contaba 74,638 filas que no son bolas en juego (72,818 fouls); ahora coincide con la definicion de la guia 22 (liga 45.84%, 107,118 BIP).
- Sinker >= 30% del arsenal: 51.9% vs 46.2% (2025) y 51.2% vs 46.4% (2026); antes 41% vs 35-36%. La brecha casi no cambia; por cuartil de rectas la tasa queda plana.
- 24 y Scouting > Arsenal ideal: definicion documentada en docstring y en pantalla. Pendientes del valor realizado y Spearman de composiciones sin cambio.
- README (A7), guia 42.5 corregida y nueva 42.10 (incluye la cifra corregida del What-if del 00776: 102.3 en Harp Helu, no 100.7).
- Bitacora: fila 71; filas 14, 15, 16, 21, 28 y 49 y roadmap 6 y 10 cerradas con nota de donde quedaron; rangos de las tablas de Excel al dia.
</commit_message>
<xml_diff>
--- a/ISAC_Diablos_Rojos_Guia_Base_Modelado.docx
+++ b/ISAC_Diablos_Rojos_Guia_Base_Modelado.docx
@@ -24403,7 +24403,7 @@
     <w:p>
       <w:pPr/>
       <w:r>
-        <w:t>La pendiente de 'dependencia de la recta' en Stuff+ es casi aritmetica (las rectas pierden mas en altitud y el resto casi nada) y el Stuff+ pondera chase 0.68 y whiff 0.31, casi nada el roletazo. Se contrasto con resultados reales (24_arsenal_contraste): pendiente del valor realizado por 100 pitches lanzados en Extreme sobre el % de rectas, ponderada por esos pitches: 0.00 [-0.17, 0.15] en 2025 (233 pitchers con &gt;= 100 pitches en Extreme) y -0.15 [-0.43, 0.12] en 2026 (130). En resultados reales no se detecta el costo de las rectas. Tasa de roletazos: pitchers con sinker &gt;= 30% del arsenal 41% [39, 43] contra 35-36% del resto en ambas temporadas.</w:t>
+        <w:t>La pendiente de 'dependencia de la recta' en Stuff+ es casi aritmetica (las rectas pierden mas en altitud y el resto casi nada) y el Stuff+ pondera chase 0.68 y whiff 0.31, casi nada el roletazo. Se contrasto con resultados reales (24_arsenal_contraste): pendiente del valor realizado por 100 pitches lanzados en Extreme sobre el % de rectas, ponderada por esos pitches: 0.00 [-0.17, 0.15] en 2025 (233 pitchers con &gt;= 100 pitches en Extreme) y -0.15 [-0.43, 0.12] en 2026 (130). En resultados reales no se detecta el costo de las rectas. Tasa de roletazos (roletazos entre bolas en juego sin toques, promedio por pitcher, definicion de la seccion 22): pitchers con sinker &gt;= 30% del arsenal 51.9% [50.2, 53.6] en 2025 (112 pitchers) y 51.2% [49.2, 53.1] en 2026 (98), contra 46.2% [45.3, 47.1] (363) y 46.4% [45.3, 47.5] (271) del resto. La brecha es de +5.7 y +4.8 pp, con IC que no se traslapan; la liga completa da 45.8% en bolas en juego (seccion 22, tres temporadas juntas; 47.7% en 2025 y 48.0% en 2026). Correccion (14/10/2026): la version anterior (41% [39, 43] contra 35-36%) contaba tambien los fouls, que traen hit_type pero no son bolas en juego (74,638 filas); la brecha casi no cambia (+5.6 y +5.0 pp), pero por cuartil de % de rectas la tasa deja de bajar y queda plana (2025: 46.7%, 47.7%, 47.2%, 48.6%; 2026: 48.3%, 47.9%, 46.3%, 48.2%).</w:t>
       </w:r>
     </w:p>
     <w:p>
@@ -24490,6 +24490,20 @@
       <w:pPr/>
       <w:r>
         <w:t>Al calcular las cifras del video, subir 2 in de IVB al Four-Seam del 00964 subia el Stuff+ a nivel del mar (92.9 -&gt; 94.5) pero dejaba Medium y Harp Helu exactamente igual. Causa: con cambios what-if, el esquema hibrido sumaba el cambio del modelo oficial a nivel del mar y restaba el de la variante fisica, cuya sensibilidad al IVB es otra (+4.0 contra +1.6 a nivel del mar); las dos se cancelaban. Correccion: el pitch actual se proyecta como antes (nivel oficial + efecto fisico) y el EFECTO DEL CAMBIO se mide con la variante oficial en cada entorno. A nivel del mar el escenario es exactamente el Stuff+ oficial. 00964 Four-Seam: +2 in de IVB = +1.6 a nivel del mar y +1.1 en Harp Helu; +1 mph = +4.1 y +3.7. Se aplico igual al Pitching+ de Simulator &gt; Ubicacion. Se probo y se descarto no mover la diferencia contra la recta cuando el pitch es la propia recta: la recta de referencia es historica (temporadas anteriores), asi que un cambio en la recta actual si cambia esa diferencia. La proyeccion sin cambios (22, Player, Roster) no cambia; el motor sigue en 1.4e-14.</w:t>
+      </w:r>
+    </w:p>
+    <w:p>
+      <w:pPr>
+        <w:pStyle w:val="Heading2"/>
+      </w:pPr>
+      <w:r>
+        <w:t>42.10 Tasa de roletazos solo con bolas en juego</w:t>
+      </w:r>
+    </w:p>
+    <w:p>
+      <w:pPr/>
+      <w:r>
+        <w:t>23 calculaba la tasa de roletazos por pitcher (gb_rate, usada en Scouting &gt; Arsenal ideal y en 24_arsenal_contraste) sobre todas las filas con hit_type conocido, que incluyen 74,638 que no son bolas en juego (72,818 fouls). Ahora filtra is_ball_in_play == 1 con hit_type GroundBall, FlyBall, LineDrive o Popup, que es la definicion del target de la seccion 22 (107,118 bolas en juego, 45.84% de roletazos, igual al decimal). Los bunts ya quedaban fuera por el filtro de hit_type. Las demas tasas de roletazos del proyecto (05, 07, 13, 17) ya usaban bolas en juego. Cambian solo 24_arsenal_contraste (filas de roletazos) y la columna gb_rate de 24_arsenal_rectas; las pendientes del valor realizado (0.00 y -0.15) y el Spearman de composiciones (0.59) no cambian. Cifras en 42.5. Tambien se corrige una cifra que circulo en la descripcion del PR 6: con la correccion del What-if (42.9), el Four-Seam del 00776 con +2 in de IVB pasa de 107.0 a 110.5 a nivel del mar y de 99.0 a 102.3 en Harp Helu (no 100.7).</w:t>
       </w:r>
     </w:p>
     <w:sectPr>

</xml_diff>

<commit_message>
Video del entregable 4: grabacion automatizada con narracion y subtitulos
Graba el recorrido del dashboard con Playwright segun el guion corto (20 segmentos en
video/narracion.json), parte la narracion de ElevenLabs por pausas (video/partir_voz.py),
recorta los huecos de recalculo y quema subtitulos. Resultado: 4:12 a 1080p.
README, guia (seccion 43) y bitacora actualizados.

Co-Authored-By: Claude Opus 5.5 <noreply@anthropic.com>
</commit_message>
<xml_diff>
--- a/ISAC_Diablos_Rojos_Guia_Base_Modelado.docx
+++ b/ISAC_Diablos_Rojos_Guia_Base_Modelado.docx
@@ -24504,6 +24504,34 @@
       <w:pPr/>
       <w:r>
         <w:t>23 calculaba la tasa de roletazos por pitcher (gb_rate, usada en Scouting &gt; Arsenal ideal y en 24_arsenal_contraste) sobre todas las filas con hit_type conocido, que incluyen 74,638 que no son bolas en juego (72,818 fouls). Ahora filtra is_ball_in_play == 1 con hit_type GroundBall, FlyBall, LineDrive o Popup, que es la definicion del target de la seccion 22 (107,118 bolas en juego, 45.84% de roletazos, igual al decimal). Los bunts ya quedaban fuera por el filtro de hit_type. Las demas tasas de roletazos del proyecto (05, 07, 13, 17) ya usaban bolas en juego. Cambian solo 24_arsenal_contraste (filas de roletazos) y la columna gb_rate de 24_arsenal_rectas; las pendientes del valor realizado (0.00 y -0.15) y el Spearman de composiciones (0.59) no cambian. Cifras en 42.5. Tambien se corrige una cifra que circulo en la descripcion del PR 6: con la correccion del What-if (42.9), el Four-Seam del 00776 con +2 in de IVB pasa de 107.0 a 110.5 a nivel del mar y de 99.0 a 102.3 en Harp Helu (no 100.7).</w:t>
+      </w:r>
+    </w:p>
+    <w:p>
+      <w:pPr>
+        <w:pStyle w:val="Heading1"/>
+      </w:pPr>
+      <w:r>
+        <w:t>43. Video del entregable 4 (grabacion automatizada)</w:t>
+      </w:r>
+    </w:p>
+    <w:p>
+      <w:r>
+        <w:t>El video se graba recorriendo el dashboard con Playwright (video/grabar_video.py) siguiendo el guion corto (propuestas/Guion_propuesta.md), partido en 20 segmentos en video/narracion.json. Cada segmento define las acciones previas (clics, sliders, desplazamientos), el texto narrado y los resaltados que se muestran mientras se escucha. El grabador espera a que termine cada audio antes de la siguiente accion, asi que el video se ajusta al ritmo de la voz.</w:t>
+      </w:r>
+    </w:p>
+    <w:p>
+      <w:r>
+        <w:t>Voz: la narracion final se genero en ElevenLabs como un solo archivo. video/partir_voz.py la parte en los 20 segmentos eligiendo, entre las pausas del audio, los cortes que hacen cada segmento proporcional a una referencia (la misma frase leida con la voz del sistema); en la toma final los cocientes quedaron entre 0.91 y 1.10. Las pausas internas se acortan a 0.45 s.</w:t>
+      </w:r>
+    </w:p>
+    <w:p>
+      <w:r>
+        <w:t>Montaje: los huecos sin voz de mas de 3.2 s (el dashboard recalculando, sobre todo en el Simulator) se recortan conservando el inicio de la accion y el resultado ya cargado. Los subtitulos usan el texto con ortografia normal, se queman en el video y se exportan tambien como .srt. Resultado: 4:12 a 1080p.</w:t>
+      </w:r>
+    </w:p>
+    <w:p>
+      <w:r>
+        <w:t>Cifras: antes de grabar se corrio propuestas/verificar_cifras_guion.py en la Mac de grabacion; todas coinciden con el guion (102.2/99.5; 7.2 y 3.3; 93 a 86; 92.9/87.4/85.6; +1 mph a 89.3; 109.5/101.4; 15.2 contra 4.1 y 96.5 contra 91.3; 4.2 contra 2.1).</w:t>
       </w:r>
     </w:p>
     <w:sectPr>

</xml_diff>

<commit_message>
Version ligera del dashboard para el jurado y documento tecnico v2
- 25_dashboard_lite.py arma un paquete de 15 MB (modelos de 2026, muestra de hasta 50
  lanzamientos por pitcher y tipo, promedios y referencias exactas) y lo compara contra
  la version completa (25_dashboard_lite_check.csv).
- engine.py usa el paquete ligero cuando no existe el bundle completo de 18; el
  Simulator toma su punto de partida de los promedios exactos.
- La muestra no se sube a este repo: la app se hostea desde un repo privado aparte.
- Documento tecnico: nota de la version en linea (7.4) y seccion 9, Con mas tiempo.
- README, HISTORIAL y guia (seccion 44) actualizados.

Co-Authored-By: Claude Opus 5.5 <noreply@anthropic.com>
</commit_message>
<xml_diff>
--- a/ISAC_Diablos_Rojos_Guia_Base_Modelado.docx
+++ b/ISAC_Diablos_Rojos_Guia_Base_Modelado.docx
@@ -24532,6 +24532,38 @@
     <w:p>
       <w:r>
         <w:t>Cifras: antes de grabar se corrio propuestas/verificar_cifras_guion.py en la Mac de grabacion; todas coinciden con el guion (102.2/99.5; 7.2 y 3.3; 93 a 86; 92.9/87.4/85.6; +1 mph a 89.3; 109.5/101.4; 15.2 contra 4.1 y 96.5 contra 91.3; 4.2 contra 2.1).</w:t>
+      </w:r>
+    </w:p>
+    <w:p>
+      <w:pPr>
+        <w:pStyle w:val="Heading1"/>
+      </w:pPr>
+      <w:r>
+        <w:t>44. Version ligera del dashboard para el jurado (25_dashboard_lite.py)</w:t>
+      </w:r>
+    </w:p>
+    <w:p>
+      <w:pPr/>
+      <w:r>
+        <w:t>Motivo: el formulario de entrega aclara que el jurado no ejecuta codigo; solo ve paginas web, videos y tableros. El dashboard tiene que estar hosteado. El bundle de 18 pesa ~400 MB porque guarda todos los lanzamientos (132,243 de la ventana 2026 con 114 columnas, mas la ventana 2024 -&gt; 2025 que el dashboard no usa); los modelos de 2026 son solo 39 MB. Subir el bundle completo publicaria los datos crudos.</w:t>
+      </w:r>
+    </w:p>
+    <w:p>
+      <w:pPr/>
+      <w:r>
+        <w:t>Que hace 25: arma dashboard/lite/engine_lite.pkl (15 MB) con los modelos de 2026 (solo los componentes que el dashboard evalua; ContactValueModel se guarda como sus dos modelos para no depender de 16), una muestra de hasta 50 lanzamientos por pitcher y tipo (1,439 combinaciones seleccionables, 62,446 filas), 500 lanzamientos de la liga por tipo y mano (6,553 filas), las 27 columnas que usa el modelo (sin resultados, PitchUID ni IDs de juego, bateador o catcher), y con TODOS los datos: el punto de partida de cada pitcher (medias a nivel del mar), su tabla de Stuff+ por entorno, el promedio del modo Pitch manual, la referencia de la liga sin arsenal (reference_base) y los rangos observados. engine.py usa el paquete ligero automaticamente cuando no existe el bundle completo; con el bundle se comporta igual que antes (verify 1.4e-14).</w:t>
+      </w:r>
+    </w:p>
+    <w:p>
+      <w:pPr/>
+      <w:r>
+        <w:t>Resultado contra la version completa (25_dashboard_lite_check.csv): scores oficiales reproducidos (1.4e-14); punto de partida del Simulator exacto; escenarios del Simulator +1 mph y +1 in de IVB: 0.11 puntos de Stuff+ en promedio, maximo 0.74 (40 pitchers); prospectos de Scouting 0.22, maximo 0.40 (5 tipos); rejilla de Game 0.02 puntos de Pitching+ en promedio (10 pitchers). Con la muestra de 150 que ya usaba Game el paquete hubiera guardado 82% de los lanzamientos, por eso se bajo a 50. Las cinco pantallas corren sin errores en modo ligero (Streamlit AppTest).</w:t>
+      </w:r>
+    </w:p>
+    <w:p>
+      <w:pPr/>
+      <w:r>
+        <w:t>Decision del equipo (22/10/2026): la muestra sigue siendo de lanzamientos reales (anonimos, sin resultados), asi que no va en el repositorio publico de trabajo. La app se hostea en Streamlit Community Cloud desde un repositorio privado aparte que solo contiene dashboard/, sus tablas agregadas y el paquete ligero; el repositorio publico conserva el codigo (incluido 25) para la revision de integridad. El documento tecnico (seccion 7.4 y nueva seccion 9, Con mas tiempo) describe la version en linea.</w:t>
       </w:r>
     </w:p>
     <w:sectPr>

</xml_diff>